<commit_message>
Artigo: orientador e espaços para os gráficos do questionário
Co-Authored-By: Claude Opus 5.5 (1M context) <noreply@anthropic.com>
Claude-Session: https://claude.ai/code/session_013Ez8WdXVGnAz1jp93VScRd
</commit_message>
<xml_diff>
--- a/docs/artigo/artigo-TCC-provisa.docx
+++ b/docs/artigo/artigo-TCC-provisa.docx
@@ -50,7 +50,7 @@
           <w:b w:val="0"/>
           <w:i w:val="0"/>
         </w:rPr>
-        <w:t>Tiago Antonio de Araujo</w:t>
+        <w:t>Állan Stieg</w:t>
       </w:r>
       <w:r>
         <w:rPr>
@@ -5187,7 +5187,80 @@
           <w:i w:val="0"/>
           <w:highlight w:val="yellow"/>
         </w:rPr>
-        <w:t>Descrever os participantes: quantos responderam, funções (compradores, gestores, fornecedores), tempo de experiência e como fazem cotações hoje, com base no Bloco A do questionário.</w:t>
+        <w:t>Descrever os participantes: quantos responderam, funções (compradores, gestores, fornecedores), tempo de experiência e como fazem cotações hoje, com base no Bloco A do questionário. A Figura 6 apresenta o perfil.</w:t>
+      </w:r>
+    </w:p>
+    <w:tbl>
+      <w:tblPr>
+        <w:tblW w:type="auto" w:w="0"/>
+        <w:jc w:val="center"/>
+        <w:tblLayout w:type="fixed"/>
+        <w:tblLook w:firstColumn="1" w:firstRow="1" w:lastColumn="0" w:lastRow="0" w:noHBand="0" w:noVBand="1" w:val="04A0"/>
+        <w:tblLayout w:type="fixed"/>
+      </w:tblPr>
+      <w:tblGrid>
+        <w:gridCol w:w="8505"/>
+      </w:tblGrid>
+      <w:tr>
+        <w:trPr>
+          <w:cantSplit/>
+          <w:trHeight w:val="3969" w:hRule="exact"/>
+        </w:trPr>
+        <w:tc>
+          <w:tcPr>
+            <w:tcW w:type="dxa" w:w="8504"/>
+            <w:tcBorders>
+              <w:top w:val="dashed" w:sz="8" w:color="000000"/>
+              <w:left w:val="dashed" w:sz="8" w:color="000000"/>
+              <w:bottom w:val="dashed" w:sz="8" w:color="000000"/>
+              <w:right w:val="dashed" w:sz="8" w:color="000000"/>
+            </w:tcBorders>
+            <w:vAlign w:val="center"/>
+          </w:tcPr>
+          <w:p>
+            <w:pPr>
+              <w:keepNext/>
+              <w:jc w:val="center"/>
+            </w:pPr>
+            <w:r>
+              <w:rPr>
+                <w:color w:val="888888"/>
+                <w:sz w:val="20"/>
+                <w:highlight w:val="yellow"/>
+              </w:rPr>
+              <w:t>[Espaço para inserir o gráfico]</w:t>
+            </w:r>
+          </w:p>
+        </w:tc>
+      </w:tr>
+    </w:tbl>
+    <w:p>
+      <w:pPr>
+        <w:keepNext/>
+        <w:spacing w:line="240" w:lineRule="auto" w:before="80" w:after="0"/>
+        <w:jc w:val="center"/>
+      </w:pPr>
+      <w:r>
+        <w:rPr>
+          <w:b/>
+          <w:i w:val="0"/>
+          <w:sz w:val="20"/>
+        </w:rPr>
+        <w:t>Figura 6 – Perfil dos participantes (função e tempo de experiência)</w:t>
+      </w:r>
+    </w:p>
+    <w:p>
+      <w:pPr>
+        <w:spacing w:line="240" w:lineRule="auto" w:before="0" w:after="240"/>
+        <w:jc w:val="center"/>
+      </w:pPr>
+      <w:r>
+        <w:rPr>
+          <w:b w:val="0"/>
+          <w:i w:val="0"/>
+          <w:sz w:val="20"/>
+        </w:rPr>
+        <w:t>Fonte: Dados da pesquisa (2026).</w:t>
       </w:r>
     </w:p>
     <w:p>
@@ -5201,7 +5274,7 @@
           <w:b w:val="0"/>
           <w:i w:val="0"/>
         </w:rPr>
-        <w:t>A Tabela 3 apresenta os resultados por construto do TAM.</w:t>
+        <w:t>A Tabela 3 apresenta os resultados por construto do TAM, e a Figura 7 compara as médias de cada construto.</w:t>
       </w:r>
     </w:p>
     <w:p>
@@ -6065,6 +6138,79 @@
         <w:t>Fonte: Dados da pesquisa (2026). Escala de 1 a 5; concordância = respostas 4 e 5.</w:t>
       </w:r>
     </w:p>
+    <w:tbl>
+      <w:tblPr>
+        <w:tblW w:type="auto" w:w="0"/>
+        <w:jc w:val="center"/>
+        <w:tblLayout w:type="fixed"/>
+        <w:tblLook w:firstColumn="1" w:firstRow="1" w:lastColumn="0" w:lastRow="0" w:noHBand="0" w:noVBand="1" w:val="04A0"/>
+        <w:tblLayout w:type="fixed"/>
+      </w:tblPr>
+      <w:tblGrid>
+        <w:gridCol w:w="8505"/>
+      </w:tblGrid>
+      <w:tr>
+        <w:trPr>
+          <w:cantSplit/>
+          <w:trHeight w:val="3969" w:hRule="exact"/>
+        </w:trPr>
+        <w:tc>
+          <w:tcPr>
+            <w:tcW w:type="dxa" w:w="8504"/>
+            <w:tcBorders>
+              <w:top w:val="dashed" w:sz="8" w:color="000000"/>
+              <w:left w:val="dashed" w:sz="8" w:color="000000"/>
+              <w:bottom w:val="dashed" w:sz="8" w:color="000000"/>
+              <w:right w:val="dashed" w:sz="8" w:color="000000"/>
+            </w:tcBorders>
+            <w:vAlign w:val="center"/>
+          </w:tcPr>
+          <w:p>
+            <w:pPr>
+              <w:keepNext/>
+              <w:jc w:val="center"/>
+            </w:pPr>
+            <w:r>
+              <w:rPr>
+                <w:color w:val="888888"/>
+                <w:sz w:val="20"/>
+                <w:highlight w:val="yellow"/>
+              </w:rPr>
+              <w:t>[Espaço para inserir o gráfico]</w:t>
+            </w:r>
+          </w:p>
+        </w:tc>
+      </w:tr>
+    </w:tbl>
+    <w:p>
+      <w:pPr>
+        <w:keepNext/>
+        <w:spacing w:line="240" w:lineRule="auto" w:before="80" w:after="0"/>
+        <w:jc w:val="center"/>
+      </w:pPr>
+      <w:r>
+        <w:rPr>
+          <w:b/>
+          <w:i w:val="0"/>
+          <w:sz w:val="20"/>
+        </w:rPr>
+        <w:t>Figura 7 – Média das respostas por construto do TAM</w:t>
+      </w:r>
+    </w:p>
+    <w:p>
+      <w:pPr>
+        <w:spacing w:line="240" w:lineRule="auto" w:before="0" w:after="240"/>
+        <w:jc w:val="center"/>
+      </w:pPr>
+      <w:r>
+        <w:rPr>
+          <w:b w:val="0"/>
+          <w:i w:val="0"/>
+          <w:sz w:val="20"/>
+        </w:rPr>
+        <w:t>Fonte: Dados da pesquisa (2026).</w:t>
+      </w:r>
+    </w:p>
     <w:p>
       <w:pPr>
         <w:spacing w:line="360" w:lineRule="auto" w:before="0" w:after="0"/>
@@ -6077,7 +6223,212 @@
           <w:i w:val="0"/>
           <w:highlight w:val="yellow"/>
         </w:rPr>
-        <w:t>Comentar os itens com maior e menor média, a avaliação dos fornecedores sobre o portal e os principais temas das perguntas abertas.</w:t>
+        <w:t>Comentar a Figura 7: qual construto teve a maior média e se a utilidade percebida superou a facilidade de uso.</w:t>
+      </w:r>
+    </w:p>
+    <w:p>
+      <w:pPr>
+        <w:spacing w:line="360" w:lineRule="auto" w:before="0" w:after="0"/>
+        <w:ind w:firstLine="567"/>
+        <w:jc w:val="both"/>
+      </w:pPr>
+      <w:r>
+        <w:rPr>
+          <w:b w:val="0"/>
+          <w:i w:val="0"/>
+        </w:rPr>
+        <w:t>A Figura 8 mostra a distribuição das respostas em cada afirmação do questionário.</w:t>
+      </w:r>
+    </w:p>
+    <w:tbl>
+      <w:tblPr>
+        <w:tblW w:type="auto" w:w="0"/>
+        <w:jc w:val="center"/>
+        <w:tblLayout w:type="fixed"/>
+        <w:tblLook w:firstColumn="1" w:firstRow="1" w:lastColumn="0" w:lastRow="0" w:noHBand="0" w:noVBand="1" w:val="04A0"/>
+        <w:tblLayout w:type="fixed"/>
+      </w:tblPr>
+      <w:tblGrid>
+        <w:gridCol w:w="8505"/>
+      </w:tblGrid>
+      <w:tr>
+        <w:trPr>
+          <w:cantSplit/>
+          <w:trHeight w:val="5103" w:hRule="exact"/>
+        </w:trPr>
+        <w:tc>
+          <w:tcPr>
+            <w:tcW w:type="dxa" w:w="8504"/>
+            <w:tcBorders>
+              <w:top w:val="dashed" w:sz="8" w:color="000000"/>
+              <w:left w:val="dashed" w:sz="8" w:color="000000"/>
+              <w:bottom w:val="dashed" w:sz="8" w:color="000000"/>
+              <w:right w:val="dashed" w:sz="8" w:color="000000"/>
+            </w:tcBorders>
+            <w:vAlign w:val="center"/>
+          </w:tcPr>
+          <w:p>
+            <w:pPr>
+              <w:keepNext/>
+              <w:jc w:val="center"/>
+            </w:pPr>
+            <w:r>
+              <w:rPr>
+                <w:color w:val="888888"/>
+                <w:sz w:val="20"/>
+                <w:highlight w:val="yellow"/>
+              </w:rPr>
+              <w:t>[Espaço para inserir o gráfico]</w:t>
+            </w:r>
+          </w:p>
+        </w:tc>
+      </w:tr>
+    </w:tbl>
+    <w:p>
+      <w:pPr>
+        <w:keepNext/>
+        <w:spacing w:line="240" w:lineRule="auto" w:before="80" w:after="0"/>
+        <w:jc w:val="center"/>
+      </w:pPr>
+      <w:r>
+        <w:rPr>
+          <w:b/>
+          <w:i w:val="0"/>
+          <w:sz w:val="20"/>
+        </w:rPr>
+        <w:t>Figura 8 – Distribuição das respostas por afirmação (UP, FUP, AT e IU)</w:t>
+      </w:r>
+    </w:p>
+    <w:p>
+      <w:pPr>
+        <w:spacing w:line="240" w:lineRule="auto" w:before="0" w:after="240"/>
+        <w:jc w:val="center"/>
+      </w:pPr>
+      <w:r>
+        <w:rPr>
+          <w:b w:val="0"/>
+          <w:i w:val="0"/>
+          <w:sz w:val="20"/>
+        </w:rPr>
+        <w:t>Fonte: Dados da pesquisa (2026).</w:t>
+      </w:r>
+    </w:p>
+    <w:p>
+      <w:pPr>
+        <w:spacing w:line="360" w:lineRule="auto" w:before="0" w:after="0"/>
+        <w:ind w:firstLine="567"/>
+        <w:jc w:val="both"/>
+      </w:pPr>
+      <w:r>
+        <w:rPr>
+          <w:b w:val="0"/>
+          <w:i w:val="0"/>
+          <w:highlight w:val="yellow"/>
+        </w:rPr>
+        <w:t>Comentar as afirmações com maior e menor concordância e o que elas indicam sobre o sistema.</w:t>
+      </w:r>
+    </w:p>
+    <w:p>
+      <w:pPr>
+        <w:spacing w:line="360" w:lineRule="auto" w:before="0" w:after="0"/>
+        <w:ind w:firstLine="567"/>
+        <w:jc w:val="both"/>
+      </w:pPr>
+      <w:r>
+        <w:rPr>
+          <w:b w:val="0"/>
+          <w:i w:val="0"/>
+          <w:highlight w:val="yellow"/>
+        </w:rPr>
+        <w:t>Apresentar a avaliação dos fornecedores sobre o portal de resposta das cotações (Bloco E do questionário).</w:t>
+      </w:r>
+    </w:p>
+    <w:tbl>
+      <w:tblPr>
+        <w:tblW w:type="auto" w:w="0"/>
+        <w:jc w:val="center"/>
+        <w:tblLayout w:type="fixed"/>
+        <w:tblLook w:firstColumn="1" w:firstRow="1" w:lastColumn="0" w:lastRow="0" w:noHBand="0" w:noVBand="1" w:val="04A0"/>
+        <w:tblLayout w:type="fixed"/>
+      </w:tblPr>
+      <w:tblGrid>
+        <w:gridCol w:w="8505"/>
+      </w:tblGrid>
+      <w:tr>
+        <w:trPr>
+          <w:cantSplit/>
+          <w:trHeight w:val="3969" w:hRule="exact"/>
+        </w:trPr>
+        <w:tc>
+          <w:tcPr>
+            <w:tcW w:type="dxa" w:w="8504"/>
+            <w:tcBorders>
+              <w:top w:val="dashed" w:sz="8" w:color="000000"/>
+              <w:left w:val="dashed" w:sz="8" w:color="000000"/>
+              <w:bottom w:val="dashed" w:sz="8" w:color="000000"/>
+              <w:right w:val="dashed" w:sz="8" w:color="000000"/>
+            </w:tcBorders>
+            <w:vAlign w:val="center"/>
+          </w:tcPr>
+          <w:p>
+            <w:pPr>
+              <w:keepNext/>
+              <w:jc w:val="center"/>
+            </w:pPr>
+            <w:r>
+              <w:rPr>
+                <w:color w:val="888888"/>
+                <w:sz w:val="20"/>
+                <w:highlight w:val="yellow"/>
+              </w:rPr>
+              <w:t>[Espaço para inserir o gráfico]</w:t>
+            </w:r>
+          </w:p>
+        </w:tc>
+      </w:tr>
+    </w:tbl>
+    <w:p>
+      <w:pPr>
+        <w:keepNext/>
+        <w:spacing w:line="240" w:lineRule="auto" w:before="80" w:after="0"/>
+        <w:jc w:val="center"/>
+      </w:pPr>
+      <w:r>
+        <w:rPr>
+          <w:b/>
+          <w:i w:val="0"/>
+          <w:sz w:val="20"/>
+        </w:rPr>
+        <w:t>Figura 9 – Avaliação do portal de resposta pelos fornecedores</w:t>
+      </w:r>
+    </w:p>
+    <w:p>
+      <w:pPr>
+        <w:spacing w:line="240" w:lineRule="auto" w:before="0" w:after="240"/>
+        <w:jc w:val="center"/>
+      </w:pPr>
+      <w:r>
+        <w:rPr>
+          <w:b w:val="0"/>
+          <w:i w:val="0"/>
+          <w:sz w:val="20"/>
+        </w:rPr>
+        <w:t>Fonte: Dados da pesquisa (2026).</w:t>
+      </w:r>
+    </w:p>
+    <w:p>
+      <w:pPr>
+        <w:spacing w:line="360" w:lineRule="auto" w:before="0" w:after="0"/>
+        <w:ind w:firstLine="567"/>
+        <w:jc w:val="both"/>
+      </w:pPr>
+      <w:r>
+        <w:rPr>
+          <w:b w:val="0"/>
+          <w:i w:val="0"/>
+          <w:highlight w:val="yellow"/>
+        </w:rPr>
+        <w:t>Resumir os principais temas das perguntas abertas: pontos positivos, dificuldades e sugestões de melhoria, com uma ou duas respostas transcritas como exemplo.</w:t>
       </w:r>
     </w:p>
     <w:p>
@@ -8002,17 +8353,9 @@
       <w:r>
         <w:rPr>
           <w:rFonts w:ascii="Arial" w:hAnsi="Arial"/>
-          <w:highlight w:val="yellow"/>
           <w:sz w:val="20"/>
         </w:rPr>
-        <w:t xml:space="preserve">Titulação (ex.: Mestre em ...)</w:t>
-      </w:r>
-      <w:r>
-        <w:rPr>
-          <w:rFonts w:ascii="Arial" w:hAnsi="Arial"/>
-          <w:sz w:val="20"/>
-        </w:rPr>
-        <w:t xml:space="preserve">, Professor do UNESC, orientador do trabalho.</w:t>
+        <w:t xml:space="preserve">Mestre, Professor do Curso de Sistemas de Informação – UNESC, orientador do trabalho.</w:t>
       </w:r>
     </w:p>
   </w:footnote>

</xml_diff>

<commit_message>
Artigo: trabalhos correlatos, referências conferidas e discussão revisada
Co-Authored-By: Claude Opus 5.5 (1M context) <noreply@anthropic.com>
Claude-Session: https://claude.ai/code/session_013Ez8WdXVGnAz1jp93VScRd
</commit_message>
<xml_diff>
--- a/docs/artigo/artigo-TCC-provisa.docx
+++ b/docs/artigo/artigo-TCC-provisa.docx
@@ -101,7 +101,7 @@
           <w:b w:val="0"/>
           <w:i w:val="0"/>
         </w:rPr>
-        <w:t xml:space="preserve">A gestão de compras em hospitais precisa garantir que medicamentos, materiais e insumos estejam disponíveis no momento certo, porém em muitas instituições a identificação de itens abaixo do estoque mínimo, a solicitação de cotações e a comparação de propostas ainda dependem de planilhas, e-mails e telefonemas. Este trabalho teve como objetivo desenvolver e avaliar o Provisa, um sistema web de apoio à decisão que consulta o estoque por meio de uma Interface de Programação de Aplicações (API), envia automaticamente os pedidos de cotação aos fornecedores e classifica as propostas por uma pontuação ponderada de preço, prazo de entrega, disponibilidade e histórico do fornecedor, mantendo a decisão final com o comprador. A pesquisa, de natureza aplicada, exploratória e descritiva e com abordagem qualitativa e quantitativa, consistiu no desenvolvimento de um protótipo funcional com Next.js, TypeScript e PostgreSQL, testado em um cenário simulado de hospital com nove setores, e na avaliação da aceitação pelos usuários com um questionário baseado no Modelo de Aceitação de Tecnologia (TAM). Nos cenários de teste, as 13 etapas do processo manual foram reduzidas a quatro ações do comprador, todas as propostas foram registradas sem redigitação e todas as decisões ficaram rastreáveis, com ranking, pesos, responsável e justificativa armazenados. </w:t>
+        <w:t xml:space="preserve">A gestão de compras em hospitais precisa garantir que medicamentos, materiais e insumos estejam disponíveis no momento certo, porém em muitas instituições a identificação de itens abaixo do estoque mínimo, a solicitação de cotações e a comparação de propostas ainda dependem de planilhas, e-mails e telefonemas. Este trabalho teve como objetivo desenvolver e avaliar o Provisa, um sistema web de apoio à decisão que consulta o estoque por meio de uma Interface de Programação de Aplicações (API), envia automaticamente os pedidos de cotação aos fornecedores e classifica as propostas por uma pontuação ponderada de preço, prazo de entrega, disponibilidade e histórico do fornecedor, mantendo a decisão final com o comprador. A pesquisa, de natureza aplicada, exploratória e descritiva e com abordagem qualitativa e quantitativa, consistiu no desenvolvimento de um protótipo funcional com Next.js, TypeScript e PostgreSQL, testado em um cenário simulado de hospital com nove setores, e na avaliação da aceitação pelos usuários com um questionário baseado no Modelo de Aceitação de Tecnologia (TAM). Nos cenários de teste, as 13 etapas do processo manual foram reduzidas a quatro ações do comprador, as propostas passaram a ser registradas pelo próprio fornecedor e todas as decisões ficaram rastreáveis, com ranking, pesos, responsável e justificativa armazenados. </w:t>
       </w:r>
       <w:r>
         <w:rPr>
@@ -116,7 +116,7 @@
           <w:b w:val="0"/>
           <w:i w:val="0"/>
         </w:rPr>
-        <w:t xml:space="preserve"> Conclui-se que a integração com o estoque, a automação das cotações e a comparação por múltiplos critérios tornam o processo de compras mais ágil, padronizado e transparente, sem substituir o julgamento do gestor.</w:t>
+        <w:t xml:space="preserve"> Os resultados indicam que a integração com o estoque, a automação das cotações e a comparação por múltiplos critérios tornam o processo de compras mais ágil, padronizado e transparente, sem substituir o julgamento do gestor.</w:t>
       </w:r>
     </w:p>
     <w:p>
@@ -180,7 +180,7 @@
           <w:b w:val="0"/>
           <w:i w:val="0"/>
         </w:rPr>
-        <w:t xml:space="preserve">Hospital purchasing must ensure that drugs, medical supplies and other materials are available at the right time, yet in many institutions the detection of items below minimum stock, the request for quotations and the comparison of bids still rely on spreadsheets, e-mails and phone calls. This work aimed to develop and evaluate Provisa, a web-based decision support system that reads stock levels through an Application Programming Interface (API), automatically sends requests for quotation to suppliers and ranks the bids by a weighted score of price, delivery time, availability and supplier history, while the final decision remains with the buyer. The research is applied, exploratory and descriptive, with a qualitative and quantitative approach. It consisted of building a functional prototype with Next.js, TypeScript and PostgreSQL, tested in a simulated hospital scenario with nine departments, and of assessing user acceptance with a questionnaire based on the Technology Acceptance Model (TAM). In the test scenarios, the 13 steps of the manual process were reduced to four actions by the buyer, every bid was recorded without manual re-entry and every decision became traceable, with ranking, weights, person in charge and justification stored. </w:t>
+        <w:t xml:space="preserve">Hospital purchasing must ensure that drugs, medical supplies and other materials are available at the right time, yet in many institutions the detection of items below minimum stock, the request for quotations and the comparison of bids still rely on spreadsheets, e-mails and phone calls. This work aimed to develop and evaluate Provisa, a web-based decision support system that reads stock levels through an Application Programming Interface (API), automatically sends requests for quotation to suppliers and ranks the bids by a weighted score of price, delivery time, availability and supplier history, while the final decision remains with the buyer. The research is applied, exploratory and descriptive, with a qualitative and quantitative approach. It consisted of building a functional prototype with Next.js, TypeScript and PostgreSQL, tested in a simulated hospital scenario with nine departments, and of assessing user acceptance with a questionnaire based on the Technology Acceptance Model (TAM). In the test scenarios, the 13 steps of the manual process were reduced to four actions by the buyer, bids were entered by the suppliers themselves and every decision became traceable, with ranking, weights, person in charge and justification stored. </w:t>
       </w:r>
       <w:r>
         <w:rPr>
@@ -195,7 +195,7 @@
           <w:b w:val="0"/>
           <w:i w:val="0"/>
         </w:rPr>
-        <w:t xml:space="preserve"> The results indicate that stock integration, quotation automation and multi-criteria comparison make the purchasing process faster, standardized and transparent, without replacing the manager's judgment.</w:t>
+        <w:t xml:space="preserve"> The results suggest that stock integration, quotation automation and multi-criteria comparison make the purchasing process faster, standardized and transparent, without replacing the manager's judgment.</w:t>
       </w:r>
     </w:p>
     <w:p>
@@ -310,7 +310,7 @@
           <w:b w:val="0"/>
           <w:i w:val="0"/>
         </w:rPr>
-        <w:t>A relevância do trabalho está em aplicar conceitos de sistemas de informação, integração entre sistemas, automação de processos e apoio à decisão a um problema recorrente das instituições de saúde. Do ponto de vista prático, a solução busca reduzir tarefas repetitivas do comprador, diminuir a chance de ruptura de estoque e deixar registrada a justificativa de cada compra, o que favorece auditorias e prestação de contas. Do ponto de vista acadêmico, o trabalho mostra como um algoritmo de pontuação ponderada pode ser usado como apoio, e não como substituto, da decisão humana. O artigo está organizado em revisão de literatura, materiais e métodos, resultados, discussão e conclusão.</w:t>
+        <w:t>A relevância do trabalho está em aplicar conceitos de sistemas de informação, integração entre sistemas, automação de processos e apoio à decisão a um problema recorrente das instituições de saúde. Do ponto de vista prático, a solução busca reduzir tarefas repetitivas do comprador, diminuir a chance de ruptura de estoque e deixar registrada a justificativa de cada compra, o que favorece auditorias e prestação de contas. Do ponto de vista acadêmico, o trabalho mostra como um algoritmo de pontuação ponderada pode ser usado como apoio, e não como substituto, da decisão humana. O artigo está organizado em revisão de literatura, que inclui os trabalhos correlatos, materiais e métodos, resultados, discussão e conclusão.</w:t>
       </w:r>
     </w:p>
     <w:p>
@@ -699,6 +699,1073 @@
       </w:pPr>
       <w:r>
         <w:rPr>
+          <w:b w:val="0"/>
+        </w:rPr>
+        <w:t>1.7 TRABALHOS CORRELATOS</w:t>
+      </w:r>
+    </w:p>
+    <w:p>
+      <w:pPr>
+        <w:keepNext/>
+        <w:spacing w:line="360" w:lineRule="auto" w:before="0" w:after="0"/>
+        <w:jc w:val="both"/>
+      </w:pPr>
+    </w:p>
+    <w:p>
+      <w:pPr>
+        <w:spacing w:line="360" w:lineRule="auto" w:before="0" w:after="0"/>
+        <w:ind w:firstLine="567"/>
+        <w:jc w:val="both"/>
+      </w:pPr>
+      <w:r>
+        <w:rPr>
+          <w:b w:val="0"/>
+          <w:i w:val="0"/>
+        </w:rPr>
+        <w:t>Belli (2019) desenvolveu, como trabalho de conclusão do curso de Sistemas de Informação, uma página web em que os fornecedores informam disponibilidade, preço e prazo de entrega de uma solicitação de compra, com os dados enviados por serviços web ao módulo de compras de um sistema de gestão empresarial (ERP). O fluxo foi testado em simulação e avaliado por um usuário em teste de usabilidade. O trabalho automatiza a coleta das propostas, mas a comparação e a escolha continuam a cargo do ERP e do comprador.</w:t>
+      </w:r>
+    </w:p>
+    <w:p>
+      <w:pPr>
+        <w:spacing w:line="360" w:lineRule="auto" w:before="0" w:after="0"/>
+        <w:ind w:firstLine="567"/>
+        <w:jc w:val="both"/>
+      </w:pPr>
+      <w:r>
+        <w:rPr>
+          <w:b w:val="0"/>
+          <w:i w:val="0"/>
+        </w:rPr>
+        <w:t xml:space="preserve">Bernardi </w:t>
+      </w:r>
+      <w:r>
+        <w:rPr>
+          <w:b w:val="0"/>
+          <w:i/>
+        </w:rPr>
+        <w:t>et al.</w:t>
+      </w:r>
+      <w:r>
+        <w:rPr>
+          <w:b w:val="0"/>
+          <w:i w:val="0"/>
+        </w:rPr>
+        <w:t xml:space="preserve"> (2019) aplicaram os métodos multicritério AHP e PROMETHEE para classificar distribuidores de produtos de limpeza que responderam a uma solicitação de propostas de um grande hospital, com critérios definidos pelos gestores por meio de questionário. Paraguassu e Macedo (2013) usaram o método AHP para ponderar os critérios de seleção de fornecedores em Bio-Manguinhos, unidade da Fundação Oswaldo Cruz, e observaram que o peso de cada critério depende da estratégia da instituição. Esses estudos mostram a relevância da decisão multicritério em compras da área da saúde, mas aplicam os métodos fora de um sistema que acompanhe o processo de compra do início ao fim.</w:t>
+      </w:r>
+    </w:p>
+    <w:p>
+      <w:pPr>
+        <w:spacing w:line="360" w:lineRule="auto" w:before="0" w:after="0"/>
+        <w:ind w:firstLine="567"/>
+        <w:jc w:val="both"/>
+      </w:pPr>
+      <w:r>
+        <w:rPr>
+          <w:b w:val="0"/>
+          <w:i w:val="0"/>
+        </w:rPr>
+        <w:t>O Quadro 1 compara esses trabalhos com o Provisa. A contribuição deste trabalho está em reunir, em um único sistema, a detecção automática da necessidade pela API de estoque, o envio e o acompanhamento das cotações, a classificação multicritério com análise de sensibilidade dos pesos e a avaliação da aceitação pelos usuários com o TAM.</w:t>
+      </w:r>
+    </w:p>
+    <w:p>
+      <w:pPr>
+        <w:keepNext/>
+        <w:spacing w:line="240" w:lineRule="auto" w:before="120" w:after="80"/>
+        <w:jc w:val="center"/>
+      </w:pPr>
+      <w:r>
+        <w:rPr>
+          <w:b/>
+          <w:i w:val="0"/>
+          <w:sz w:val="20"/>
+        </w:rPr>
+        <w:t>Quadro 1 – Comparação entre os trabalhos correlatos e o Provisa</w:t>
+      </w:r>
+    </w:p>
+    <w:tbl>
+      <w:tblPr>
+        <w:tblW w:type="auto" w:w="0"/>
+        <w:jc w:val="center"/>
+        <w:tblLayout w:type="fixed"/>
+        <w:tblLook w:firstColumn="1" w:firstRow="1" w:lastColumn="0" w:lastRow="0" w:noHBand="0" w:noVBand="1" w:val="04A0"/>
+        <w:tblLayout w:type="fixed"/>
+      </w:tblPr>
+      <w:tblGrid>
+        <w:gridCol w:w="2041"/>
+        <w:gridCol w:w="1587"/>
+        <w:gridCol w:w="1701"/>
+        <w:gridCol w:w="1701"/>
+        <w:gridCol w:w="2041"/>
+      </w:tblGrid>
+      <w:tr>
+        <w:trPr>
+          <w:cantSplit/>
+        </w:trPr>
+        <w:tc>
+          <w:tcPr>
+            <w:tcW w:type="dxa" w:w="2041"/>
+            <w:tcBorders>
+              <w:top w:val="single" w:sz="6" w:color="000000"/>
+              <w:left w:val="single" w:sz="6" w:color="000000"/>
+              <w:bottom w:val="single" w:sz="6" w:color="000000"/>
+              <w:right w:val="single" w:sz="6" w:color="000000"/>
+            </w:tcBorders>
+          </w:tcPr>
+          <w:p>
+            <w:pPr>
+              <w:keepNext/>
+              <w:spacing w:line="240" w:lineRule="auto" w:before="40" w:after="40"/>
+              <w:jc w:val="left"/>
+            </w:pPr>
+            <w:r>
+              <w:rPr>
+                <w:b/>
+                <w:i w:val="0"/>
+                <w:sz w:val="20"/>
+              </w:rPr>
+              <w:t>Característica</w:t>
+            </w:r>
+          </w:p>
+        </w:tc>
+        <w:tc>
+          <w:tcPr>
+            <w:tcW w:type="dxa" w:w="1587"/>
+            <w:tcBorders>
+              <w:top w:val="single" w:sz="6" w:color="000000"/>
+              <w:left w:val="single" w:sz="6" w:color="000000"/>
+              <w:bottom w:val="single" w:sz="6" w:color="000000"/>
+              <w:right w:val="single" w:sz="6" w:color="000000"/>
+            </w:tcBorders>
+          </w:tcPr>
+          <w:p>
+            <w:pPr>
+              <w:keepNext/>
+              <w:spacing w:line="240" w:lineRule="auto" w:before="40" w:after="40"/>
+              <w:jc w:val="left"/>
+            </w:pPr>
+            <w:r>
+              <w:rPr>
+                <w:b/>
+                <w:i w:val="0"/>
+                <w:sz w:val="20"/>
+              </w:rPr>
+              <w:t>Belli (2019)</w:t>
+            </w:r>
+          </w:p>
+        </w:tc>
+        <w:tc>
+          <w:tcPr>
+            <w:tcW w:type="dxa" w:w="1701"/>
+            <w:tcBorders>
+              <w:top w:val="single" w:sz="6" w:color="000000"/>
+              <w:left w:val="single" w:sz="6" w:color="000000"/>
+              <w:bottom w:val="single" w:sz="6" w:color="000000"/>
+              <w:right w:val="single" w:sz="6" w:color="000000"/>
+            </w:tcBorders>
+          </w:tcPr>
+          <w:p>
+            <w:pPr>
+              <w:keepNext/>
+              <w:spacing w:line="240" w:lineRule="auto" w:before="40" w:after="40"/>
+              <w:jc w:val="left"/>
+            </w:pPr>
+            <w:r>
+              <w:rPr>
+                <w:b/>
+                <w:i w:val="0"/>
+                <w:sz w:val="20"/>
+              </w:rPr>
+              <w:t>Bernardi et al. (2019)</w:t>
+            </w:r>
+          </w:p>
+        </w:tc>
+        <w:tc>
+          <w:tcPr>
+            <w:tcW w:type="dxa" w:w="1701"/>
+            <w:tcBorders>
+              <w:top w:val="single" w:sz="6" w:color="000000"/>
+              <w:left w:val="single" w:sz="6" w:color="000000"/>
+              <w:bottom w:val="single" w:sz="6" w:color="000000"/>
+              <w:right w:val="single" w:sz="6" w:color="000000"/>
+            </w:tcBorders>
+          </w:tcPr>
+          <w:p>
+            <w:pPr>
+              <w:keepNext/>
+              <w:spacing w:line="240" w:lineRule="auto" w:before="40" w:after="40"/>
+              <w:jc w:val="left"/>
+            </w:pPr>
+            <w:r>
+              <w:rPr>
+                <w:b/>
+                <w:i w:val="0"/>
+                <w:sz w:val="20"/>
+              </w:rPr>
+              <w:t>Paraguassu e Macedo (2013)</w:t>
+            </w:r>
+          </w:p>
+        </w:tc>
+        <w:tc>
+          <w:tcPr>
+            <w:tcW w:type="dxa" w:w="2041"/>
+            <w:tcBorders>
+              <w:top w:val="single" w:sz="6" w:color="000000"/>
+              <w:left w:val="single" w:sz="6" w:color="000000"/>
+              <w:bottom w:val="single" w:sz="6" w:color="000000"/>
+              <w:right w:val="single" w:sz="6" w:color="000000"/>
+            </w:tcBorders>
+          </w:tcPr>
+          <w:p>
+            <w:pPr>
+              <w:keepNext/>
+              <w:spacing w:line="240" w:lineRule="auto" w:before="40" w:after="40"/>
+              <w:jc w:val="left"/>
+            </w:pPr>
+            <w:r>
+              <w:rPr>
+                <w:b/>
+                <w:i w:val="0"/>
+                <w:sz w:val="20"/>
+              </w:rPr>
+              <w:t>Provisa</w:t>
+            </w:r>
+          </w:p>
+        </w:tc>
+      </w:tr>
+      <w:tr>
+        <w:trPr>
+          <w:cantSplit/>
+        </w:trPr>
+        <w:tc>
+          <w:tcPr>
+            <w:tcW w:type="dxa" w:w="2041"/>
+            <w:tcBorders>
+              <w:top w:val="single" w:sz="6" w:color="000000"/>
+              <w:left w:val="single" w:sz="6" w:color="000000"/>
+              <w:bottom w:val="single" w:sz="6" w:color="000000"/>
+              <w:right w:val="single" w:sz="6" w:color="000000"/>
+            </w:tcBorders>
+          </w:tcPr>
+          <w:p>
+            <w:pPr>
+              <w:keepNext/>
+              <w:spacing w:line="240" w:lineRule="auto" w:before="40" w:after="40"/>
+              <w:jc w:val="left"/>
+            </w:pPr>
+            <w:r>
+              <w:rPr>
+                <w:b w:val="0"/>
+                <w:i w:val="0"/>
+                <w:sz w:val="20"/>
+              </w:rPr>
+              <w:t>Contexto</w:t>
+            </w:r>
+          </w:p>
+        </w:tc>
+        <w:tc>
+          <w:tcPr>
+            <w:tcW w:type="dxa" w:w="1587"/>
+            <w:tcBorders>
+              <w:top w:val="single" w:sz="6" w:color="000000"/>
+              <w:left w:val="single" w:sz="6" w:color="000000"/>
+              <w:bottom w:val="single" w:sz="6" w:color="000000"/>
+              <w:right w:val="single" w:sz="6" w:color="000000"/>
+            </w:tcBorders>
+          </w:tcPr>
+          <w:p>
+            <w:pPr>
+              <w:keepNext/>
+              <w:spacing w:line="240" w:lineRule="auto" w:before="40" w:after="40"/>
+              <w:jc w:val="left"/>
+            </w:pPr>
+            <w:r>
+              <w:rPr>
+                <w:b w:val="0"/>
+                <w:i w:val="0"/>
+                <w:sz w:val="20"/>
+              </w:rPr>
+              <w:t>Empresa com ERP</w:t>
+            </w:r>
+          </w:p>
+        </w:tc>
+        <w:tc>
+          <w:tcPr>
+            <w:tcW w:type="dxa" w:w="1701"/>
+            <w:tcBorders>
+              <w:top w:val="single" w:sz="6" w:color="000000"/>
+              <w:left w:val="single" w:sz="6" w:color="000000"/>
+              <w:bottom w:val="single" w:sz="6" w:color="000000"/>
+              <w:right w:val="single" w:sz="6" w:color="000000"/>
+            </w:tcBorders>
+          </w:tcPr>
+          <w:p>
+            <w:pPr>
+              <w:keepNext/>
+              <w:spacing w:line="240" w:lineRule="auto" w:before="40" w:after="40"/>
+              <w:jc w:val="left"/>
+            </w:pPr>
+            <w:r>
+              <w:rPr>
+                <w:b w:val="0"/>
+                <w:i w:val="0"/>
+                <w:sz w:val="20"/>
+              </w:rPr>
+              <w:t>Hospital</w:t>
+            </w:r>
+          </w:p>
+        </w:tc>
+        <w:tc>
+          <w:tcPr>
+            <w:tcW w:type="dxa" w:w="1701"/>
+            <w:tcBorders>
+              <w:top w:val="single" w:sz="6" w:color="000000"/>
+              <w:left w:val="single" w:sz="6" w:color="000000"/>
+              <w:bottom w:val="single" w:sz="6" w:color="000000"/>
+              <w:right w:val="single" w:sz="6" w:color="000000"/>
+            </w:tcBorders>
+          </w:tcPr>
+          <w:p>
+            <w:pPr>
+              <w:keepNext/>
+              <w:spacing w:line="240" w:lineRule="auto" w:before="40" w:after="40"/>
+              <w:jc w:val="left"/>
+            </w:pPr>
+            <w:r>
+              <w:rPr>
+                <w:b w:val="0"/>
+                <w:i w:val="0"/>
+                <w:sz w:val="20"/>
+              </w:rPr>
+              <w:t>Instituição pública de saúde</w:t>
+            </w:r>
+          </w:p>
+        </w:tc>
+        <w:tc>
+          <w:tcPr>
+            <w:tcW w:type="dxa" w:w="2041"/>
+            <w:tcBorders>
+              <w:top w:val="single" w:sz="6" w:color="000000"/>
+              <w:left w:val="single" w:sz="6" w:color="000000"/>
+              <w:bottom w:val="single" w:sz="6" w:color="000000"/>
+              <w:right w:val="single" w:sz="6" w:color="000000"/>
+            </w:tcBorders>
+          </w:tcPr>
+          <w:p>
+            <w:pPr>
+              <w:keepNext/>
+              <w:spacing w:line="240" w:lineRule="auto" w:before="40" w:after="40"/>
+              <w:jc w:val="left"/>
+            </w:pPr>
+            <w:r>
+              <w:rPr>
+                <w:b w:val="0"/>
+                <w:i w:val="0"/>
+                <w:sz w:val="20"/>
+              </w:rPr>
+              <w:t>Hospital</w:t>
+            </w:r>
+          </w:p>
+        </w:tc>
+      </w:tr>
+      <w:tr>
+        <w:trPr>
+          <w:cantSplit/>
+        </w:trPr>
+        <w:tc>
+          <w:tcPr>
+            <w:tcW w:type="dxa" w:w="2041"/>
+            <w:tcBorders>
+              <w:top w:val="single" w:sz="6" w:color="000000"/>
+              <w:left w:val="single" w:sz="6" w:color="000000"/>
+              <w:bottom w:val="single" w:sz="6" w:color="000000"/>
+              <w:right w:val="single" w:sz="6" w:color="000000"/>
+            </w:tcBorders>
+          </w:tcPr>
+          <w:p>
+            <w:pPr>
+              <w:keepNext/>
+              <w:spacing w:line="240" w:lineRule="auto" w:before="40" w:after="40"/>
+              <w:jc w:val="left"/>
+            </w:pPr>
+            <w:r>
+              <w:rPr>
+                <w:b w:val="0"/>
+                <w:i w:val="0"/>
+                <w:sz w:val="20"/>
+              </w:rPr>
+              <w:t>Detecção automática da necessidade</w:t>
+            </w:r>
+          </w:p>
+        </w:tc>
+        <w:tc>
+          <w:tcPr>
+            <w:tcW w:type="dxa" w:w="1587"/>
+            <w:tcBorders>
+              <w:top w:val="single" w:sz="6" w:color="000000"/>
+              <w:left w:val="single" w:sz="6" w:color="000000"/>
+              <w:bottom w:val="single" w:sz="6" w:color="000000"/>
+              <w:right w:val="single" w:sz="6" w:color="000000"/>
+            </w:tcBorders>
+          </w:tcPr>
+          <w:p>
+            <w:pPr>
+              <w:keepNext/>
+              <w:spacing w:line="240" w:lineRule="auto" w:before="40" w:after="40"/>
+              <w:jc w:val="left"/>
+            </w:pPr>
+            <w:r>
+              <w:rPr>
+                <w:b w:val="0"/>
+                <w:i w:val="0"/>
+                <w:sz w:val="20"/>
+              </w:rPr>
+              <w:t>Não</w:t>
+            </w:r>
+          </w:p>
+        </w:tc>
+        <w:tc>
+          <w:tcPr>
+            <w:tcW w:type="dxa" w:w="1701"/>
+            <w:tcBorders>
+              <w:top w:val="single" w:sz="6" w:color="000000"/>
+              <w:left w:val="single" w:sz="6" w:color="000000"/>
+              <w:bottom w:val="single" w:sz="6" w:color="000000"/>
+              <w:right w:val="single" w:sz="6" w:color="000000"/>
+            </w:tcBorders>
+          </w:tcPr>
+          <w:p>
+            <w:pPr>
+              <w:keepNext/>
+              <w:spacing w:line="240" w:lineRule="auto" w:before="40" w:after="40"/>
+              <w:jc w:val="left"/>
+            </w:pPr>
+            <w:r>
+              <w:rPr>
+                <w:b w:val="0"/>
+                <w:i w:val="0"/>
+                <w:sz w:val="20"/>
+              </w:rPr>
+              <w:t>Não</w:t>
+            </w:r>
+          </w:p>
+        </w:tc>
+        <w:tc>
+          <w:tcPr>
+            <w:tcW w:type="dxa" w:w="1701"/>
+            <w:tcBorders>
+              <w:top w:val="single" w:sz="6" w:color="000000"/>
+              <w:left w:val="single" w:sz="6" w:color="000000"/>
+              <w:bottom w:val="single" w:sz="6" w:color="000000"/>
+              <w:right w:val="single" w:sz="6" w:color="000000"/>
+            </w:tcBorders>
+          </w:tcPr>
+          <w:p>
+            <w:pPr>
+              <w:keepNext/>
+              <w:spacing w:line="240" w:lineRule="auto" w:before="40" w:after="40"/>
+              <w:jc w:val="left"/>
+            </w:pPr>
+            <w:r>
+              <w:rPr>
+                <w:b w:val="0"/>
+                <w:i w:val="0"/>
+                <w:sz w:val="20"/>
+              </w:rPr>
+              <w:t>Não</w:t>
+            </w:r>
+          </w:p>
+        </w:tc>
+        <w:tc>
+          <w:tcPr>
+            <w:tcW w:type="dxa" w:w="2041"/>
+            <w:tcBorders>
+              <w:top w:val="single" w:sz="6" w:color="000000"/>
+              <w:left w:val="single" w:sz="6" w:color="000000"/>
+              <w:bottom w:val="single" w:sz="6" w:color="000000"/>
+              <w:right w:val="single" w:sz="6" w:color="000000"/>
+            </w:tcBorders>
+          </w:tcPr>
+          <w:p>
+            <w:pPr>
+              <w:keepNext/>
+              <w:spacing w:line="240" w:lineRule="auto" w:before="40" w:after="40"/>
+              <w:jc w:val="left"/>
+            </w:pPr>
+            <w:r>
+              <w:rPr>
+                <w:b w:val="0"/>
+                <w:i w:val="0"/>
+                <w:sz w:val="20"/>
+              </w:rPr>
+              <w:t>Sim, pela API de estoque</w:t>
+            </w:r>
+          </w:p>
+        </w:tc>
+      </w:tr>
+      <w:tr>
+        <w:trPr>
+          <w:cantSplit/>
+        </w:trPr>
+        <w:tc>
+          <w:tcPr>
+            <w:tcW w:type="dxa" w:w="2041"/>
+            <w:tcBorders>
+              <w:top w:val="single" w:sz="6" w:color="000000"/>
+              <w:left w:val="single" w:sz="6" w:color="000000"/>
+              <w:bottom w:val="single" w:sz="6" w:color="000000"/>
+              <w:right w:val="single" w:sz="6" w:color="000000"/>
+            </w:tcBorders>
+          </w:tcPr>
+          <w:p>
+            <w:pPr>
+              <w:keepNext/>
+              <w:spacing w:line="240" w:lineRule="auto" w:before="40" w:after="40"/>
+              <w:jc w:val="left"/>
+            </w:pPr>
+            <w:r>
+              <w:rPr>
+                <w:b w:val="0"/>
+                <w:i w:val="0"/>
+                <w:sz w:val="20"/>
+              </w:rPr>
+              <w:t>Envio e coleta das cotações</w:t>
+            </w:r>
+          </w:p>
+        </w:tc>
+        <w:tc>
+          <w:tcPr>
+            <w:tcW w:type="dxa" w:w="1587"/>
+            <w:tcBorders>
+              <w:top w:val="single" w:sz="6" w:color="000000"/>
+              <w:left w:val="single" w:sz="6" w:color="000000"/>
+              <w:bottom w:val="single" w:sz="6" w:color="000000"/>
+              <w:right w:val="single" w:sz="6" w:color="000000"/>
+            </w:tcBorders>
+          </w:tcPr>
+          <w:p>
+            <w:pPr>
+              <w:keepNext/>
+              <w:spacing w:line="240" w:lineRule="auto" w:before="40" w:after="40"/>
+              <w:jc w:val="left"/>
+            </w:pPr>
+            <w:r>
+              <w:rPr>
+                <w:b w:val="0"/>
+                <w:i w:val="0"/>
+                <w:sz w:val="20"/>
+              </w:rPr>
+              <w:t>Sim, portal web</w:t>
+            </w:r>
+          </w:p>
+        </w:tc>
+        <w:tc>
+          <w:tcPr>
+            <w:tcW w:type="dxa" w:w="1701"/>
+            <w:tcBorders>
+              <w:top w:val="single" w:sz="6" w:color="000000"/>
+              <w:left w:val="single" w:sz="6" w:color="000000"/>
+              <w:bottom w:val="single" w:sz="6" w:color="000000"/>
+              <w:right w:val="single" w:sz="6" w:color="000000"/>
+            </w:tcBorders>
+          </w:tcPr>
+          <w:p>
+            <w:pPr>
+              <w:keepNext/>
+              <w:spacing w:line="240" w:lineRule="auto" w:before="40" w:after="40"/>
+              <w:jc w:val="left"/>
+            </w:pPr>
+            <w:r>
+              <w:rPr>
+                <w:b w:val="0"/>
+                <w:i w:val="0"/>
+                <w:sz w:val="20"/>
+              </w:rPr>
+              <w:t>Não</w:t>
+            </w:r>
+          </w:p>
+        </w:tc>
+        <w:tc>
+          <w:tcPr>
+            <w:tcW w:type="dxa" w:w="1701"/>
+            <w:tcBorders>
+              <w:top w:val="single" w:sz="6" w:color="000000"/>
+              <w:left w:val="single" w:sz="6" w:color="000000"/>
+              <w:bottom w:val="single" w:sz="6" w:color="000000"/>
+              <w:right w:val="single" w:sz="6" w:color="000000"/>
+            </w:tcBorders>
+          </w:tcPr>
+          <w:p>
+            <w:pPr>
+              <w:keepNext/>
+              <w:spacing w:line="240" w:lineRule="auto" w:before="40" w:after="40"/>
+              <w:jc w:val="left"/>
+            </w:pPr>
+            <w:r>
+              <w:rPr>
+                <w:b w:val="0"/>
+                <w:i w:val="0"/>
+                <w:sz w:val="20"/>
+              </w:rPr>
+              <w:t>Não</w:t>
+            </w:r>
+          </w:p>
+        </w:tc>
+        <w:tc>
+          <w:tcPr>
+            <w:tcW w:type="dxa" w:w="2041"/>
+            <w:tcBorders>
+              <w:top w:val="single" w:sz="6" w:color="000000"/>
+              <w:left w:val="single" w:sz="6" w:color="000000"/>
+              <w:bottom w:val="single" w:sz="6" w:color="000000"/>
+              <w:right w:val="single" w:sz="6" w:color="000000"/>
+            </w:tcBorders>
+          </w:tcPr>
+          <w:p>
+            <w:pPr>
+              <w:keepNext/>
+              <w:spacing w:line="240" w:lineRule="auto" w:before="40" w:after="40"/>
+              <w:jc w:val="left"/>
+            </w:pPr>
+            <w:r>
+              <w:rPr>
+                <w:b w:val="0"/>
+                <w:i w:val="0"/>
+                <w:sz w:val="20"/>
+              </w:rPr>
+              <w:t>Sim, e-mail, portal e lembretes</w:t>
+            </w:r>
+          </w:p>
+        </w:tc>
+      </w:tr>
+      <w:tr>
+        <w:trPr>
+          <w:cantSplit/>
+        </w:trPr>
+        <w:tc>
+          <w:tcPr>
+            <w:tcW w:type="dxa" w:w="2041"/>
+            <w:tcBorders>
+              <w:top w:val="single" w:sz="6" w:color="000000"/>
+              <w:left w:val="single" w:sz="6" w:color="000000"/>
+              <w:bottom w:val="single" w:sz="6" w:color="000000"/>
+              <w:right w:val="single" w:sz="6" w:color="000000"/>
+            </w:tcBorders>
+          </w:tcPr>
+          <w:p>
+            <w:pPr>
+              <w:keepNext/>
+              <w:spacing w:line="240" w:lineRule="auto" w:before="40" w:after="40"/>
+              <w:jc w:val="left"/>
+            </w:pPr>
+            <w:r>
+              <w:rPr>
+                <w:b w:val="0"/>
+                <w:i w:val="0"/>
+                <w:sz w:val="20"/>
+              </w:rPr>
+              <w:t>Comparação por múltiplos critérios</w:t>
+            </w:r>
+          </w:p>
+        </w:tc>
+        <w:tc>
+          <w:tcPr>
+            <w:tcW w:type="dxa" w:w="1587"/>
+            <w:tcBorders>
+              <w:top w:val="single" w:sz="6" w:color="000000"/>
+              <w:left w:val="single" w:sz="6" w:color="000000"/>
+              <w:bottom w:val="single" w:sz="6" w:color="000000"/>
+              <w:right w:val="single" w:sz="6" w:color="000000"/>
+            </w:tcBorders>
+          </w:tcPr>
+          <w:p>
+            <w:pPr>
+              <w:keepNext/>
+              <w:spacing w:line="240" w:lineRule="auto" w:before="40" w:after="40"/>
+              <w:jc w:val="left"/>
+            </w:pPr>
+            <w:r>
+              <w:rPr>
+                <w:b w:val="0"/>
+                <w:i w:val="0"/>
+                <w:sz w:val="20"/>
+              </w:rPr>
+              <w:t>Não é o foco</w:t>
+            </w:r>
+          </w:p>
+        </w:tc>
+        <w:tc>
+          <w:tcPr>
+            <w:tcW w:type="dxa" w:w="1701"/>
+            <w:tcBorders>
+              <w:top w:val="single" w:sz="6" w:color="000000"/>
+              <w:left w:val="single" w:sz="6" w:color="000000"/>
+              <w:bottom w:val="single" w:sz="6" w:color="000000"/>
+              <w:right w:val="single" w:sz="6" w:color="000000"/>
+            </w:tcBorders>
+          </w:tcPr>
+          <w:p>
+            <w:pPr>
+              <w:keepNext/>
+              <w:spacing w:line="240" w:lineRule="auto" w:before="40" w:after="40"/>
+              <w:jc w:val="left"/>
+            </w:pPr>
+            <w:r>
+              <w:rPr>
+                <w:b w:val="0"/>
+                <w:i w:val="0"/>
+                <w:sz w:val="20"/>
+              </w:rPr>
+              <w:t>Sim, AHP e PROMETHEE</w:t>
+            </w:r>
+          </w:p>
+        </w:tc>
+        <w:tc>
+          <w:tcPr>
+            <w:tcW w:type="dxa" w:w="1701"/>
+            <w:tcBorders>
+              <w:top w:val="single" w:sz="6" w:color="000000"/>
+              <w:left w:val="single" w:sz="6" w:color="000000"/>
+              <w:bottom w:val="single" w:sz="6" w:color="000000"/>
+              <w:right w:val="single" w:sz="6" w:color="000000"/>
+            </w:tcBorders>
+          </w:tcPr>
+          <w:p>
+            <w:pPr>
+              <w:keepNext/>
+              <w:spacing w:line="240" w:lineRule="auto" w:before="40" w:after="40"/>
+              <w:jc w:val="left"/>
+            </w:pPr>
+            <w:r>
+              <w:rPr>
+                <w:b w:val="0"/>
+                <w:i w:val="0"/>
+                <w:sz w:val="20"/>
+              </w:rPr>
+              <w:t>Sim, AHP</w:t>
+            </w:r>
+          </w:p>
+        </w:tc>
+        <w:tc>
+          <w:tcPr>
+            <w:tcW w:type="dxa" w:w="2041"/>
+            <w:tcBorders>
+              <w:top w:val="single" w:sz="6" w:color="000000"/>
+              <w:left w:val="single" w:sz="6" w:color="000000"/>
+              <w:bottom w:val="single" w:sz="6" w:color="000000"/>
+              <w:right w:val="single" w:sz="6" w:color="000000"/>
+            </w:tcBorders>
+          </w:tcPr>
+          <w:p>
+            <w:pPr>
+              <w:keepNext/>
+              <w:spacing w:line="240" w:lineRule="auto" w:before="40" w:after="40"/>
+              <w:jc w:val="left"/>
+            </w:pPr>
+            <w:r>
+              <w:rPr>
+                <w:b w:val="0"/>
+                <w:i w:val="0"/>
+                <w:sz w:val="20"/>
+              </w:rPr>
+              <w:t>Sim, soma ponderada com simulação de pesos</w:t>
+            </w:r>
+          </w:p>
+        </w:tc>
+      </w:tr>
+      <w:tr>
+        <w:trPr>
+          <w:cantSplit/>
+        </w:trPr>
+        <w:tc>
+          <w:tcPr>
+            <w:tcW w:type="dxa" w:w="2041"/>
+            <w:tcBorders>
+              <w:top w:val="single" w:sz="6" w:color="000000"/>
+              <w:left w:val="single" w:sz="6" w:color="000000"/>
+              <w:bottom w:val="single" w:sz="6" w:color="000000"/>
+              <w:right w:val="single" w:sz="6" w:color="000000"/>
+            </w:tcBorders>
+          </w:tcPr>
+          <w:p>
+            <w:pPr>
+              <w:keepNext/>
+              <w:spacing w:line="240" w:lineRule="auto" w:before="40" w:after="40"/>
+              <w:jc w:val="left"/>
+            </w:pPr>
+            <w:r>
+              <w:rPr>
+                <w:b w:val="0"/>
+                <w:i w:val="0"/>
+                <w:sz w:val="20"/>
+              </w:rPr>
+              <w:t>Pedido, pagamento e recebimento</w:t>
+            </w:r>
+          </w:p>
+        </w:tc>
+        <w:tc>
+          <w:tcPr>
+            <w:tcW w:type="dxa" w:w="1587"/>
+            <w:tcBorders>
+              <w:top w:val="single" w:sz="6" w:color="000000"/>
+              <w:left w:val="single" w:sz="6" w:color="000000"/>
+              <w:bottom w:val="single" w:sz="6" w:color="000000"/>
+              <w:right w:val="single" w:sz="6" w:color="000000"/>
+            </w:tcBorders>
+          </w:tcPr>
+          <w:p>
+            <w:pPr>
+              <w:keepNext/>
+              <w:spacing w:line="240" w:lineRule="auto" w:before="40" w:after="40"/>
+              <w:jc w:val="left"/>
+            </w:pPr>
+            <w:r>
+              <w:rPr>
+                <w:b w:val="0"/>
+                <w:i w:val="0"/>
+                <w:sz w:val="20"/>
+              </w:rPr>
+              <w:t>Não</w:t>
+            </w:r>
+          </w:p>
+        </w:tc>
+        <w:tc>
+          <w:tcPr>
+            <w:tcW w:type="dxa" w:w="1701"/>
+            <w:tcBorders>
+              <w:top w:val="single" w:sz="6" w:color="000000"/>
+              <w:left w:val="single" w:sz="6" w:color="000000"/>
+              <w:bottom w:val="single" w:sz="6" w:color="000000"/>
+              <w:right w:val="single" w:sz="6" w:color="000000"/>
+            </w:tcBorders>
+          </w:tcPr>
+          <w:p>
+            <w:pPr>
+              <w:keepNext/>
+              <w:spacing w:line="240" w:lineRule="auto" w:before="40" w:after="40"/>
+              <w:jc w:val="left"/>
+            </w:pPr>
+            <w:r>
+              <w:rPr>
+                <w:b w:val="0"/>
+                <w:i w:val="0"/>
+                <w:sz w:val="20"/>
+              </w:rPr>
+              <w:t>Não</w:t>
+            </w:r>
+          </w:p>
+        </w:tc>
+        <w:tc>
+          <w:tcPr>
+            <w:tcW w:type="dxa" w:w="1701"/>
+            <w:tcBorders>
+              <w:top w:val="single" w:sz="6" w:color="000000"/>
+              <w:left w:val="single" w:sz="6" w:color="000000"/>
+              <w:bottom w:val="single" w:sz="6" w:color="000000"/>
+              <w:right w:val="single" w:sz="6" w:color="000000"/>
+            </w:tcBorders>
+          </w:tcPr>
+          <w:p>
+            <w:pPr>
+              <w:keepNext/>
+              <w:spacing w:line="240" w:lineRule="auto" w:before="40" w:after="40"/>
+              <w:jc w:val="left"/>
+            </w:pPr>
+            <w:r>
+              <w:rPr>
+                <w:b w:val="0"/>
+                <w:i w:val="0"/>
+                <w:sz w:val="20"/>
+              </w:rPr>
+              <w:t>Não</w:t>
+            </w:r>
+          </w:p>
+        </w:tc>
+        <w:tc>
+          <w:tcPr>
+            <w:tcW w:type="dxa" w:w="2041"/>
+            <w:tcBorders>
+              <w:top w:val="single" w:sz="6" w:color="000000"/>
+              <w:left w:val="single" w:sz="6" w:color="000000"/>
+              <w:bottom w:val="single" w:sz="6" w:color="000000"/>
+              <w:right w:val="single" w:sz="6" w:color="000000"/>
+            </w:tcBorders>
+          </w:tcPr>
+          <w:p>
+            <w:pPr>
+              <w:keepNext/>
+              <w:spacing w:line="240" w:lineRule="auto" w:before="40" w:after="40"/>
+              <w:jc w:val="left"/>
+            </w:pPr>
+            <w:r>
+              <w:rPr>
+                <w:b w:val="0"/>
+                <w:i w:val="0"/>
+                <w:sz w:val="20"/>
+              </w:rPr>
+              <w:t>Sim</w:t>
+            </w:r>
+          </w:p>
+        </w:tc>
+      </w:tr>
+      <w:tr>
+        <w:trPr>
+          <w:cantSplit/>
+        </w:trPr>
+        <w:tc>
+          <w:tcPr>
+            <w:tcW w:type="dxa" w:w="2041"/>
+            <w:tcBorders>
+              <w:top w:val="single" w:sz="6" w:color="000000"/>
+              <w:left w:val="single" w:sz="6" w:color="000000"/>
+              <w:bottom w:val="single" w:sz="6" w:color="000000"/>
+              <w:right w:val="single" w:sz="6" w:color="000000"/>
+            </w:tcBorders>
+          </w:tcPr>
+          <w:p>
+            <w:pPr>
+              <w:spacing w:line="240" w:lineRule="auto" w:before="40" w:after="40"/>
+              <w:jc w:val="left"/>
+            </w:pPr>
+            <w:r>
+              <w:rPr>
+                <w:b w:val="0"/>
+                <w:i w:val="0"/>
+                <w:sz w:val="20"/>
+              </w:rPr>
+              <w:t>Avaliação com usuários</w:t>
+            </w:r>
+          </w:p>
+        </w:tc>
+        <w:tc>
+          <w:tcPr>
+            <w:tcW w:type="dxa" w:w="1587"/>
+            <w:tcBorders>
+              <w:top w:val="single" w:sz="6" w:color="000000"/>
+              <w:left w:val="single" w:sz="6" w:color="000000"/>
+              <w:bottom w:val="single" w:sz="6" w:color="000000"/>
+              <w:right w:val="single" w:sz="6" w:color="000000"/>
+            </w:tcBorders>
+          </w:tcPr>
+          <w:p>
+            <w:pPr>
+              <w:spacing w:line="240" w:lineRule="auto" w:before="40" w:after="40"/>
+              <w:jc w:val="left"/>
+            </w:pPr>
+            <w:r>
+              <w:rPr>
+                <w:b w:val="0"/>
+                <w:i w:val="0"/>
+                <w:sz w:val="20"/>
+              </w:rPr>
+              <w:t>Teste de usabilidade</w:t>
+            </w:r>
+          </w:p>
+        </w:tc>
+        <w:tc>
+          <w:tcPr>
+            <w:tcW w:type="dxa" w:w="1701"/>
+            <w:tcBorders>
+              <w:top w:val="single" w:sz="6" w:color="000000"/>
+              <w:left w:val="single" w:sz="6" w:color="000000"/>
+              <w:bottom w:val="single" w:sz="6" w:color="000000"/>
+              <w:right w:val="single" w:sz="6" w:color="000000"/>
+            </w:tcBorders>
+          </w:tcPr>
+          <w:p>
+            <w:pPr>
+              <w:spacing w:line="240" w:lineRule="auto" w:before="40" w:after="40"/>
+              <w:jc w:val="left"/>
+            </w:pPr>
+            <w:r>
+              <w:rPr>
+                <w:b w:val="0"/>
+                <w:i w:val="0"/>
+                <w:sz w:val="20"/>
+              </w:rPr>
+              <w:t>Questionário com gestores</w:t>
+            </w:r>
+          </w:p>
+        </w:tc>
+        <w:tc>
+          <w:tcPr>
+            <w:tcW w:type="dxa" w:w="1701"/>
+            <w:tcBorders>
+              <w:top w:val="single" w:sz="6" w:color="000000"/>
+              <w:left w:val="single" w:sz="6" w:color="000000"/>
+              <w:bottom w:val="single" w:sz="6" w:color="000000"/>
+              <w:right w:val="single" w:sz="6" w:color="000000"/>
+            </w:tcBorders>
+          </w:tcPr>
+          <w:p>
+            <w:pPr>
+              <w:spacing w:line="240" w:lineRule="auto" w:before="40" w:after="40"/>
+              <w:jc w:val="left"/>
+            </w:pPr>
+            <w:r>
+              <w:rPr>
+                <w:b w:val="0"/>
+                <w:i w:val="0"/>
+                <w:sz w:val="20"/>
+              </w:rPr>
+              <w:t>Entrevistas</w:t>
+            </w:r>
+          </w:p>
+        </w:tc>
+        <w:tc>
+          <w:tcPr>
+            <w:tcW w:type="dxa" w:w="2041"/>
+            <w:tcBorders>
+              <w:top w:val="single" w:sz="6" w:color="000000"/>
+              <w:left w:val="single" w:sz="6" w:color="000000"/>
+              <w:bottom w:val="single" w:sz="6" w:color="000000"/>
+              <w:right w:val="single" w:sz="6" w:color="000000"/>
+            </w:tcBorders>
+          </w:tcPr>
+          <w:p>
+            <w:pPr>
+              <w:spacing w:line="240" w:lineRule="auto" w:before="40" w:after="40"/>
+              <w:jc w:val="left"/>
+            </w:pPr>
+            <w:r>
+              <w:rPr>
+                <w:b w:val="0"/>
+                <w:i w:val="0"/>
+                <w:sz w:val="20"/>
+              </w:rPr>
+              <w:t>Questionário TAM</w:t>
+            </w:r>
+          </w:p>
+        </w:tc>
+      </w:tr>
+    </w:tbl>
+    <w:p>
+      <w:pPr>
+        <w:spacing w:line="240" w:lineRule="auto" w:before="80" w:after="240"/>
+        <w:jc w:val="left"/>
+      </w:pPr>
+      <w:r>
+        <w:rPr>
+          <w:b w:val="0"/>
+          <w:i w:val="0"/>
+          <w:sz w:val="20"/>
+        </w:rPr>
+        <w:t>Fonte: Elaborado pelo autor (2026).</w:t>
+      </w:r>
+    </w:p>
+    <w:p>
+      <w:pPr>
+        <w:spacing w:line="360" w:lineRule="auto" w:before="0" w:after="0"/>
+        <w:jc w:val="both"/>
+      </w:pPr>
+    </w:p>
+    <w:p>
+      <w:pPr>
+        <w:keepNext/>
+        <w:spacing w:line="360" w:lineRule="auto" w:before="0" w:after="0"/>
+        <w:jc w:val="left"/>
+      </w:pPr>
+      <w:r>
+        <w:rPr>
           <w:b/>
         </w:rPr>
         <w:t>2 MATERIAIS E MÉTODOS</w:t>
@@ -822,7 +1889,7 @@
           <w:b w:val="0"/>
           <w:i w:val="0"/>
         </w:rPr>
-        <w:t>O Quadro 1 apresenta as tecnologias empregadas. A escolha priorizou ferramentas gratuitas, de código aberto e amplamente usadas no mercado, de modo que o projeto não tivesse custo de licenças.</w:t>
+        <w:t>O Quadro 2 apresenta as tecnologias empregadas. A escolha priorizou ferramentas gratuitas, de código aberto e amplamente usadas no mercado, de modo que o projeto não tivesse custo de licenças.</w:t>
       </w:r>
     </w:p>
     <w:p>
@@ -837,7 +1904,7 @@
           <w:i w:val="0"/>
           <w:sz w:val="20"/>
         </w:rPr>
-        <w:t>Quadro 1 – Tecnologias utilizadas no desenvolvimento</w:t>
+        <w:t>Quadro 2 – Tecnologias utilizadas no desenvolvimento</w:t>
       </w:r>
     </w:p>
     <w:tbl>
@@ -2413,7 +3480,7 @@
           <w:b w:val="0"/>
           <w:i w:val="0"/>
         </w:rPr>
-        <w:t>O sistema possui ainda dashboard gerencial com filtro por setor, histórico de cotações e decisões, relatórios em PDF e CSV, caixa de saída com todos os e-mails enviados, registro de operações (log), cadastro de usuários com três perfis (administrador, gestor e comprador) e bloqueio temporário do acesso após cinco tentativas de senha incorretas. O Quadro 2 relaciona os requisitos do projeto com a forma como foram atendidos.</w:t>
+        <w:t>O sistema possui ainda dashboard gerencial com filtro por setor, histórico de cotações e decisões, relatórios em PDF e CSV, caixa de saída com todos os e-mails enviados, registro de operações (log), cadastro de usuários com três perfis (administrador, gestor e comprador) e bloqueio temporário do acesso após cinco tentativas de senha incorretas. O Quadro 3 relaciona os requisitos do projeto com a forma como foram atendidos.</w:t>
       </w:r>
     </w:p>
     <w:p>
@@ -2428,7 +3495,7 @@
           <w:i w:val="0"/>
           <w:sz w:val="20"/>
         </w:rPr>
-        <w:t>Quadro 2 – Atendimento aos requisitos funcionais do projeto</w:t>
+        <w:t>Quadro 3 – Atendimento aos requisitos funcionais do projeto</w:t>
       </w:r>
     </w:p>
     <w:tbl>
@@ -4261,7 +5328,7 @@
           <w:b w:val="0"/>
           <w:i w:val="0"/>
         </w:rPr>
-        <w:t xml:space="preserve">A Tabela 2 apresenta os indicadores medidos no cenário de teste, organizados pelas hipóteses </w:t>
+        <w:t xml:space="preserve">A Tabela 2 apresenta os indicadores registrados pelo sistema no cenário de demonstração, organizados pelas hipóteses. Como nesse cenário as propostas foram simuladas e as decisões foram tomadas pelo pesquisador durante os testes, os números mostram que o sistema registra e rastreia cada etapa, e não o comportamento de usuários reais </w:t>
       </w:r>
       <w:r>
         <w:rPr>
@@ -4269,7 +5336,7 @@
           <w:i w:val="0"/>
           <w:highlight w:val="yellow"/>
         </w:rPr>
-        <w:t>conferir e atualizar os números na tela Avaliação do sistema no dia da coleta</w:t>
+        <w:t>se possível, substituir pelos números da tela Avaliação ao final das sessões com os participantes</w:t>
       </w:r>
       <w:r>
         <w:rPr>
@@ -4291,7 +5358,7 @@
           <w:i w:val="0"/>
           <w:sz w:val="20"/>
         </w:rPr>
-        <w:t>Tabela 2 – Indicadores medidos no cenário de teste</w:t>
+        <w:t>Tabela 2 – Indicadores registrados no cenário de demonstração</w:t>
       </w:r>
     </w:p>
     <w:tbl>
@@ -4468,7 +5535,7 @@
                 <w:i w:val="0"/>
                 <w:sz w:val="20"/>
               </w:rPr>
-              <w:t>26 de 26 (100%)</w:t>
+              <w:t>26 de 26</w:t>
             </w:r>
           </w:p>
         </w:tc>
@@ -4774,7 +5841,7 @@
                 <w:i w:val="0"/>
                 <w:sz w:val="20"/>
               </w:rPr>
-              <w:t>Decisões que seguiram a recomendação</w:t>
+              <w:t>Critérios ponderados em cada decisão</w:t>
             </w:r>
           </w:p>
         </w:tc>
@@ -4800,90 +5867,7 @@
                 <w:i w:val="0"/>
                 <w:sz w:val="20"/>
               </w:rPr>
-              <w:t>83%</w:t>
-            </w:r>
-          </w:p>
-        </w:tc>
-      </w:tr>
-      <w:tr>
-        <w:trPr>
-          <w:cantSplit/>
-        </w:trPr>
-        <w:tc>
-          <w:tcPr>
-            <w:tcW w:type="dxa" w:w="1247"/>
-            <w:tcBorders>
-              <w:top w:val="nil" w:sz="6" w:color="000000"/>
-              <w:left w:val="nil" w:sz="6" w:color="000000"/>
-              <w:bottom w:val="nil" w:sz="6" w:color="000000"/>
-              <w:right w:val="nil" w:sz="6" w:color="000000"/>
-            </w:tcBorders>
-          </w:tcPr>
-          <w:p>
-            <w:pPr>
-              <w:keepNext/>
-              <w:spacing w:line="240" w:lineRule="auto" w:before="40" w:after="40"/>
-              <w:jc w:val="left"/>
-            </w:pPr>
-            <w:r>
-              <w:rPr>
-                <w:b w:val="0"/>
-                <w:i w:val="0"/>
-                <w:sz w:val="20"/>
-              </w:rPr>
-              <w:t>H3</w:t>
-            </w:r>
-          </w:p>
-        </w:tc>
-        <w:tc>
-          <w:tcPr>
-            <w:tcW w:type="dxa" w:w="5556"/>
-            <w:tcBorders>
-              <w:top w:val="nil" w:sz="6" w:color="000000"/>
-              <w:left w:val="nil" w:sz="6" w:color="000000"/>
-              <w:bottom w:val="nil" w:sz="6" w:color="000000"/>
-              <w:right w:val="nil" w:sz="6" w:color="000000"/>
-            </w:tcBorders>
-          </w:tcPr>
-          <w:p>
-            <w:pPr>
-              <w:keepNext/>
-              <w:spacing w:line="240" w:lineRule="auto" w:before="40" w:after="40"/>
-              <w:jc w:val="left"/>
-            </w:pPr>
-            <w:r>
-              <w:rPr>
-                <w:b w:val="0"/>
-                <w:i w:val="0"/>
-                <w:sz w:val="20"/>
-              </w:rPr>
-              <w:t>Escolhas diferentes da recomendação com justificativa</w:t>
-            </w:r>
-          </w:p>
-        </w:tc>
-        <w:tc>
-          <w:tcPr>
-            <w:tcW w:type="dxa" w:w="2268"/>
-            <w:tcBorders>
-              <w:top w:val="nil" w:sz="6" w:color="000000"/>
-              <w:left w:val="nil" w:sz="6" w:color="000000"/>
-              <w:bottom w:val="nil" w:sz="6" w:color="000000"/>
-              <w:right w:val="nil" w:sz="6" w:color="000000"/>
-            </w:tcBorders>
-          </w:tcPr>
-          <w:p>
-            <w:pPr>
-              <w:keepNext/>
-              <w:spacing w:line="240" w:lineRule="auto" w:before="40" w:after="40"/>
-              <w:jc w:val="center"/>
-            </w:pPr>
-            <w:r>
-              <w:rPr>
-                <w:b w:val="0"/>
-                <w:i w:val="0"/>
-                <w:sz w:val="20"/>
-              </w:rPr>
-              <w:t>1 de 1</w:t>
+              <w:t>4</w:t>
             </w:r>
           </w:p>
         </w:tc>
@@ -6468,7 +7452,7 @@
           <w:b w:val="0"/>
           <w:i w:val="0"/>
         </w:rPr>
-        <w:t>Os resultados indicam que a hipótese H1 se confirma no que depende do comprador: a identificação dos itens, o envio das cotações, a cobrança dos fornecedores e a comparação das propostas deixam de ser tarefas manuais. Isso está de acordo com Davenport (1993), para quem o ganho da tecnologia vem do redesenho do processo, e não apenas da informatização das etapas. O tempo de resposta dos fornecedores, porém, continua fora do controle do sistema, que atua sobre ele apenas com lembretes e prazo definido.</w:t>
+        <w:t>Os resultados indicam que a hipótese H1 é sustentada no que depende do comprador: a identificação dos itens, o envio das cotações, a cobrança dos fornecedores e a comparação das propostas deixam de ser tarefas manuais. Isso está de acordo com Davenport (1993), para quem o ganho da tecnologia vem do redesenho do processo, e não apenas da informatização das etapas. O tempo de resposta dos fornecedores, porém, continua fora do controle do sistema, que atua sobre ele apenas com lembretes e prazo definido. Como os tempos do processo manual foram estimados, a redução de tempo deve ser confirmada com medições em um setor de compras real.</w:t>
       </w:r>
     </w:p>
     <w:p>
@@ -6482,21 +7466,35 @@
           <w:b w:val="0"/>
           <w:i w:val="0"/>
         </w:rPr>
-        <w:t>Quanto à H2, a leitura do estoque pela API e o registro das propostas pelo próprio fornecedor eliminaram a redigitação nas etapas em que ela ocorre no processo manual. Como apontam Infante e Santos (2007), boa parte das falhas de abastecimento vem de problemas de informação entre setores, e a integração reduz justamente esse ponto. A H3 também é sustentada: cada decisão passou a considerar quatro critérios ponderados, em linha com os critérios mais citados por Dickson (1966) e por Weber, Current e Benton (1991). O fato de o comprador ter divergido da recomendação em parte dos casos, sempre com justificativa, mostra que o sistema cumpre o papel de apoio descrito por Power (2002), sem substituir o julgamento humano.</w:t>
+        <w:t xml:space="preserve">Quanto à H2, a leitura do estoque pela API e o registro das propostas pelo próprio fornecedor eliminam, por construção, a redigitação nas etapas em que ela ocorre no processo manual. Como apontam Infante e Santos (2007), boa parte das falhas de abastecimento vem de problemas de informação entre setores, e a integração reduz justamente esse ponto. A H3 também é sustentada: cada decisão passou a considerar quatro critérios ponderados, em linha com os critérios mais citados por Dickson (1966) e por Weber, Current e Benton (1991), e o exemplo da Figura 4 mostra que a proposta de menor preço nem sempre é a mais vantajosa. Ao exigir justificativa quando o comprador escolhe outra proposta, o sistema cumpre o papel de apoio descrito por Power (2002), sem substituir o julgamento humano. Em relação aos trabalhos correlatos, que aplicam a análise multicritério de forma isolada (BERNARDI </w:t>
       </w:r>
-    </w:p>
-    <w:p>
-      <w:pPr>
-        <w:spacing w:line="360" w:lineRule="auto" w:before="0" w:after="0"/>
-        <w:ind w:firstLine="567"/>
-        <w:jc w:val="both"/>
-      </w:pPr>
+      <w:r>
+        <w:rPr>
+          <w:b w:val="0"/>
+          <w:i/>
+        </w:rPr>
+        <w:t>et al.</w:t>
+      </w:r>
       <w:r>
         <w:rPr>
           <w:b w:val="0"/>
           <w:i w:val="0"/>
         </w:rPr>
-        <w:t>A H4 se confirma porque cada decisão guarda o ranking, os pesos vigentes, o responsável e a justificativa do momento da aprovação, e todas as operações e e-mails ficam registrados. Isso facilita auditorias e responde à pergunta sobre por que um fornecedor foi escolhido, algo difícil de reconstruir quando as informações estão em e-mails e planilhas.</w:t>
+        <w:t>, 2019; PARAGUASSU; MACEDO, 2013), o Provisa a incorpora ao fluxo diário de compras.</w:t>
+      </w:r>
+    </w:p>
+    <w:p>
+      <w:pPr>
+        <w:spacing w:line="360" w:lineRule="auto" w:before="0" w:after="0"/>
+        <w:ind w:firstLine="567"/>
+        <w:jc w:val="both"/>
+      </w:pPr>
+      <w:r>
+        <w:rPr>
+          <w:b w:val="0"/>
+          <w:i w:val="0"/>
+        </w:rPr>
+        <w:t>A H4 é sustentada porque cada decisão guarda o ranking, os pesos vigentes, o responsável e a justificativa do momento da aprovação, e todas as operações e e-mails ficam registrados. Isso facilita auditorias e responde à pergunta sobre por que um fornecedor foi escolhido, algo difícil de reconstruir quando as informações estão em e-mails e planilhas.</w:t>
       </w:r>
     </w:p>
     <w:p>
@@ -6525,7 +7523,7 @@
           <w:b w:val="0"/>
           <w:i w:val="0"/>
         </w:rPr>
-        <w:t>Entre as limitações, destacam-se o uso de dados fictícios e de uma API simulada, a estimativa dos tempos do processo manual e o número reduzido de participantes, o que impede generalizar os resultados. Além disso, a pontuação ponderada é sensível aos pesos escolhidos, o que foi mitigado com a simulação de pesos, mas exige que o hospital defina suas prioridades de forma consciente.</w:t>
+        <w:t>Entre as limitações, destacam-se o uso de dados fictícios e de uma API simulada, a estimativa dos tempos do processo manual, o fato de os indicadores da Tabela 2 virem de um cenário de demonstração e o número reduzido de participantes, o que impede generalizar os resultados. Além disso, a pontuação ponderada é sensível aos pesos escolhidos, o que foi mitigado com a simulação de pesos, mas exige que o hospital defina suas prioridades de forma consciente.</w:t>
       </w:r>
     </w:p>
     <w:p>
@@ -6579,7 +7577,7 @@
           <w:b w:val="0"/>
           <w:i w:val="0"/>
         </w:rPr>
-        <w:t xml:space="preserve">Nos cenários de teste, o processo manual de 13 etapas foi reduzido a quatro ações do comprador, as propostas foram registradas sem redigitação e todas as decisões ficaram rastreáveis, o que sustenta as hipóteses H1 a H4. </w:t>
+        <w:t xml:space="preserve">Nos cenários de teste, o processo manual de 13 etapas foi reduzido a quatro ações do comprador, as propostas passaram a ser registradas pelo próprio fornecedor e todas as decisões ficaram rastreáveis, o que indica que as hipóteses H1 a H4 se sustentam no ambiente simulado. </w:t>
       </w:r>
       <w:r>
         <w:rPr>
@@ -6696,6 +7694,42 @@
         <w:jc w:val="left"/>
       </w:pPr>
       <w:r>
+        <w:t xml:space="preserve">BELLI, Cesar Augusto. </w:t>
+      </w:r>
+      <w:r>
+        <w:rPr>
+          <w:b/>
+        </w:rPr>
+        <w:t>Integração web de solicitação e cotação de preços</w:t>
+      </w:r>
+      <w:r>
+        <w:t>. 2019. Trabalho de Conclusão de Curso (Bacharelado em Sistemas de Informação) – Centro de Ciências Exatas e Naturais, Universidade Regional de Blumenau, Blumenau, 2019. Disponível em: &lt;https://furb.br/dsc/arquivos/tccs/monografias/2019_2_cesar-augusto-belli_monografia.pdf&gt;. Acesso em: 19 out. 2026.</w:t>
+      </w:r>
+    </w:p>
+    <w:p>
+      <w:pPr>
+        <w:spacing w:line="240" w:lineRule="auto" w:before="0" w:after="240"/>
+        <w:jc w:val="left"/>
+      </w:pPr>
+      <w:r>
+        <w:t xml:space="preserve">BERNARDI, Ana Julia Goulardins et al. </w:t>
+      </w:r>
+      <w:r>
+        <w:rPr>
+          <w:b/>
+        </w:rPr>
+        <w:t>Aplicação de AHP-PROMETHEE como apoio à seleção de fornecedores de produtos de limpeza para uma empresa hospitalar</w:t>
+      </w:r>
+      <w:r>
+        <w:t>. 2019. Trabalho de Conclusão de Curso (Graduação) – Universidade Presbiteriana Mackenzie, São Paulo, 2019. Disponível em: &lt;https://dspace.mackenzie.br/handle/10899/29310&gt;. Acesso em: 19 out. 2026.</w:t>
+      </w:r>
+    </w:p>
+    <w:p>
+      <w:pPr>
+        <w:spacing w:line="240" w:lineRule="auto" w:before="0" w:after="240"/>
+        <w:jc w:val="left"/>
+      </w:pPr>
+      <w:r>
         <w:t xml:space="preserve">BOWERSOX, Donald J. et al. </w:t>
       </w:r>
       <w:r>
@@ -6903,7 +7937,7 @@
         <w:t>Sistemas de informação gerenciais</w:t>
       </w:r>
       <w:r>
-        <w:t>. 11. ed. São Paulo: Pearson, 2016.</w:t>
+        <w:t>. São Paulo: Pearson, 2016.</w:t>
       </w:r>
     </w:p>
     <w:p>
@@ -6922,6 +7956,24 @@
       </w:r>
       <w:r>
         <w:t>. Sebastopol: O'Reilly Media, 2015.</w:t>
+      </w:r>
+    </w:p>
+    <w:p>
+      <w:pPr>
+        <w:spacing w:line="240" w:lineRule="auto" w:before="0" w:after="240"/>
+        <w:jc w:val="left"/>
+      </w:pPr>
+      <w:r>
+        <w:t xml:space="preserve">PARAGUASSU, Deyves Mendes; MACEDO, Marcelo Alvaro da Silva. Seleção de fornecedores no setor público: um estudo de caso em Bio-Manguinhos/Fiocruz. </w:t>
+      </w:r>
+      <w:r>
+        <w:rPr>
+          <w:b/>
+        </w:rPr>
+        <w:t>Revista Ciências Administrativas</w:t>
+      </w:r>
+      <w:r>
+        <w:t>, Fortaleza, v. 19, n. 2, p. 666-697, 2013.</w:t>
       </w:r>
     </w:p>
     <w:p>

</xml_diff>

<commit_message>
Artigo: resumo e abstract dentro do limite de 250 palavras
Co-Authored-By: Claude Opus 5.5 (1M context) <noreply@anthropic.com>
Claude-Session: https://claude.ai/code/session_013Ez8WdXVGnAz1jp93VScRd
</commit_message>
<xml_diff>
--- a/docs/artigo/artigo-TCC-provisa.docx
+++ b/docs/artigo/artigo-TCC-provisa.docx
@@ -101,7 +101,7 @@
           <w:b w:val="0"/>
           <w:i w:val="0"/>
         </w:rPr>
-        <w:t xml:space="preserve">A gestão de compras em hospitais precisa garantir que medicamentos, materiais e insumos estejam disponíveis no momento certo, porém em muitas instituições a identificação de itens abaixo do estoque mínimo, a solicitação de cotações e a comparação de propostas ainda dependem de planilhas, e-mails e telefonemas. Este trabalho teve como objetivo desenvolver e avaliar o Provisa, um sistema web de apoio à decisão que consulta o estoque por meio de uma Interface de Programação de Aplicações (API), envia automaticamente os pedidos de cotação aos fornecedores e classifica as propostas por uma pontuação ponderada de preço, prazo de entrega, disponibilidade e histórico do fornecedor, mantendo a decisão final com o comprador. A pesquisa, de natureza aplicada, exploratória e descritiva e com abordagem qualitativa e quantitativa, consistiu no desenvolvimento de um protótipo funcional com Next.js, TypeScript e PostgreSQL, testado em um cenário simulado de hospital com nove setores, e na avaliação da aceitação pelos usuários com um questionário baseado no Modelo de Aceitação de Tecnologia (TAM). Nos cenários de teste, as 13 etapas do processo manual foram reduzidas a quatro ações do comprador, as propostas passaram a ser registradas pelo próprio fornecedor e todas as decisões ficaram rastreáveis, com ranking, pesos, responsável e justificativa armazenados. </w:t>
+        <w:t xml:space="preserve">A gestão de compras hospitalar precisa garantir que medicamentos, materiais e insumos estejam disponíveis no momento certo, porém em muitas instituições a identificação de itens abaixo do estoque mínimo, a solicitação de cotações e a comparação de propostas ainda dependem de planilhas, e-mails e telefonemas. Este trabalho teve como objetivo desenvolver e avaliar o Provisa, um sistema web de apoio à decisão que consulta o estoque por meio de uma Interface de Programação de Aplicações (API), envia automaticamente os pedidos de cotação aos fornecedores e classifica as propostas por pontuação ponderada de preço, prazo, disponibilidade e histórico do fornecedor, mantendo a decisão final com o comprador. A pesquisa é aplicada, exploratória e descritiva, com abordagem qualitativa e quantitativa, e consistiu no desenvolvimento de um protótipo funcional, testado em um cenário simulado de hospital, e na avaliação da aceitação com um questionário baseado no Modelo de Aceitação de Tecnologia (TAM). Nos testes, as 13 etapas do processo manual foram reduzidas a quatro ações do comprador, as propostas passaram a ser registradas pelo próprio fornecedor e todas as decisões ficaram rastreáveis. </w:t>
       </w:r>
       <w:r>
         <w:rPr>
@@ -109,14 +109,14 @@
           <w:i w:val="0"/>
           <w:highlight w:val="yellow"/>
         </w:rPr>
-        <w:t>Inserir aqui as médias de utilidade e de facilidade de uso percebidas obtidas no questionário.</w:t>
+        <w:t>Inserir as médias de utilidade e de facilidade de uso percebidas.</w:t>
       </w:r>
       <w:r>
         <w:rPr>
           <w:b w:val="0"/>
           <w:i w:val="0"/>
         </w:rPr>
-        <w:t xml:space="preserve"> Os resultados indicam que a integração com o estoque, a automação das cotações e a comparação por múltiplos critérios tornam o processo de compras mais ágil, padronizado e transparente, sem substituir o julgamento do gestor.</w:t>
+        <w:t xml:space="preserve"> Os resultados indicam que a integração com o estoque, a automação das cotações e a comparação por múltiplos critérios tornam o processo de compras mais ágil, padronizado e transparente, sem substituir o julgamento do comprador.</w:t>
       </w:r>
     </w:p>
     <w:p>
@@ -180,7 +180,7 @@
           <w:b w:val="0"/>
           <w:i w:val="0"/>
         </w:rPr>
-        <w:t xml:space="preserve">Hospital purchasing must ensure that drugs, medical supplies and other materials are available at the right time, yet in many institutions the detection of items below minimum stock, the request for quotations and the comparison of bids still rely on spreadsheets, e-mails and phone calls. This work aimed to develop and evaluate Provisa, a web-based decision support system that reads stock levels through an Application Programming Interface (API), automatically sends requests for quotation to suppliers and ranks the bids by a weighted score of price, delivery time, availability and supplier history, while the final decision remains with the buyer. The research is applied, exploratory and descriptive, with a qualitative and quantitative approach. It consisted of building a functional prototype with Next.js, TypeScript and PostgreSQL, tested in a simulated hospital scenario with nine departments, and of assessing user acceptance with a questionnaire based on the Technology Acceptance Model (TAM). In the test scenarios, the 13 steps of the manual process were reduced to four actions by the buyer, bids were entered by the suppliers themselves and every decision became traceable, with ranking, weights, person in charge and justification stored. </w:t>
+        <w:t xml:space="preserve">Hospital purchasing must ensure that drugs, medical supplies and other materials are available at the right time, yet in many institutions the detection of items below minimum stock, the request for quotations and the comparison of bids still rely on spreadsheets, e-mails and phone calls. This work aimed to develop and evaluate Provisa, a web-based decision support system that reads stock levels through an Application Programming Interface (API), automatically sends requests for quotation to suppliers and ranks the bids by a weighted score of price, delivery time, availability and supplier history, while the final decision remains with the buyer. The research is applied, exploratory and descriptive, with a qualitative and quantitative approach. It consisted of building a functional prototype, tested in a simulated hospital scenario, and of assessing user acceptance with a questionnaire based on the Technology Acceptance Model (TAM). In the tests, the 13 steps of the manual process were reduced to four actions by the buyer, bids were entered by the suppliers themselves and every decision became traceable. </w:t>
       </w:r>
       <w:r>
         <w:rPr>
@@ -195,7 +195,7 @@
           <w:b w:val="0"/>
           <w:i w:val="0"/>
         </w:rPr>
-        <w:t xml:space="preserve"> The results suggest that stock integration, quotation automation and multi-criteria comparison make the purchasing process faster, standardized and transparent, without replacing the manager's judgment.</w:t>
+        <w:t xml:space="preserve"> The results suggest that stock integration, quotation automation and multi-criteria comparison make the purchasing process faster, more standardized and more transparent, without replacing the buyer's judgment.</w:t>
       </w:r>
     </w:p>
     <w:p>
@@ -213,7 +213,7 @@
         <w:rPr>
           <w:b/>
         </w:rPr>
-        <w:t xml:space="preserve">Keywords: </w:t>
+        <w:t xml:space="preserve">Key-Words: </w:t>
       </w:r>
       <w:r>
         <w:rPr>

</xml_diff>

<commit_message>
Artigo: revisão completa conforme o manual da UNESC
Co-Authored-By: Claude Opus 5.5 (1M context) <noreply@anthropic.com>
Claude-Session: https://claude.ai/code/session_013Ez8WdXVGnAz1jp93VScRd
</commit_message>
<xml_diff>
--- a/docs/artigo/artigo-TCC-provisa.docx
+++ b/docs/artigo/artigo-TCC-provisa.docx
@@ -134,7 +134,7 @@
         <w:rPr>
           <w:b/>
         </w:rPr>
-        <w:t xml:space="preserve">Palavras-chave: </w:t>
+        <w:t xml:space="preserve">Palavras-Chave: </w:t>
       </w:r>
       <w:r>
         <w:rPr>
@@ -225,6 +225,12 @@
     </w:p>
     <w:p>
       <w:pPr>
+        <w:spacing w:line="360" w:lineRule="auto" w:before="0" w:after="0"/>
+        <w:jc w:val="both"/>
+      </w:pPr>
+    </w:p>
+    <w:p>
+      <w:pPr>
         <w:keepNext/>
         <w:spacing w:line="360" w:lineRule="auto" w:before="0" w:after="0"/>
         <w:jc w:val="left"/>
@@ -506,7 +512,7 @@
           <w:b w:val="0"/>
           <w:i w:val="0"/>
         </w:rPr>
-        <w:t>A escolha de fornecedores é um problema de decisão com múltiplos critérios. Em um estudo clássico, Dickson (1966) identificou 23 critérios usados por compradores, entre os quais se destacaram a qualidade, a entrega no prazo, o histórico de desempenho e o preço. Weber, Current e Benton (1991), ao revisarem 74 artigos sobre o tema, confirmaram que preço, entrega e qualidade são os critérios mais citados e que métodos de ponderação linear estão entre os mais utilizados, por serem simples de calcular e de explicar ao decisor.</w:t>
+        <w:t>A escolha de fornecedores é um problema de decisão com múltiplos critérios. Em um estudo clássico, Dickson (1966) identificou 23 critérios usados por compradores, entre os quais a qualidade, a entrega no prazo e o histórico de desempenho foram considerados os mais importantes, com o preço também entre os de maior peso. Weber, Current e Benton (1991), ao revisarem 74 artigos sobre o tema, confirmaram que preço, entrega e qualidade são os critérios mais citados e que métodos de ponderação linear estão entre os mais utilizados, por serem simples de calcular e de explicar ao decisor.</w:t>
       </w:r>
     </w:p>
     <w:p>
@@ -2937,7 +2943,7 @@
           <w:b w:val="0"/>
           <w:i w:val="0"/>
         </w:rPr>
-        <w:t>a) preço: custo dos itens cotados pelo menor preço encontrado para cada item, dividido pelo custo da proposta;</w:t>
+        <w:t>A) preço: custo dos itens cotados pelo menor preço encontrado para cada item, dividido pelo custo da proposta;</w:t>
       </w:r>
     </w:p>
     <w:p>
@@ -2951,7 +2957,7 @@
           <w:b w:val="0"/>
           <w:i w:val="0"/>
         </w:rPr>
-        <w:t>b) prazo: menor prazo de entrega da cotação dividido pelo prazo da proposta;</w:t>
+        <w:t>B) prazo: menor prazo de entrega da cotação dividido pelo prazo da proposta;</w:t>
       </w:r>
     </w:p>
     <w:p>
@@ -2965,7 +2971,7 @@
           <w:b w:val="0"/>
           <w:i w:val="0"/>
         </w:rPr>
-        <w:t>c) disponibilidade: média, por item, da quantidade disponível dividida pela quantidade necessária, limitada a 1, sendo que o item não cotado vale zero; e</w:t>
+        <w:t>C) disponibilidade: média, por item, da quantidade disponível dividida pela quantidade necessária, limitada a 1, sendo que o item não cotado vale zero; e</w:t>
       </w:r>
     </w:p>
     <w:p>
@@ -2979,7 +2985,7 @@
           <w:b w:val="0"/>
           <w:i w:val="0"/>
         </w:rPr>
-        <w:t>d) histórico: nota do fornecedor, de 0 a 5, dividida por 5.</w:t>
+        <w:t>D) histórico: nota do fornecedor, de 0 a 5, dividida por 5.</w:t>
       </w:r>
     </w:p>
     <w:p>
@@ -3033,7 +3039,7 @@
           <w:b w:val="0"/>
           <w:i w:val="0"/>
         </w:rPr>
-        <w:t xml:space="preserve">A avaliação foi feita de duas formas. Na primeira, comparou-se o processo manual com o automatizado, organizando os indicadores pelas hipóteses H1 a H4: número de etapas, tempo das atividades do comprador, propostas registradas sem digitação, leituras do estoque pela API e decisões com histórico completo. Os indicadores do processo automatizado foram medidos nos próprios registros do sistema, e os tempos do processo manual foram estimados para um ciclo típico de compra </w:t>
+        <w:t xml:space="preserve">A avaliação foi feita de duas formas. Na primeira, comparou-se o processo manual com o automatizado, organizando os indicadores pelas hipóteses H1 a H4: número de etapas, tempo das atividades do comprador, propostas registradas sem digitação, leituras do estoque pela API e decisões com histórico completo. Os indicadores do processo automatizado foram medidos nos próprios registros do sistema, e os tempos do processo manual foram estimados para um ciclo típico de compra. </w:t>
       </w:r>
       <w:r>
         <w:rPr>
@@ -3041,14 +3047,7 @@
           <w:i w:val="0"/>
           <w:highlight w:val="yellow"/>
         </w:rPr>
-        <w:t>substituir pelos tempos informados pelo setor de compras, se forem levantados</w:t>
-      </w:r>
-      <w:r>
-        <w:rPr>
-          <w:b w:val="0"/>
-          <w:i w:val="0"/>
-        </w:rPr>
-        <w:t>.</w:t>
+        <w:t>Se possível, substituir pelos tempos informados pelo setor de compras de um hospital.</w:t>
       </w:r>
     </w:p>
     <w:p>
@@ -5328,7 +5327,7 @@
           <w:b w:val="0"/>
           <w:i w:val="0"/>
         </w:rPr>
-        <w:t xml:space="preserve">A Tabela 2 apresenta os indicadores registrados pelo sistema no cenário de demonstração, organizados pelas hipóteses. Como nesse cenário as propostas foram simuladas e as decisões foram tomadas pelo pesquisador durante os testes, os números mostram que o sistema registra e rastreia cada etapa, e não o comportamento de usuários reais </w:t>
+        <w:t xml:space="preserve">A Tabela 2 apresenta os indicadores registrados pelo sistema no cenário de demonstração, organizados pelas hipóteses. Como nesse cenário as propostas foram simuladas e as decisões foram tomadas pelo pesquisador durante os testes, os números mostram que o sistema registra e rastreia cada etapa, e não o comportamento de usuários reais. </w:t>
       </w:r>
       <w:r>
         <w:rPr>
@@ -5336,14 +5335,7 @@
           <w:i w:val="0"/>
           <w:highlight w:val="yellow"/>
         </w:rPr>
-        <w:t>se possível, substituir pelos números da tela Avaliação ao final das sessões com os participantes</w:t>
-      </w:r>
-      <w:r>
-        <w:rPr>
-          <w:b w:val="0"/>
-          <w:i w:val="0"/>
-        </w:rPr>
-        <w:t>.</w:t>
+        <w:t>Se possível, substituir pelos números da tela Avaliação ao final das sessões com os participantes.</w:t>
       </w:r>
     </w:p>
     <w:p>
@@ -6285,12 +6277,12 @@
         <w:tblLayout w:type="fixed"/>
       </w:tblPr>
       <w:tblGrid>
-        <w:gridCol w:w="3175"/>
-        <w:gridCol w:w="793"/>
-        <w:gridCol w:w="1020"/>
-        <w:gridCol w:w="1360"/>
-        <w:gridCol w:w="1360"/>
-        <w:gridCol w:w="1360"/>
+        <w:gridCol w:w="2835"/>
+        <w:gridCol w:w="680"/>
+        <w:gridCol w:w="850"/>
+        <w:gridCol w:w="1304"/>
+        <w:gridCol w:w="1701"/>
+        <w:gridCol w:w="1701"/>
       </w:tblGrid>
       <w:tr>
         <w:trPr>
@@ -6298,7 +6290,7 @@
         </w:trPr>
         <w:tc>
           <w:tcPr>
-            <w:tcW w:type="dxa" w:w="3175"/>
+            <w:tcW w:type="dxa" w:w="2835"/>
             <w:tcBorders>
               <w:top w:val="single" w:sz="6" w:color="000000"/>
               <w:left w:val="nil" w:sz="6" w:color="000000"/>
@@ -6324,7 +6316,7 @@
         </w:tc>
         <w:tc>
           <w:tcPr>
-            <w:tcW w:type="dxa" w:w="794"/>
+            <w:tcW w:type="dxa" w:w="680"/>
             <w:tcBorders>
               <w:top w:val="single" w:sz="6" w:color="000000"/>
               <w:left w:val="nil" w:sz="6" w:color="000000"/>
@@ -6350,7 +6342,7 @@
         </w:tc>
         <w:tc>
           <w:tcPr>
-            <w:tcW w:type="dxa" w:w="1020"/>
+            <w:tcW w:type="dxa" w:w="850"/>
             <w:tcBorders>
               <w:top w:val="single" w:sz="6" w:color="000000"/>
               <w:left w:val="nil" w:sz="6" w:color="000000"/>
@@ -6376,7 +6368,7 @@
         </w:tc>
         <w:tc>
           <w:tcPr>
-            <w:tcW w:type="dxa" w:w="1361"/>
+            <w:tcW w:type="dxa" w:w="1304"/>
             <w:tcBorders>
               <w:top w:val="single" w:sz="6" w:color="000000"/>
               <w:left w:val="nil" w:sz="6" w:color="000000"/>
@@ -6402,7 +6394,7 @@
         </w:tc>
         <w:tc>
           <w:tcPr>
-            <w:tcW w:type="dxa" w:w="1361"/>
+            <w:tcW w:type="dxa" w:w="1701"/>
             <w:tcBorders>
               <w:top w:val="single" w:sz="6" w:color="000000"/>
               <w:left w:val="nil" w:sz="6" w:color="000000"/>
@@ -6428,7 +6420,7 @@
         </w:tc>
         <w:tc>
           <w:tcPr>
-            <w:tcW w:type="dxa" w:w="1361"/>
+            <w:tcW w:type="dxa" w:w="1701"/>
             <w:tcBorders>
               <w:top w:val="single" w:sz="6" w:color="000000"/>
               <w:left w:val="nil" w:sz="6" w:color="000000"/>
@@ -6459,7 +6451,7 @@
         </w:trPr>
         <w:tc>
           <w:tcPr>
-            <w:tcW w:type="dxa" w:w="3175"/>
+            <w:tcW w:type="dxa" w:w="2835"/>
             <w:tcBorders>
               <w:top w:val="nil" w:sz="6" w:color="000000"/>
               <w:left w:val="nil" w:sz="6" w:color="000000"/>
@@ -6485,7 +6477,7 @@
         </w:tc>
         <w:tc>
           <w:tcPr>
-            <w:tcW w:type="dxa" w:w="794"/>
+            <w:tcW w:type="dxa" w:w="680"/>
             <w:tcBorders>
               <w:top w:val="nil" w:sz="6" w:color="000000"/>
               <w:left w:val="nil" w:sz="6" w:color="000000"/>
@@ -6511,7 +6503,7 @@
         </w:tc>
         <w:tc>
           <w:tcPr>
-            <w:tcW w:type="dxa" w:w="1020"/>
+            <w:tcW w:type="dxa" w:w="850"/>
             <w:tcBorders>
               <w:top w:val="nil" w:sz="6" w:color="000000"/>
               <w:left w:val="nil" w:sz="6" w:color="000000"/>
@@ -6538,7 +6530,7 @@
         </w:tc>
         <w:tc>
           <w:tcPr>
-            <w:tcW w:type="dxa" w:w="1361"/>
+            <w:tcW w:type="dxa" w:w="1304"/>
             <w:tcBorders>
               <w:top w:val="nil" w:sz="6" w:color="000000"/>
               <w:left w:val="nil" w:sz="6" w:color="000000"/>
@@ -6565,7 +6557,7 @@
         </w:tc>
         <w:tc>
           <w:tcPr>
-            <w:tcW w:type="dxa" w:w="1361"/>
+            <w:tcW w:type="dxa" w:w="1701"/>
             <w:tcBorders>
               <w:top w:val="nil" w:sz="6" w:color="000000"/>
               <w:left w:val="nil" w:sz="6" w:color="000000"/>
@@ -6592,7 +6584,7 @@
         </w:tc>
         <w:tc>
           <w:tcPr>
-            <w:tcW w:type="dxa" w:w="1361"/>
+            <w:tcW w:type="dxa" w:w="1701"/>
             <w:tcBorders>
               <w:top w:val="nil" w:sz="6" w:color="000000"/>
               <w:left w:val="nil" w:sz="6" w:color="000000"/>
@@ -6624,7 +6616,7 @@
         </w:trPr>
         <w:tc>
           <w:tcPr>
-            <w:tcW w:type="dxa" w:w="3175"/>
+            <w:tcW w:type="dxa" w:w="2835"/>
             <w:tcBorders>
               <w:top w:val="nil" w:sz="6" w:color="000000"/>
               <w:left w:val="nil" w:sz="6" w:color="000000"/>
@@ -6650,7 +6642,7 @@
         </w:tc>
         <w:tc>
           <w:tcPr>
-            <w:tcW w:type="dxa" w:w="794"/>
+            <w:tcW w:type="dxa" w:w="680"/>
             <w:tcBorders>
               <w:top w:val="nil" w:sz="6" w:color="000000"/>
               <w:left w:val="nil" w:sz="6" w:color="000000"/>
@@ -6676,7 +6668,7 @@
         </w:tc>
         <w:tc>
           <w:tcPr>
-            <w:tcW w:type="dxa" w:w="1020"/>
+            <w:tcW w:type="dxa" w:w="850"/>
             <w:tcBorders>
               <w:top w:val="nil" w:sz="6" w:color="000000"/>
               <w:left w:val="nil" w:sz="6" w:color="000000"/>
@@ -6703,7 +6695,7 @@
         </w:tc>
         <w:tc>
           <w:tcPr>
-            <w:tcW w:type="dxa" w:w="1361"/>
+            <w:tcW w:type="dxa" w:w="1304"/>
             <w:tcBorders>
               <w:top w:val="nil" w:sz="6" w:color="000000"/>
               <w:left w:val="nil" w:sz="6" w:color="000000"/>
@@ -6730,7 +6722,7 @@
         </w:tc>
         <w:tc>
           <w:tcPr>
-            <w:tcW w:type="dxa" w:w="1361"/>
+            <w:tcW w:type="dxa" w:w="1701"/>
             <w:tcBorders>
               <w:top w:val="nil" w:sz="6" w:color="000000"/>
               <w:left w:val="nil" w:sz="6" w:color="000000"/>
@@ -6757,7 +6749,7 @@
         </w:tc>
         <w:tc>
           <w:tcPr>
-            <w:tcW w:type="dxa" w:w="1361"/>
+            <w:tcW w:type="dxa" w:w="1701"/>
             <w:tcBorders>
               <w:top w:val="nil" w:sz="6" w:color="000000"/>
               <w:left w:val="nil" w:sz="6" w:color="000000"/>
@@ -6789,7 +6781,7 @@
         </w:trPr>
         <w:tc>
           <w:tcPr>
-            <w:tcW w:type="dxa" w:w="3175"/>
+            <w:tcW w:type="dxa" w:w="2835"/>
             <w:tcBorders>
               <w:top w:val="nil" w:sz="6" w:color="000000"/>
               <w:left w:val="nil" w:sz="6" w:color="000000"/>
@@ -6815,7 +6807,7 @@
         </w:tc>
         <w:tc>
           <w:tcPr>
-            <w:tcW w:type="dxa" w:w="794"/>
+            <w:tcW w:type="dxa" w:w="680"/>
             <w:tcBorders>
               <w:top w:val="nil" w:sz="6" w:color="000000"/>
               <w:left w:val="nil" w:sz="6" w:color="000000"/>
@@ -6841,7 +6833,7 @@
         </w:tc>
         <w:tc>
           <w:tcPr>
-            <w:tcW w:type="dxa" w:w="1020"/>
+            <w:tcW w:type="dxa" w:w="850"/>
             <w:tcBorders>
               <w:top w:val="nil" w:sz="6" w:color="000000"/>
               <w:left w:val="nil" w:sz="6" w:color="000000"/>
@@ -6868,7 +6860,7 @@
         </w:tc>
         <w:tc>
           <w:tcPr>
-            <w:tcW w:type="dxa" w:w="1361"/>
+            <w:tcW w:type="dxa" w:w="1304"/>
             <w:tcBorders>
               <w:top w:val="nil" w:sz="6" w:color="000000"/>
               <w:left w:val="nil" w:sz="6" w:color="000000"/>
@@ -6895,7 +6887,7 @@
         </w:tc>
         <w:tc>
           <w:tcPr>
-            <w:tcW w:type="dxa" w:w="1361"/>
+            <w:tcW w:type="dxa" w:w="1701"/>
             <w:tcBorders>
               <w:top w:val="nil" w:sz="6" w:color="000000"/>
               <w:left w:val="nil" w:sz="6" w:color="000000"/>
@@ -6922,7 +6914,7 @@
         </w:tc>
         <w:tc>
           <w:tcPr>
-            <w:tcW w:type="dxa" w:w="1361"/>
+            <w:tcW w:type="dxa" w:w="1701"/>
             <w:tcBorders>
               <w:top w:val="nil" w:sz="6" w:color="000000"/>
               <w:left w:val="nil" w:sz="6" w:color="000000"/>
@@ -6954,7 +6946,7 @@
         </w:trPr>
         <w:tc>
           <w:tcPr>
-            <w:tcW w:type="dxa" w:w="3175"/>
+            <w:tcW w:type="dxa" w:w="2835"/>
             <w:tcBorders>
               <w:top w:val="nil" w:sz="6" w:color="000000"/>
               <w:left w:val="nil" w:sz="6" w:color="000000"/>
@@ -6979,7 +6971,7 @@
         </w:tc>
         <w:tc>
           <w:tcPr>
-            <w:tcW w:type="dxa" w:w="794"/>
+            <w:tcW w:type="dxa" w:w="680"/>
             <w:tcBorders>
               <w:top w:val="nil" w:sz="6" w:color="000000"/>
               <w:left w:val="nil" w:sz="6" w:color="000000"/>
@@ -7004,7 +6996,7 @@
         </w:tc>
         <w:tc>
           <w:tcPr>
-            <w:tcW w:type="dxa" w:w="1020"/>
+            <w:tcW w:type="dxa" w:w="850"/>
             <w:tcBorders>
               <w:top w:val="nil" w:sz="6" w:color="000000"/>
               <w:left w:val="nil" w:sz="6" w:color="000000"/>
@@ -7030,7 +7022,7 @@
         </w:tc>
         <w:tc>
           <w:tcPr>
-            <w:tcW w:type="dxa" w:w="1361"/>
+            <w:tcW w:type="dxa" w:w="1304"/>
             <w:tcBorders>
               <w:top w:val="nil" w:sz="6" w:color="000000"/>
               <w:left w:val="nil" w:sz="6" w:color="000000"/>
@@ -7056,7 +7048,7 @@
         </w:tc>
         <w:tc>
           <w:tcPr>
-            <w:tcW w:type="dxa" w:w="1361"/>
+            <w:tcW w:type="dxa" w:w="1701"/>
             <w:tcBorders>
               <w:top w:val="nil" w:sz="6" w:color="000000"/>
               <w:left w:val="nil" w:sz="6" w:color="000000"/>
@@ -7082,7 +7074,7 @@
         </w:tc>
         <w:tc>
           <w:tcPr>
-            <w:tcW w:type="dxa" w:w="1361"/>
+            <w:tcW w:type="dxa" w:w="1701"/>
             <w:tcBorders>
               <w:top w:val="nil" w:sz="6" w:color="000000"/>
               <w:left w:val="nil" w:sz="6" w:color="000000"/>
@@ -7645,9 +7637,8 @@
         <w:rPr>
           <w:b w:val="0"/>
           <w:i w:val="0"/>
-          <w:highlight w:val="yellow"/>
         </w:rPr>
-        <w:t>Opcional. Agradecer ao orientador, aos participantes da pesquisa, à família e a quem contribuiu com o trabalho.</w:t>
+        <w:t>Ao professor orientador Állan Stieg, pela orientação e pelas contribuições ao longo do trabalho; aos profissionais que participaram da avaliação do sistema; e à família, pelo apoio durante o curso.</w:t>
       </w:r>
     </w:p>
     <w:p>

</xml_diff>

<commit_message>
Artigo: nome completo do orientador
Co-Authored-By: Claude Opus 5.5 (1M context) <noreply@anthropic.com>
Claude-Session: https://claude.ai/code/session_013Ez8WdXVGnAz1jp93VScRd
</commit_message>
<xml_diff>
--- a/docs/artigo/artigo-TCC-provisa.docx
+++ b/docs/artigo/artigo-TCC-provisa.docx
@@ -50,7 +50,7 @@
           <w:b w:val="0"/>
           <w:i w:val="0"/>
         </w:rPr>
-        <w:t>Állan Stieg</w:t>
+        <w:t>Allan Stieg Candeia</w:t>
       </w:r>
       <w:r>
         <w:rPr>
@@ -7638,7 +7638,7 @@
           <w:b w:val="0"/>
           <w:i w:val="0"/>
         </w:rPr>
-        <w:t>Ao professor orientador Állan Stieg, pela orientação e pelas contribuições ao longo do trabalho; aos profissionais que participaram da avaliação do sistema; e à família, pelo apoio durante o curso.</w:t>
+        <w:t>Ao professor orientador Allan Stieg Candeia, pela orientação e pelas contribuições ao longo do trabalho; aos profissionais que participaram da avaliação do sistema; e à família, pelo apoio durante o curso.</w:t>
       </w:r>
     </w:p>
     <w:p>

</xml_diff>

<commit_message>
Artigo no formato do Guia Rápido de Artigos Científicos UNESC 2025
Co-Authored-By: Claude Opus 5.5 (1M context) <noreply@anthropic.com>
Claude-Session: https://claude.ai/code/session_013Ez8WdXVGnAz1jp93VScRd
</commit_message>
<xml_diff>
--- a/docs/artigo/artigo-TCC-provisa.docx
+++ b/docs/artigo/artigo-TCC-provisa.docx
@@ -11,6 +11,7 @@
         <w:rPr>
           <w:b/>
           <w:i w:val="0"/>
+          <w:sz w:val="28"/>
         </w:rPr>
         <w:t>SISTEMA WEB DE APOIO À DECISÃO NA GESTÃO DE COMPRAS COM INTEGRAÇÃO VIA API E AUTOMAÇÃO DE COTAÇÕES: UMA APLICAÇÃO EM COMPRAS HOSPITALARES</w:t>
       </w:r>
@@ -141,7 +142,7 @@
           <w:b w:val="0"/>
           <w:i w:val="0"/>
         </w:rPr>
-        <w:t>Sistemas de apoio à decisão, Gestão de compras, Compras hospitalares, Integração via API, Modelo de Aceitação de Tecnologia.</w:t>
+        <w:t>Sistemas de apoio à decisão; Gestão de compras; Compras hospitalares; Integração via API; Modelo de Aceitação de Tecnologia.</w:t>
       </w:r>
     </w:p>
     <w:p>
@@ -213,14 +214,14 @@
         <w:rPr>
           <w:b/>
         </w:rPr>
-        <w:t xml:space="preserve">Key-Words: </w:t>
+        <w:t xml:space="preserve">Keywords: </w:t>
       </w:r>
       <w:r>
         <w:rPr>
           <w:b w:val="0"/>
           <w:i w:val="0"/>
         </w:rPr>
-        <w:t>Decision support systems, Purchasing management, Hospital procurement, API integration, Technology Acceptance Model.</w:t>
+        <w:t>Decision support systems; Purchasing management; Hospital procurement; API integration; Technology Acceptance Model.</w:t>
       </w:r>
     </w:p>
     <w:p>
@@ -239,7 +240,7 @@
         <w:rPr>
           <w:b/>
         </w:rPr>
-        <w:t>INTRODUÇÃO</w:t>
+        <w:t>1 INTRODUÇÃO</w:t>
       </w:r>
     </w:p>
     <w:p>
@@ -252,7 +253,7 @@
     <w:p>
       <w:pPr>
         <w:spacing w:line="360" w:lineRule="auto" w:before="0" w:after="0"/>
-        <w:ind w:firstLine="567"/>
+        <w:ind w:firstLine="709"/>
         <w:jc w:val="both"/>
       </w:pPr>
       <w:r>
@@ -266,7 +267,7 @@
     <w:p>
       <w:pPr>
         <w:spacing w:line="360" w:lineRule="auto" w:before="0" w:after="0"/>
-        <w:ind w:firstLine="567"/>
+        <w:ind w:firstLine="709"/>
         <w:jc w:val="both"/>
       </w:pPr>
       <w:r>
@@ -280,7 +281,7 @@
     <w:p>
       <w:pPr>
         <w:spacing w:line="360" w:lineRule="auto" w:before="0" w:after="0"/>
-        <w:ind w:firstLine="567"/>
+        <w:ind w:firstLine="709"/>
         <w:jc w:val="both"/>
       </w:pPr>
       <w:r>
@@ -294,7 +295,7 @@
     <w:p>
       <w:pPr>
         <w:spacing w:line="360" w:lineRule="auto" w:before="0" w:after="0"/>
-        <w:ind w:firstLine="567"/>
+        <w:ind w:firstLine="709"/>
         <w:jc w:val="both"/>
       </w:pPr>
       <w:r>
@@ -308,7 +309,7 @@
     <w:p>
       <w:pPr>
         <w:spacing w:line="360" w:lineRule="auto" w:before="0" w:after="0"/>
-        <w:ind w:firstLine="567"/>
+        <w:ind w:firstLine="709"/>
         <w:jc w:val="both"/>
       </w:pPr>
       <w:r>
@@ -316,7 +317,7 @@
           <w:b w:val="0"/>
           <w:i w:val="0"/>
         </w:rPr>
-        <w:t>A relevância do trabalho está em aplicar conceitos de sistemas de informação, integração entre sistemas, automação de processos e apoio à decisão a um problema recorrente das instituições de saúde. Do ponto de vista prático, a solução busca reduzir tarefas repetitivas do comprador, diminuir a chance de ruptura de estoque e deixar registrada a justificativa de cada compra, o que favorece auditorias e prestação de contas. Do ponto de vista acadêmico, o trabalho mostra como um algoritmo de pontuação ponderada pode ser usado como apoio, e não como substituto, da decisão humana. O artigo está organizado em revisão de literatura, que inclui os trabalhos correlatos, materiais e métodos, resultados, discussão e conclusão.</w:t>
+        <w:t>A relevância do trabalho está em aplicar conceitos de sistemas de informação, integração entre sistemas, automação de processos e apoio à decisão a um problema recorrente das instituições de saúde. Do ponto de vista prático, a solução busca reduzir tarefas repetitivas do comprador, diminuir a chance de ruptura de estoque e deixar registrada a justificativa de cada compra, o que favorece auditorias e prestação de contas. Do ponto de vista acadêmico, o trabalho mostra como um algoritmo de pontuação ponderada pode ser usado como apoio, e não como substituto, da decisão humana. Além desta introdução, o artigo apresenta a revisão de literatura, que inclui os trabalhos correlatos (seção 2), os materiais e métodos (seção 3), os resultados e a discussão (seção 4) e a conclusão.</w:t>
       </w:r>
     </w:p>
     <w:p>
@@ -335,7 +336,7 @@
         <w:rPr>
           <w:b/>
         </w:rPr>
-        <w:t>1 REVISÃO DE LITERATURA</w:t>
+        <w:t>2 REVISÃO DE LITERATURA</w:t>
       </w:r>
     </w:p>
     <w:p>
@@ -355,7 +356,7 @@
         <w:rPr>
           <w:b w:val="0"/>
         </w:rPr>
-        <w:t>1.1 GESTÃO DE COMPRAS E SUPRIMENTOS HOSPITALARES</w:t>
+        <w:t>2.1 GESTÃO DE COMPRAS E SUPRIMENTOS HOSPITALARES</w:t>
       </w:r>
     </w:p>
     <w:p>
@@ -368,7 +369,7 @@
     <w:p>
       <w:pPr>
         <w:spacing w:line="360" w:lineRule="auto" w:before="0" w:after="0"/>
-        <w:ind w:firstLine="567"/>
+        <w:ind w:firstLine="709"/>
         <w:jc w:val="both"/>
       </w:pPr>
       <w:r>
@@ -396,7 +397,7 @@
     <w:p>
       <w:pPr>
         <w:spacing w:line="360" w:lineRule="auto" w:before="0" w:after="0"/>
-        <w:ind w:firstLine="567"/>
+        <w:ind w:firstLine="709"/>
         <w:jc w:val="both"/>
       </w:pPr>
       <w:r>
@@ -410,7 +411,7 @@
     <w:p>
       <w:pPr>
         <w:spacing w:line="360" w:lineRule="auto" w:before="0" w:after="0"/>
-        <w:ind w:firstLine="567"/>
+        <w:ind w:firstLine="709"/>
         <w:jc w:val="both"/>
       </w:pPr>
       <w:r>
@@ -437,7 +438,7 @@
         <w:rPr>
           <w:b w:val="0"/>
         </w:rPr>
-        <w:t>1.2 SISTEMAS DE INFORMAÇÃO E SISTEMAS DE APOIO À DECISÃO</w:t>
+        <w:t>2.2 SISTEMAS DE INFORMAÇÃO E SISTEMAS DE APOIO À DECISÃO</w:t>
       </w:r>
     </w:p>
     <w:p>
@@ -450,7 +451,7 @@
     <w:p>
       <w:pPr>
         <w:spacing w:line="360" w:lineRule="auto" w:before="0" w:after="0"/>
-        <w:ind w:firstLine="567"/>
+        <w:ind w:firstLine="709"/>
         <w:jc w:val="both"/>
       </w:pPr>
       <w:r>
@@ -464,7 +465,7 @@
     <w:p>
       <w:pPr>
         <w:spacing w:line="360" w:lineRule="auto" w:before="0" w:after="0"/>
-        <w:ind w:firstLine="567"/>
+        <w:ind w:firstLine="709"/>
         <w:jc w:val="both"/>
       </w:pPr>
       <w:r>
@@ -491,7 +492,7 @@
         <w:rPr>
           <w:b w:val="0"/>
         </w:rPr>
-        <w:t>1.3 SELEÇÃO DE FORNECEDORES POR MÚLTIPLOS CRITÉRIOS</w:t>
+        <w:t>2.3 SELEÇÃO DE FORNECEDORES POR MÚLTIPLOS CRITÉRIOS</w:t>
       </w:r>
     </w:p>
     <w:p>
@@ -504,7 +505,7 @@
     <w:p>
       <w:pPr>
         <w:spacing w:line="360" w:lineRule="auto" w:before="0" w:after="0"/>
-        <w:ind w:firstLine="567"/>
+        <w:ind w:firstLine="709"/>
         <w:jc w:val="both"/>
       </w:pPr>
       <w:r>
@@ -518,7 +519,7 @@
     <w:p>
       <w:pPr>
         <w:spacing w:line="360" w:lineRule="auto" w:before="0" w:after="0"/>
-        <w:ind w:firstLine="567"/>
+        <w:ind w:firstLine="709"/>
         <w:jc w:val="both"/>
       </w:pPr>
       <w:r>
@@ -545,7 +546,7 @@
         <w:rPr>
           <w:b w:val="0"/>
         </w:rPr>
-        <w:t>1.4 INTEGRAÇÃO ENTRE SISTEMAS POR MEIO DE API</w:t>
+        <w:t>2.4 INTEGRAÇÃO ENTRE SISTEMAS POR MEIO DE API</w:t>
       </w:r>
     </w:p>
     <w:p>
@@ -558,7 +559,7 @@
     <w:p>
       <w:pPr>
         <w:spacing w:line="360" w:lineRule="auto" w:before="0" w:after="0"/>
-        <w:ind w:firstLine="567"/>
+        <w:ind w:firstLine="709"/>
         <w:jc w:val="both"/>
       </w:pPr>
       <w:r>
@@ -586,7 +587,7 @@
     <w:p>
       <w:pPr>
         <w:spacing w:line="360" w:lineRule="auto" w:before="0" w:after="0"/>
-        <w:ind w:firstLine="567"/>
+        <w:ind w:firstLine="709"/>
         <w:jc w:val="both"/>
       </w:pPr>
       <w:r>
@@ -613,7 +614,7 @@
         <w:rPr>
           <w:b w:val="0"/>
         </w:rPr>
-        <w:t>1.5 AUTOMAÇÃO DE PROCESSOS ORGANIZACIONAIS</w:t>
+        <w:t>2.5 AUTOMAÇÃO DE PROCESSOS ORGANIZACIONAIS</w:t>
       </w:r>
     </w:p>
     <w:p>
@@ -626,7 +627,7 @@
     <w:p>
       <w:pPr>
         <w:spacing w:line="360" w:lineRule="auto" w:before="0" w:after="0"/>
-        <w:ind w:firstLine="567"/>
+        <w:ind w:firstLine="709"/>
         <w:jc w:val="both"/>
       </w:pPr>
       <w:r>
@@ -653,7 +654,7 @@
         <w:rPr>
           <w:b w:val="0"/>
         </w:rPr>
-        <w:t>1.6 MODELO DE ACEITAÇÃO DE TECNOLOGIA (TAM)</w:t>
+        <w:t>2.6 MODELO DE ACEITAÇÃO DE TECNOLOGIA (TAM)</w:t>
       </w:r>
     </w:p>
     <w:p>
@@ -666,7 +667,7 @@
     <w:p>
       <w:pPr>
         <w:spacing w:line="360" w:lineRule="auto" w:before="0" w:after="0"/>
-        <w:ind w:firstLine="567"/>
+        <w:ind w:firstLine="709"/>
         <w:jc w:val="both"/>
       </w:pPr>
       <w:r>
@@ -680,7 +681,7 @@
     <w:p>
       <w:pPr>
         <w:spacing w:line="360" w:lineRule="auto" w:before="0" w:after="0"/>
-        <w:ind w:firstLine="567"/>
+        <w:ind w:firstLine="709"/>
         <w:jc w:val="both"/>
       </w:pPr>
       <w:r>
@@ -707,7 +708,7 @@
         <w:rPr>
           <w:b w:val="0"/>
         </w:rPr>
-        <w:t>1.7 TRABALHOS CORRELATOS</w:t>
+        <w:t>2.7 TRABALHOS CORRELATOS</w:t>
       </w:r>
     </w:p>
     <w:p>
@@ -720,7 +721,7 @@
     <w:p>
       <w:pPr>
         <w:spacing w:line="360" w:lineRule="auto" w:before="0" w:after="0"/>
-        <w:ind w:firstLine="567"/>
+        <w:ind w:firstLine="709"/>
         <w:jc w:val="both"/>
       </w:pPr>
       <w:r>
@@ -734,7 +735,7 @@
     <w:p>
       <w:pPr>
         <w:spacing w:line="360" w:lineRule="auto" w:before="0" w:after="0"/>
-        <w:ind w:firstLine="567"/>
+        <w:ind w:firstLine="709"/>
         <w:jc w:val="both"/>
       </w:pPr>
       <w:r>
@@ -762,7 +763,7 @@
     <w:p>
       <w:pPr>
         <w:spacing w:line="360" w:lineRule="auto" w:before="0" w:after="0"/>
-        <w:ind w:firstLine="567"/>
+        <w:ind w:firstLine="709"/>
         <w:jc w:val="both"/>
       </w:pPr>
       <w:r>
@@ -775,18 +776,9 @@
     </w:p>
     <w:p>
       <w:pPr>
-        <w:keepNext/>
-        <w:spacing w:line="240" w:lineRule="auto" w:before="120" w:after="80"/>
-        <w:jc w:val="center"/>
-      </w:pPr>
-      <w:r>
-        <w:rPr>
-          <w:b/>
-          <w:i w:val="0"/>
-          <w:sz w:val="20"/>
-        </w:rPr>
-        <w:t>Quadro 1 – Comparação entre os trabalhos correlatos e o Provisa</w:t>
-      </w:r>
+        <w:spacing w:line="240" w:lineRule="auto" w:before="0" w:after="0"/>
+        <w:jc w:val="both"/>
+      </w:pPr>
     </w:p>
     <w:tbl>
       <w:tblPr>
@@ -1629,6 +1621,7 @@
           </w:tcPr>
           <w:p>
             <w:pPr>
+              <w:keepNext/>
               <w:spacing w:line="240" w:lineRule="auto" w:before="40" w:after="40"/>
               <w:jc w:val="left"/>
             </w:pPr>
@@ -1654,6 +1647,7 @@
           </w:tcPr>
           <w:p>
             <w:pPr>
+              <w:keepNext/>
               <w:spacing w:line="240" w:lineRule="auto" w:before="40" w:after="40"/>
               <w:jc w:val="left"/>
             </w:pPr>
@@ -1679,6 +1673,7 @@
           </w:tcPr>
           <w:p>
             <w:pPr>
+              <w:keepNext/>
               <w:spacing w:line="240" w:lineRule="auto" w:before="40" w:after="40"/>
               <w:jc w:val="left"/>
             </w:pPr>
@@ -1704,6 +1699,7 @@
           </w:tcPr>
           <w:p>
             <w:pPr>
+              <w:keepNext/>
               <w:spacing w:line="240" w:lineRule="auto" w:before="40" w:after="40"/>
               <w:jc w:val="left"/>
             </w:pPr>
@@ -1729,6 +1725,7 @@
           </w:tcPr>
           <w:p>
             <w:pPr>
+              <w:keepNext/>
               <w:spacing w:line="240" w:lineRule="auto" w:before="40" w:after="40"/>
               <w:jc w:val="left"/>
             </w:pPr>
@@ -1746,8 +1743,23 @@
     </w:tbl>
     <w:p>
       <w:pPr>
-        <w:spacing w:line="240" w:lineRule="auto" w:before="80" w:after="240"/>
-        <w:jc w:val="left"/>
+        <w:keepNext/>
+        <w:spacing w:line="240" w:lineRule="auto" w:before="80" w:after="0"/>
+        <w:jc w:val="center"/>
+      </w:pPr>
+      <w:r>
+        <w:rPr>
+          <w:b/>
+          <w:i w:val="0"/>
+          <w:sz w:val="20"/>
+        </w:rPr>
+        <w:t>Quadro 1 – Comparação entre os trabalhos correlatos e o Provisa</w:t>
+      </w:r>
+    </w:p>
+    <w:p>
+      <w:pPr>
+        <w:spacing w:line="240" w:lineRule="auto" w:before="0" w:after="240"/>
+        <w:jc w:val="center"/>
       </w:pPr>
       <w:r>
         <w:rPr>
@@ -1774,7 +1786,7 @@
         <w:rPr>
           <w:b/>
         </w:rPr>
-        <w:t>2 MATERIAIS E MÉTODOS</w:t>
+        <w:t>3 MATERIAIS E MÉTODOS</w:t>
       </w:r>
     </w:p>
     <w:p>
@@ -1794,7 +1806,7 @@
         <w:rPr>
           <w:b w:val="0"/>
         </w:rPr>
-        <w:t>2.1 CLASSIFICAÇÃO DA PESQUISA</w:t>
+        <w:t>3.1 CLASSIFICAÇÃO DA PESQUISA</w:t>
       </w:r>
     </w:p>
     <w:p>
@@ -1807,7 +1819,7 @@
     <w:p>
       <w:pPr>
         <w:spacing w:line="360" w:lineRule="auto" w:before="0" w:after="0"/>
-        <w:ind w:firstLine="567"/>
+        <w:ind w:firstLine="709"/>
         <w:jc w:val="both"/>
       </w:pPr>
       <w:r>
@@ -1834,7 +1846,7 @@
         <w:rPr>
           <w:b w:val="0"/>
         </w:rPr>
-        <w:t>2.2 LEVANTAMENTO DE REQUISITOS</w:t>
+        <w:t>3.2 LEVANTAMENTO DE REQUISITOS</w:t>
       </w:r>
     </w:p>
     <w:p>
@@ -1847,7 +1859,7 @@
     <w:p>
       <w:pPr>
         <w:spacing w:line="360" w:lineRule="auto" w:before="0" w:after="0"/>
-        <w:ind w:firstLine="567"/>
+        <w:ind w:firstLine="709"/>
         <w:jc w:val="both"/>
       </w:pPr>
       <w:r>
@@ -1874,7 +1886,7 @@
         <w:rPr>
           <w:b w:val="0"/>
         </w:rPr>
-        <w:t>2.3 TECNOLOGIAS UTILIZADAS</w:t>
+        <w:t>3.3 TECNOLOGIAS UTILIZADAS</w:t>
       </w:r>
     </w:p>
     <w:p>
@@ -1887,7 +1899,7 @@
     <w:p>
       <w:pPr>
         <w:spacing w:line="360" w:lineRule="auto" w:before="0" w:after="0"/>
-        <w:ind w:firstLine="567"/>
+        <w:ind w:firstLine="709"/>
         <w:jc w:val="both"/>
       </w:pPr>
       <w:r>
@@ -1900,18 +1912,9 @@
     </w:p>
     <w:p>
       <w:pPr>
-        <w:keepNext/>
-        <w:spacing w:line="240" w:lineRule="auto" w:before="120" w:after="80"/>
-        <w:jc w:val="center"/>
-      </w:pPr>
-      <w:r>
-        <w:rPr>
-          <w:b/>
-          <w:i w:val="0"/>
-          <w:sz w:val="20"/>
-        </w:rPr>
-        <w:t>Quadro 2 – Tecnologias utilizadas no desenvolvimento</w:t>
-      </w:r>
+        <w:spacing w:line="240" w:lineRule="auto" w:before="0" w:after="0"/>
+        <w:jc w:val="both"/>
+      </w:pPr>
     </w:p>
     <w:tbl>
       <w:tblPr>
@@ -2689,6 +2692,7 @@
           </w:tcPr>
           <w:p>
             <w:pPr>
+              <w:keepNext/>
               <w:spacing w:line="240" w:lineRule="auto" w:before="40" w:after="40"/>
               <w:jc w:val="left"/>
             </w:pPr>
@@ -2714,6 +2718,7 @@
           </w:tcPr>
           <w:p>
             <w:pPr>
+              <w:keepNext/>
               <w:spacing w:line="240" w:lineRule="auto" w:before="40" w:after="40"/>
               <w:jc w:val="left"/>
             </w:pPr>
@@ -2739,6 +2744,7 @@
           </w:tcPr>
           <w:p>
             <w:pPr>
+              <w:keepNext/>
               <w:spacing w:line="240" w:lineRule="auto" w:before="40" w:after="40"/>
               <w:jc w:val="left"/>
             </w:pPr>
@@ -2756,8 +2762,23 @@
     </w:tbl>
     <w:p>
       <w:pPr>
-        <w:spacing w:line="240" w:lineRule="auto" w:before="80" w:after="240"/>
-        <w:jc w:val="left"/>
+        <w:keepNext/>
+        <w:spacing w:line="240" w:lineRule="auto" w:before="80" w:after="0"/>
+        <w:jc w:val="center"/>
+      </w:pPr>
+      <w:r>
+        <w:rPr>
+          <w:b/>
+          <w:i w:val="0"/>
+          <w:sz w:val="20"/>
+        </w:rPr>
+        <w:t>Quadro 2 – Tecnologias utilizadas no desenvolvimento</w:t>
+      </w:r>
+    </w:p>
+    <w:p>
+      <w:pPr>
+        <w:spacing w:line="240" w:lineRule="auto" w:before="0" w:after="240"/>
+        <w:jc w:val="center"/>
       </w:pPr>
       <w:r>
         <w:rPr>
@@ -2784,7 +2805,7 @@
         <w:rPr>
           <w:b w:val="0"/>
         </w:rPr>
-        <w:t>2.4 ARQUITETURA E CENÁRIO DE TESTE</w:t>
+        <w:t>3.4 ARQUITETURA E CENÁRIO DE TESTE</w:t>
       </w:r>
     </w:p>
     <w:p>
@@ -2797,7 +2818,7 @@
     <w:p>
       <w:pPr>
         <w:spacing w:line="360" w:lineRule="auto" w:before="0" w:after="0"/>
-        <w:ind w:firstLine="567"/>
+        <w:ind w:firstLine="709"/>
         <w:jc w:val="both"/>
       </w:pPr>
       <w:r>
@@ -2881,7 +2902,7 @@
     <w:p>
       <w:pPr>
         <w:spacing w:line="360" w:lineRule="auto" w:before="0" w:after="0"/>
-        <w:ind w:firstLine="567"/>
+        <w:ind w:firstLine="709"/>
         <w:jc w:val="both"/>
       </w:pPr>
       <w:r>
@@ -2908,7 +2929,7 @@
         <w:rPr>
           <w:b w:val="0"/>
         </w:rPr>
-        <w:t>2.5 ALGORITMO DE COMPARAÇÃO DAS PROPOSTAS</w:t>
+        <w:t>3.5 ALGORITMO DE COMPARAÇÃO DAS PROPOSTAS</w:t>
       </w:r>
     </w:p>
     <w:p>
@@ -2921,7 +2942,7 @@
     <w:p>
       <w:pPr>
         <w:spacing w:line="360" w:lineRule="auto" w:before="0" w:after="0"/>
-        <w:ind w:firstLine="567"/>
+        <w:ind w:firstLine="709"/>
         <w:jc w:val="both"/>
       </w:pPr>
       <w:r>
@@ -2935,7 +2956,7 @@
     <w:p>
       <w:pPr>
         <w:spacing w:line="360" w:lineRule="auto" w:before="0" w:after="0"/>
-        <w:ind w:left="907" w:hanging="340"/>
+        <w:ind w:left="1049" w:hanging="340"/>
         <w:jc w:val="both"/>
       </w:pPr>
       <w:r>
@@ -2949,7 +2970,7 @@
     <w:p>
       <w:pPr>
         <w:spacing w:line="360" w:lineRule="auto" w:before="0" w:after="0"/>
-        <w:ind w:left="907" w:hanging="340"/>
+        <w:ind w:left="1049" w:hanging="340"/>
         <w:jc w:val="both"/>
       </w:pPr>
       <w:r>
@@ -2963,7 +2984,7 @@
     <w:p>
       <w:pPr>
         <w:spacing w:line="360" w:lineRule="auto" w:before="0" w:after="0"/>
-        <w:ind w:left="907" w:hanging="340"/>
+        <w:ind w:left="1049" w:hanging="340"/>
         <w:jc w:val="both"/>
       </w:pPr>
       <w:r>
@@ -2977,7 +2998,7 @@
     <w:p>
       <w:pPr>
         <w:spacing w:line="360" w:lineRule="auto" w:before="0" w:after="0"/>
-        <w:ind w:left="907" w:hanging="340"/>
+        <w:ind w:left="1049" w:hanging="340"/>
         <w:jc w:val="both"/>
       </w:pPr>
       <w:r>
@@ -2991,7 +3012,7 @@
     <w:p>
       <w:pPr>
         <w:spacing w:line="360" w:lineRule="auto" w:before="0" w:after="0"/>
-        <w:ind w:firstLine="567"/>
+        <w:ind w:firstLine="709"/>
         <w:jc w:val="both"/>
       </w:pPr>
       <w:r>
@@ -3018,7 +3039,7 @@
         <w:rPr>
           <w:b w:val="0"/>
         </w:rPr>
-        <w:t>2.6 PROCEDIMENTOS DE AVALIAÇÃO</w:t>
+        <w:t>3.6 PROCEDIMENTOS DE AVALIAÇÃO</w:t>
       </w:r>
     </w:p>
     <w:p>
@@ -3031,7 +3052,7 @@
     <w:p>
       <w:pPr>
         <w:spacing w:line="360" w:lineRule="auto" w:before="0" w:after="0"/>
-        <w:ind w:firstLine="567"/>
+        <w:ind w:firstLine="709"/>
         <w:jc w:val="both"/>
       </w:pPr>
       <w:r>
@@ -3053,7 +3074,7 @@
     <w:p>
       <w:pPr>
         <w:spacing w:line="360" w:lineRule="auto" w:before="0" w:after="0"/>
-        <w:ind w:firstLine="567"/>
+        <w:ind w:firstLine="709"/>
         <w:jc w:val="both"/>
       </w:pPr>
       <w:r>
@@ -3067,7 +3088,7 @@
     <w:p>
       <w:pPr>
         <w:spacing w:line="360" w:lineRule="auto" w:before="0" w:after="0"/>
-        <w:ind w:firstLine="567"/>
+        <w:ind w:firstLine="709"/>
         <w:jc w:val="both"/>
       </w:pPr>
       <w:r>
@@ -3102,7 +3123,7 @@
         <w:rPr>
           <w:b/>
         </w:rPr>
-        <w:t>3 RESULTADOS</w:t>
+        <w:t>4 RESULTADOS E DISCUSSÃO</w:t>
       </w:r>
     </w:p>
     <w:p>
@@ -3122,7 +3143,7 @@
         <w:rPr>
           <w:b w:val="0"/>
         </w:rPr>
-        <w:t>3.1 O SISTEMA DESENVOLVIDO</w:t>
+        <w:t>4.1 O SISTEMA DESENVOLVIDO</w:t>
       </w:r>
     </w:p>
     <w:p>
@@ -3135,7 +3156,7 @@
     <w:p>
       <w:pPr>
         <w:spacing w:line="360" w:lineRule="auto" w:before="0" w:after="0"/>
-        <w:ind w:firstLine="567"/>
+        <w:ind w:firstLine="709"/>
         <w:jc w:val="both"/>
       </w:pPr>
       <w:r>
@@ -3219,7 +3240,7 @@
     <w:p>
       <w:pPr>
         <w:spacing w:line="360" w:lineRule="auto" w:before="0" w:after="0"/>
-        <w:ind w:firstLine="567"/>
+        <w:ind w:firstLine="709"/>
         <w:jc w:val="both"/>
       </w:pPr>
       <w:r>
@@ -3303,7 +3324,7 @@
     <w:p>
       <w:pPr>
         <w:spacing w:line="360" w:lineRule="auto" w:before="0" w:after="0"/>
-        <w:ind w:firstLine="567"/>
+        <w:ind w:firstLine="709"/>
         <w:jc w:val="both"/>
       </w:pPr>
       <w:r>
@@ -3387,7 +3408,7 @@
     <w:p>
       <w:pPr>
         <w:spacing w:line="360" w:lineRule="auto" w:before="0" w:after="0"/>
-        <w:ind w:firstLine="567"/>
+        <w:ind w:firstLine="709"/>
         <w:jc w:val="both"/>
       </w:pPr>
       <w:r>
@@ -3471,7 +3492,7 @@
     <w:p>
       <w:pPr>
         <w:spacing w:line="360" w:lineRule="auto" w:before="0" w:after="0"/>
-        <w:ind w:firstLine="567"/>
+        <w:ind w:firstLine="709"/>
         <w:jc w:val="both"/>
       </w:pPr>
       <w:r>
@@ -3484,18 +3505,9 @@
     </w:p>
     <w:p>
       <w:pPr>
-        <w:keepNext/>
-        <w:spacing w:line="240" w:lineRule="auto" w:before="120" w:after="80"/>
-        <w:jc w:val="center"/>
-      </w:pPr>
-      <w:r>
-        <w:rPr>
-          <w:b/>
-          <w:i w:val="0"/>
-          <w:sz w:val="20"/>
-        </w:rPr>
-        <w:t>Quadro 3 – Atendimento aos requisitos funcionais do projeto</w:t>
-      </w:r>
+        <w:spacing w:line="240" w:lineRule="auto" w:before="0" w:after="0"/>
+        <w:jc w:val="both"/>
+      </w:pPr>
     </w:p>
     <w:tbl>
       <w:tblPr>
@@ -4522,6 +4534,7 @@
           </w:tcPr>
           <w:p>
             <w:pPr>
+              <w:keepNext/>
               <w:spacing w:line="240" w:lineRule="auto" w:before="40" w:after="40"/>
               <w:jc w:val="left"/>
             </w:pPr>
@@ -4547,6 +4560,7 @@
           </w:tcPr>
           <w:p>
             <w:pPr>
+              <w:keepNext/>
               <w:spacing w:line="240" w:lineRule="auto" w:before="40" w:after="40"/>
               <w:jc w:val="left"/>
             </w:pPr>
@@ -4572,6 +4586,7 @@
           </w:tcPr>
           <w:p>
             <w:pPr>
+              <w:keepNext/>
               <w:spacing w:line="240" w:lineRule="auto" w:before="40" w:after="40"/>
               <w:jc w:val="left"/>
             </w:pPr>
@@ -4589,8 +4604,23 @@
     </w:tbl>
     <w:p>
       <w:pPr>
-        <w:spacing w:line="240" w:lineRule="auto" w:before="80" w:after="240"/>
-        <w:jc w:val="left"/>
+        <w:keepNext/>
+        <w:spacing w:line="240" w:lineRule="auto" w:before="80" w:after="0"/>
+        <w:jc w:val="center"/>
+      </w:pPr>
+      <w:r>
+        <w:rPr>
+          <w:b/>
+          <w:i w:val="0"/>
+          <w:sz w:val="20"/>
+        </w:rPr>
+        <w:t>Quadro 3 – Atendimento aos requisitos funcionais do projeto</w:t>
+      </w:r>
+    </w:p>
+    <w:p>
+      <w:pPr>
+        <w:spacing w:line="240" w:lineRule="auto" w:before="0" w:after="240"/>
+        <w:jc w:val="center"/>
       </w:pPr>
       <w:r>
         <w:rPr>
@@ -4604,7 +4634,7 @@
     <w:p>
       <w:pPr>
         <w:spacing w:line="360" w:lineRule="auto" w:before="0" w:after="0"/>
-        <w:ind w:firstLine="567"/>
+        <w:ind w:firstLine="709"/>
         <w:jc w:val="both"/>
       </w:pPr>
       <w:r>
@@ -4631,7 +4661,7 @@
         <w:rPr>
           <w:b w:val="0"/>
         </w:rPr>
-        <w:t>3.2 TESTES DO SISTEMA</w:t>
+        <w:t>4.2 TESTES DO SISTEMA</w:t>
       </w:r>
     </w:p>
     <w:p>
@@ -4644,7 +4674,7 @@
     <w:p>
       <w:pPr>
         <w:spacing w:line="360" w:lineRule="auto" w:before="0" w:after="0"/>
-        <w:ind w:firstLine="567"/>
+        <w:ind w:firstLine="709"/>
         <w:jc w:val="both"/>
       </w:pPr>
       <w:r>
@@ -4671,7 +4701,7 @@
         <w:rPr>
           <w:b w:val="0"/>
         </w:rPr>
-        <w:t>3.3 COMPARAÇÃO ENTRE O PROCESSO MANUAL E O AUTOMATIZADO</w:t>
+        <w:t>4.3 COMPARAÇÃO ENTRE O PROCESSO MANUAL E O AUTOMATIZADO</w:t>
       </w:r>
     </w:p>
     <w:p>
@@ -4684,7 +4714,7 @@
     <w:p>
       <w:pPr>
         <w:spacing w:line="360" w:lineRule="auto" w:before="0" w:after="0"/>
-        <w:ind w:firstLine="567"/>
+        <w:ind w:firstLine="709"/>
         <w:jc w:val="both"/>
       </w:pPr>
       <w:r>
@@ -5319,7 +5349,7 @@
     <w:p>
       <w:pPr>
         <w:spacing w:line="360" w:lineRule="auto" w:before="0" w:after="0"/>
-        <w:ind w:firstLine="567"/>
+        <w:ind w:firstLine="709"/>
         <w:jc w:val="both"/>
       </w:pPr>
       <w:r>
@@ -6141,7 +6171,7 @@
         <w:rPr>
           <w:b w:val="0"/>
         </w:rPr>
-        <w:t>3.4 ACEITAÇÃO DO SISTEMA PELOS USUÁRIOS</w:t>
+        <w:t>4.4 ACEITAÇÃO DO SISTEMA PELOS USUÁRIOS</w:t>
       </w:r>
     </w:p>
     <w:p>
@@ -6154,7 +6184,7 @@
     <w:p>
       <w:pPr>
         <w:spacing w:line="360" w:lineRule="auto" w:before="0" w:after="0"/>
-        <w:ind w:firstLine="567"/>
+        <w:ind w:firstLine="709"/>
         <w:jc w:val="both"/>
       </w:pPr>
       <w:r>
@@ -6163,7 +6193,7 @@
           <w:i w:val="0"/>
           <w:highlight w:val="yellow"/>
         </w:rPr>
-        <w:t>Descrever os participantes: quantos responderam, funções (compradores, gestores, fornecedores), tempo de experiência e como fazem cotações hoje, com base no Bloco A do questionário. A Figura 6 apresenta o perfil.</w:t>
+        <w:t>Descrever os participantes: quantos responderam, funções (compradores, gestores, fornecedores), tempo de experiência e como fazem cotações hoje, com base no Bloco A do questionário. O Gráfico 1 apresenta o perfil.</w:t>
       </w:r>
     </w:p>
     <w:tbl>
@@ -6222,7 +6252,7 @@
           <w:i w:val="0"/>
           <w:sz w:val="20"/>
         </w:rPr>
-        <w:t>Figura 6 – Perfil dos participantes (função e tempo de experiência)</w:t>
+        <w:t>Gráfico 1 – Perfil dos participantes (função e tempo de experiência)</w:t>
       </w:r>
     </w:p>
     <w:p>
@@ -6242,7 +6272,7 @@
     <w:p>
       <w:pPr>
         <w:spacing w:line="360" w:lineRule="auto" w:before="0" w:after="0"/>
-        <w:ind w:firstLine="567"/>
+        <w:ind w:firstLine="709"/>
         <w:jc w:val="both"/>
       </w:pPr>
       <w:r>
@@ -6250,7 +6280,7 @@
           <w:b w:val="0"/>
           <w:i w:val="0"/>
         </w:rPr>
-        <w:t>A Tabela 3 apresenta os resultados por construto do TAM, e a Figura 7 compara as médias de cada construto.</w:t>
+        <w:t>A Tabela 3 apresenta os resultados por construto do TAM, e o Gráfico 2 compara as médias de cada construto.</w:t>
       </w:r>
     </w:p>
     <w:p>
@@ -6277,8 +6307,8 @@
         <w:tblLayout w:type="fixed"/>
       </w:tblPr>
       <w:tblGrid>
-        <w:gridCol w:w="2835"/>
-        <w:gridCol w:w="680"/>
+        <w:gridCol w:w="2608"/>
+        <w:gridCol w:w="907"/>
         <w:gridCol w:w="850"/>
         <w:gridCol w:w="1304"/>
         <w:gridCol w:w="1701"/>
@@ -6290,7 +6320,7 @@
         </w:trPr>
         <w:tc>
           <w:tcPr>
-            <w:tcW w:type="dxa" w:w="2835"/>
+            <w:tcW w:type="dxa" w:w="2608"/>
             <w:tcBorders>
               <w:top w:val="single" w:sz="6" w:color="000000"/>
               <w:left w:val="nil" w:sz="6" w:color="000000"/>
@@ -6316,7 +6346,7 @@
         </w:tc>
         <w:tc>
           <w:tcPr>
-            <w:tcW w:type="dxa" w:w="680"/>
+            <w:tcW w:type="dxa" w:w="907"/>
             <w:tcBorders>
               <w:top w:val="single" w:sz="6" w:color="000000"/>
               <w:left w:val="nil" w:sz="6" w:color="000000"/>
@@ -6451,7 +6481,7 @@
         </w:trPr>
         <w:tc>
           <w:tcPr>
-            <w:tcW w:type="dxa" w:w="2835"/>
+            <w:tcW w:type="dxa" w:w="2608"/>
             <w:tcBorders>
               <w:top w:val="nil" w:sz="6" w:color="000000"/>
               <w:left w:val="nil" w:sz="6" w:color="000000"/>
@@ -6477,7 +6507,7 @@
         </w:tc>
         <w:tc>
           <w:tcPr>
-            <w:tcW w:type="dxa" w:w="680"/>
+            <w:tcW w:type="dxa" w:w="907"/>
             <w:tcBorders>
               <w:top w:val="nil" w:sz="6" w:color="000000"/>
               <w:left w:val="nil" w:sz="6" w:color="000000"/>
@@ -6616,7 +6646,7 @@
         </w:trPr>
         <w:tc>
           <w:tcPr>
-            <w:tcW w:type="dxa" w:w="2835"/>
+            <w:tcW w:type="dxa" w:w="2608"/>
             <w:tcBorders>
               <w:top w:val="nil" w:sz="6" w:color="000000"/>
               <w:left w:val="nil" w:sz="6" w:color="000000"/>
@@ -6642,7 +6672,7 @@
         </w:tc>
         <w:tc>
           <w:tcPr>
-            <w:tcW w:type="dxa" w:w="680"/>
+            <w:tcW w:type="dxa" w:w="907"/>
             <w:tcBorders>
               <w:top w:val="nil" w:sz="6" w:color="000000"/>
               <w:left w:val="nil" w:sz="6" w:color="000000"/>
@@ -6781,7 +6811,7 @@
         </w:trPr>
         <w:tc>
           <w:tcPr>
-            <w:tcW w:type="dxa" w:w="2835"/>
+            <w:tcW w:type="dxa" w:w="2608"/>
             <w:tcBorders>
               <w:top w:val="nil" w:sz="6" w:color="000000"/>
               <w:left w:val="nil" w:sz="6" w:color="000000"/>
@@ -6807,7 +6837,7 @@
         </w:tc>
         <w:tc>
           <w:tcPr>
-            <w:tcW w:type="dxa" w:w="680"/>
+            <w:tcW w:type="dxa" w:w="907"/>
             <w:tcBorders>
               <w:top w:val="nil" w:sz="6" w:color="000000"/>
               <w:left w:val="nil" w:sz="6" w:color="000000"/>
@@ -6946,7 +6976,7 @@
         </w:trPr>
         <w:tc>
           <w:tcPr>
-            <w:tcW w:type="dxa" w:w="2835"/>
+            <w:tcW w:type="dxa" w:w="2608"/>
             <w:tcBorders>
               <w:top w:val="nil" w:sz="6" w:color="000000"/>
               <w:left w:val="nil" w:sz="6" w:color="000000"/>
@@ -6971,7 +7001,7 @@
         </w:tc>
         <w:tc>
           <w:tcPr>
-            <w:tcW w:type="dxa" w:w="680"/>
+            <w:tcW w:type="dxa" w:w="907"/>
             <w:tcBorders>
               <w:top w:val="nil" w:sz="6" w:color="000000"/>
               <w:left w:val="nil" w:sz="6" w:color="000000"/>
@@ -7170,7 +7200,7 @@
           <w:i w:val="0"/>
           <w:sz w:val="20"/>
         </w:rPr>
-        <w:t>Figura 7 – Média das respostas por construto do TAM</w:t>
+        <w:t>Gráfico 2 – Média das respostas por construto do TAM</w:t>
       </w:r>
     </w:p>
     <w:p>
@@ -7190,7 +7220,7 @@
     <w:p>
       <w:pPr>
         <w:spacing w:line="360" w:lineRule="auto" w:before="0" w:after="0"/>
-        <w:ind w:firstLine="567"/>
+        <w:ind w:firstLine="709"/>
         <w:jc w:val="both"/>
       </w:pPr>
       <w:r>
@@ -7199,13 +7229,13 @@
           <w:i w:val="0"/>
           <w:highlight w:val="yellow"/>
         </w:rPr>
-        <w:t>Comentar a Figura 7: qual construto teve a maior média e se a utilidade percebida superou a facilidade de uso.</w:t>
+        <w:t>Comentar o Gráfico 2: qual construto teve a maior média e se a utilidade percebida superou a facilidade de uso.</w:t>
       </w:r>
     </w:p>
     <w:p>
       <w:pPr>
         <w:spacing w:line="360" w:lineRule="auto" w:before="0" w:after="0"/>
-        <w:ind w:firstLine="567"/>
+        <w:ind w:firstLine="709"/>
         <w:jc w:val="both"/>
       </w:pPr>
       <w:r>
@@ -7213,7 +7243,7 @@
           <w:b w:val="0"/>
           <w:i w:val="0"/>
         </w:rPr>
-        <w:t>A Figura 8 mostra a distribuição das respostas em cada afirmação do questionário.</w:t>
+        <w:t>O Gráfico 3 mostra a distribuição das respostas em cada afirmação do questionário.</w:t>
       </w:r>
     </w:p>
     <w:tbl>
@@ -7272,7 +7302,7 @@
           <w:i w:val="0"/>
           <w:sz w:val="20"/>
         </w:rPr>
-        <w:t>Figura 8 – Distribuição das respostas por afirmação (UP, FUP, AT e IU)</w:t>
+        <w:t>Gráfico 3 – Distribuição das respostas por afirmação (UP, FUP, AT e IU)</w:t>
       </w:r>
     </w:p>
     <w:p>
@@ -7292,7 +7322,7 @@
     <w:p>
       <w:pPr>
         <w:spacing w:line="360" w:lineRule="auto" w:before="0" w:after="0"/>
-        <w:ind w:firstLine="567"/>
+        <w:ind w:firstLine="709"/>
         <w:jc w:val="both"/>
       </w:pPr>
       <w:r>
@@ -7307,7 +7337,7 @@
     <w:p>
       <w:pPr>
         <w:spacing w:line="360" w:lineRule="auto" w:before="0" w:after="0"/>
-        <w:ind w:firstLine="567"/>
+        <w:ind w:firstLine="709"/>
         <w:jc w:val="both"/>
       </w:pPr>
       <w:r>
@@ -7375,7 +7405,7 @@
           <w:i w:val="0"/>
           <w:sz w:val="20"/>
         </w:rPr>
-        <w:t>Figura 9 – Avaliação do portal de resposta pelos fornecedores</w:t>
+        <w:t>Gráfico 4 – Avaliação do portal de resposta pelos fornecedores</w:t>
       </w:r>
     </w:p>
     <w:p>
@@ -7395,7 +7425,7 @@
     <w:p>
       <w:pPr>
         <w:spacing w:line="360" w:lineRule="auto" w:before="0" w:after="0"/>
-        <w:ind w:firstLine="567"/>
+        <w:ind w:firstLine="709"/>
         <w:jc w:val="both"/>
       </w:pPr>
       <w:r>
@@ -7421,9 +7451,9 @@
       </w:pPr>
       <w:r>
         <w:rPr>
-          <w:b/>
+          <w:b w:val="0"/>
         </w:rPr>
-        <w:t>4 DISCUSSÃO</w:t>
+        <w:t>4.5 DISCUSSÃO DOS RESULTADOS</w:t>
       </w:r>
     </w:p>
     <w:p>
@@ -7436,7 +7466,7 @@
     <w:p>
       <w:pPr>
         <w:spacing w:line="360" w:lineRule="auto" w:before="0" w:after="0"/>
-        <w:ind w:firstLine="567"/>
+        <w:ind w:firstLine="709"/>
         <w:jc w:val="both"/>
       </w:pPr>
       <w:r>
@@ -7450,7 +7480,7 @@
     <w:p>
       <w:pPr>
         <w:spacing w:line="360" w:lineRule="auto" w:before="0" w:after="0"/>
-        <w:ind w:firstLine="567"/>
+        <w:ind w:firstLine="709"/>
         <w:jc w:val="both"/>
       </w:pPr>
       <w:r>
@@ -7478,7 +7508,7 @@
     <w:p>
       <w:pPr>
         <w:spacing w:line="360" w:lineRule="auto" w:before="0" w:after="0"/>
-        <w:ind w:firstLine="567"/>
+        <w:ind w:firstLine="709"/>
         <w:jc w:val="both"/>
       </w:pPr>
       <w:r>
@@ -7492,7 +7522,7 @@
     <w:p>
       <w:pPr>
         <w:spacing w:line="360" w:lineRule="auto" w:before="0" w:after="0"/>
-        <w:ind w:firstLine="567"/>
+        <w:ind w:firstLine="709"/>
         <w:jc w:val="both"/>
       </w:pPr>
       <w:r>
@@ -7507,7 +7537,7 @@
     <w:p>
       <w:pPr>
         <w:spacing w:line="360" w:lineRule="auto" w:before="0" w:after="0"/>
-        <w:ind w:firstLine="567"/>
+        <w:ind w:firstLine="709"/>
         <w:jc w:val="both"/>
       </w:pPr>
       <w:r>
@@ -7547,7 +7577,7 @@
     <w:p>
       <w:pPr>
         <w:spacing w:line="360" w:lineRule="auto" w:before="0" w:after="0"/>
-        <w:ind w:firstLine="567"/>
+        <w:ind w:firstLine="709"/>
         <w:jc w:val="both"/>
       </w:pPr>
       <w:r>
@@ -7561,7 +7591,7 @@
     <w:p>
       <w:pPr>
         <w:spacing w:line="360" w:lineRule="auto" w:before="0" w:after="0"/>
-        <w:ind w:firstLine="567"/>
+        <w:ind w:firstLine="709"/>
         <w:jc w:val="both"/>
       </w:pPr>
       <w:r>
@@ -7590,7 +7620,7 @@
     <w:p>
       <w:pPr>
         <w:spacing w:line="360" w:lineRule="auto" w:before="0" w:after="0"/>
-        <w:ind w:firstLine="567"/>
+        <w:ind w:firstLine="709"/>
         <w:jc w:val="both"/>
       </w:pPr>
       <w:r>
@@ -7630,7 +7660,7 @@
     <w:p>
       <w:pPr>
         <w:spacing w:line="360" w:lineRule="auto" w:before="0" w:after="0"/>
-        <w:ind w:firstLine="567"/>
+        <w:ind w:firstLine="709"/>
         <w:jc w:val="both"/>
       </w:pPr>
       <w:r>
@@ -7640,6 +7670,12 @@
         </w:rPr>
         <w:t>Ao professor orientador Allan Stieg Candeia, pela orientação e pelas contribuições ao longo do trabalho; aos profissionais que participaram da avaliação do sistema; e à família, pelo apoio durante o curso.</w:t>
       </w:r>
+    </w:p>
+    <w:p>
+      <w:pPr>
+        <w:spacing w:line="360" w:lineRule="auto" w:before="0" w:after="0"/>
+        <w:jc w:val="both"/>
+      </w:pPr>
     </w:p>
     <w:p>
       <w:pPr>
@@ -8070,7 +8106,7 @@
     <w:p>
       <w:pPr>
         <w:spacing w:line="360" w:lineRule="auto" w:before="0" w:after="0"/>
-        <w:ind w:firstLine="567"/>
+        <w:ind w:firstLine="709"/>
         <w:jc w:val="both"/>
       </w:pPr>
       <w:r>
@@ -8083,18 +8119,9 @@
     </w:p>
     <w:p>
       <w:pPr>
-        <w:keepNext/>
-        <w:spacing w:line="240" w:lineRule="auto" w:before="120" w:after="80"/>
-        <w:jc w:val="center"/>
-      </w:pPr>
-      <w:r>
-        <w:rPr>
-          <w:b/>
-          <w:i w:val="0"/>
-          <w:sz w:val="20"/>
-        </w:rPr>
-        <w:t>Quadro A1 – Afirmações por construto</w:t>
-      </w:r>
+        <w:spacing w:line="240" w:lineRule="auto" w:before="0" w:after="0"/>
+        <w:jc w:val="both"/>
+      </w:pPr>
     </w:p>
     <w:tbl>
       <w:tblPr>
@@ -9264,6 +9291,7 @@
           </w:tcPr>
           <w:p>
             <w:pPr>
+              <w:keepNext/>
               <w:spacing w:line="240" w:lineRule="auto" w:before="40" w:after="40"/>
               <w:jc w:val="left"/>
             </w:pPr>
@@ -9289,6 +9317,7 @@
           </w:tcPr>
           <w:p>
             <w:pPr>
+              <w:keepNext/>
               <w:spacing w:line="240" w:lineRule="auto" w:before="40" w:after="40"/>
               <w:jc w:val="left"/>
             </w:pPr>
@@ -9306,8 +9335,23 @@
     </w:tbl>
     <w:p>
       <w:pPr>
-        <w:spacing w:line="240" w:lineRule="auto" w:before="80" w:after="240"/>
-        <w:jc w:val="left"/>
+        <w:keepNext/>
+        <w:spacing w:line="240" w:lineRule="auto" w:before="80" w:after="0"/>
+        <w:jc w:val="center"/>
+      </w:pPr>
+      <w:r>
+        <w:rPr>
+          <w:b/>
+          <w:i w:val="0"/>
+          <w:sz w:val="20"/>
+        </w:rPr>
+        <w:t>Quadro A1 – Afirmações por construto</w:t>
+      </w:r>
+    </w:p>
+    <w:p>
+      <w:pPr>
+        <w:spacing w:line="240" w:lineRule="auto" w:before="0" w:after="240"/>
+        <w:jc w:val="center"/>
       </w:pPr>
       <w:r>
         <w:rPr>
@@ -9349,7 +9393,7 @@
   <w:footnote w:id="1">
     <w:p>
       <w:pPr>
-        <w:jc w:val="both"/>
+        <w:jc w:val="left"/>
       </w:pPr>
       <w:r>
         <w:rPr>
@@ -9377,7 +9421,7 @@
   <w:footnote w:id="2">
     <w:p>
       <w:pPr>
-        <w:jc w:val="both"/>
+        <w:jc w:val="left"/>
       </w:pPr>
       <w:r>
         <w:rPr>

</xml_diff>

<commit_message>
Artigo: objetivos específicos, procedimento técnico e ajustes de revisão
Co-Authored-By: Claude Opus 5.5 (1M context) <noreply@anthropic.com>
Claude-Session: https://claude.ai/code/session_013Ez8WdXVGnAz1jp93VScRd
</commit_message>
<xml_diff>
--- a/docs/artigo/artigo-TCC-provisa.docx
+++ b/docs/artigo/artigo-TCC-provisa.docx
@@ -289,7 +289,7 @@
           <w:b w:val="0"/>
           <w:i w:val="0"/>
         </w:rPr>
-        <w:t>O objetivo geral é desenvolver e avaliar o Provisa, uma plataforma web de apoio à decisão que identifica automaticamente os itens abaixo do estoque mínimo, envia pedidos de cotação aos fornecedores e classifica as propostas por preço, prazo de entrega, disponibilidade e histórico do fornecedor. O trabalho se justifica por reduzir tarefas repetitivas do comprador e o risco de ruptura de estoque e por registrar a justificativa de cada compra, além de mostrar como um algoritmo de pontuação pode apoiar, sem substituir, a decisão humana. O artigo apresenta a revisão de literatura (seção 2), os materiais e métodos (seção 3), os resultados e a discussão (seção 4) e a conclusão.</w:t>
+        <w:t>O objetivo geral é desenvolver e avaliar o Provisa, uma plataforma web de apoio à decisão que identifica automaticamente os itens abaixo do estoque mínimo, envia pedidos de cotação aos fornecedores e classifica as propostas por preço, prazo de entrega, disponibilidade e histórico do fornecedor. Os objetivos específicos são: integrar o sistema de compras a uma API de estoque; automatizar o envio e o acompanhamento das cotações; implementar um algoritmo de pontuação ponderada; e avaliar a solução pela comparação com o processo manual e pela aceitação dos usuários. O trabalho se justifica por reduzir tarefas repetitivas do comprador e o risco de ruptura de estoque e por registrar a justificativa de cada compra, além de mostrar como um algoritmo de pontuação pode apoiar, sem substituir, a decisão humana. O artigo apresenta a revisão de literatura (seção 2), os materiais e métodos (seção 3), os resultados e a discussão (seção 4) e a conclusão.</w:t>
       </w:r>
     </w:p>
     <w:p>
@@ -1452,7 +1452,7 @@
           <w:b w:val="0"/>
           <w:i w:val="0"/>
         </w:rPr>
-        <w:t>A pesquisa é aplicada, exploratória e descritiva (GIL, 2002), com abordagem qualitativa e quantitativa, e o procedimento técnico é o estudo de caso com desenvolvimento de um protótipo funcional. Os requisitos foram definidos a partir do fluxo típico de compras de um hospital, resultando em 12 requisitos funcionais e 7 não funcionais.</w:t>
+        <w:t>A pesquisa é aplicada, exploratória e descritiva (GIL, 2002), com abordagem qualitativa e quantitativa, e o procedimento técnico é o desenvolvimento de um protótipo funcional, avaliado em um cenário hospitalar simulado. Os requisitos foram definidos a partir do fluxo típico de compras de um hospital, resultando em 12 requisitos funcionais e 7 não funcionais.</w:t>
       </w:r>
     </w:p>
     <w:p>
@@ -1911,7 +1911,7 @@
           <w:b w:val="0"/>
           <w:i w:val="0"/>
         </w:rPr>
-        <w:t>A Tabela 1 mostra que as 13 etapas do processo manual se reduzem a quatro ações do comprador: revisar a quantidade, aprovar a proposta, registrar o pagamento e registrar o recebimento. No cenário de demonstração, as 26 propostas foram registradas pelos próprios fornecedores, sem digitação do comprador, as leituras do estoque pela API não tiveram falhas e as seis decisões guardaram ranking, pesos e responsável. Como as propostas desse cenário foram simuladas, os números mostram que o sistema registra cada etapa, e não o comportamento de usuários reais.</w:t>
+        <w:t>No processo manual, o comprador executa 13 etapas, agrupadas na Tabela 1 em cinco atividades; com o sistema, restam quatro ações: revisar a quantidade, aprovar a proposta, registrar o pagamento e registrar o recebimento. No cenário de demonstração, as 26 propostas foram registradas pelos próprios fornecedores, sem digitação do comprador, as leituras do estoque pela API não tiveram falhas e as seis decisões guardaram ranking, pesos e responsável. Como as propostas desse cenário foram simuladas, os números mostram que o sistema registra cada etapa, e não o comportamento de usuários reais.</w:t>
       </w:r>
     </w:p>
     <w:p>
@@ -3569,7 +3569,7 @@
           <w:b w:val="0"/>
           <w:i w:val="0"/>
         </w:rPr>
-        <w:t xml:space="preserve">A hipótese H1 é sustentada no que depende do comprador, pois a identificação dos itens, o envio e a cobrança das cotações e a comparação das propostas deixam de ser manuais, em acordo com Davenport (1993); o tempo de resposta dos fornecedores, porém, continua fora do controle do sistema. A H2 é sustentada porque a leitura pela API e o registro das propostas pelo fornecedor eliminam a redigitação, que Infante e Santos (2007) associam às falhas de abastecimento. A H3 também se sustenta: cada decisão considera quatro critérios ponderados, em linha com Dickson (1966) e Weber, Current e Benton (1991), e a Figura 3 mostra que o menor preço nem sempre é a melhor escolha. A H4 é sustentada porque cada decisão guarda ranking, pesos, responsável e justificativa. </w:t>
+        <w:t xml:space="preserve">A hipótese H1 é sustentada no que depende do comprador, pois a identificação dos itens, o envio e a cobrança das cotações e a comparação das propostas deixam de ser manuais, de acordo com Davenport (1993); o tempo de resposta dos fornecedores, porém, continua fora do controle do sistema. A H2 é sustentada porque a leitura pela API e o registro das propostas pelo fornecedor eliminam a redigitação, que Infante e Santos (2007) associam às falhas de abastecimento. A H3 também se sustenta: cada decisão considera quatro critérios ponderados, em linha com Dickson (1966) e Weber, Current e Benton (1991), e a Figura 3 mostra que o menor preço nem sempre é a melhor escolha. A H4 é sustentada porque cada decisão guarda ranking, pesos, responsável e justificativa. </w:t>
       </w:r>
       <w:r>
         <w:rPr>
@@ -3631,7 +3631,7 @@
           <w:b w:val="0"/>
           <w:i w:val="0"/>
         </w:rPr>
-        <w:t xml:space="preserve">O objetivo de desenvolver e avaliar um sistema web de apoio à decisão para compras hospitalares foi atingido: o Provisa identifica os itens abaixo do estoque mínimo por meio de uma API, envia os pedidos de cotação, recebe as propostas por um portal e as classifica por preço, prazo, disponibilidade e histórico, deixando a decisão com o comprador. Nos testes, 13 etapas manuais foram reduzidas a quatro ações e todas as decisões ficaram rastreáveis. </w:t>
+        <w:t xml:space="preserve">O objetivo de desenvolver e avaliar um sistema web de apoio à decisão para compras hospitalares foi atingido e o problema de pesquisa foi respondido: o Provisa identifica os itens abaixo do estoque mínimo por meio de uma API, envia os pedidos de cotação, recebe as propostas por um portal e as classifica por preço, prazo, disponibilidade e histórico, deixando a decisão com o comprador. Nos testes, 13 etapas manuais foram reduzidas a quatro ações e todas as decisões ficaram rastreáveis. </w:t>
       </w:r>
       <w:r>
         <w:rPr>

</xml_diff>

<commit_message>
Artigo: marcações dos trechos a completar como notas do autor
Co-Authored-By: Claude Opus 5.5 (1M context) <noreply@anthropic.com>
Claude-Session: https://claude.ai/code/session_013Ez8WdXVGnAz1jp93VScRd
</commit_message>
<xml_diff>
--- a/docs/artigo/artigo-TCC-provisa.docx
+++ b/docs/artigo/artigo-TCC-provisa.docx
@@ -110,7 +110,7 @@
           <w:i w:val="0"/>
           <w:highlight w:val="yellow"/>
         </w:rPr>
-        <w:t>Inserir as médias de utilidade e de facilidade de uso percebidas.</w:t>
+        <w:t>AQUI IREI COLOCAR AS MÉDIAS DE UTILIDADE E DE FACILIDADE DE USO DO QUESTIONÁRIO.</w:t>
       </w:r>
       <w:r>
         <w:rPr>
@@ -189,7 +189,7 @@
           <w:i w:val="0"/>
           <w:highlight w:val="yellow"/>
         </w:rPr>
-        <w:t>Insert the mean scores of perceived usefulness and perceived ease of use.</w:t>
+        <w:t>AQUI IREI COLOCAR, EM INGLÊS, AS MÉDIAS DE UTILIDADE E DE FACILIDADE DE USO.</w:t>
       </w:r>
       <w:r>
         <w:rPr>
@@ -1642,7 +1642,7 @@
           <w:i w:val="0"/>
           <w:highlight w:val="yellow"/>
         </w:rPr>
-        <w:t>Se possível, substituir pelos tempos informados pelo setor de compras de um hospital.</w:t>
+        <w:t>AQUI IREI COLOCAR OS TEMPOS REAIS DO PROCESSO MANUAL, SE CONSEGUIR COM O SETOR DE COMPRAS DE UM HOSPITAL.</w:t>
       </w:r>
       <w:r>
         <w:rPr>
@@ -1657,7 +1657,7 @@
           <w:i w:val="0"/>
           <w:highlight w:val="yellow"/>
         </w:rPr>
-        <w:t>Informar o período de coleta e o número de participantes.</w:t>
+        <w:t>AQUI IREI INFORMAR O PERÍODO DA COLETA E QUANTAS PESSOAS RESPONDERAM AO QUESTIONÁRIO.</w:t>
       </w:r>
     </w:p>
     <w:p>
@@ -2573,7 +2573,7 @@
           <w:i w:val="0"/>
           <w:highlight w:val="yellow"/>
         </w:rPr>
-        <w:t>Descrever os participantes: quantos responderam, funções e tempo de experiência.</w:t>
+        <w:t>AQUI IREI DESCREVER OS PARTICIPANTES: QUANTOS RESPONDERAM, FUNÇÕES E TEMPO DE EXPERIÊNCIA. TAMBÉM IREI PREENCHER A TABELA 2 E INSERIR O GRÁFICO 1 COM OS RESULTADOS DA PESQUISA.</w:t>
       </w:r>
       <w:r>
         <w:rPr>
@@ -3482,7 +3482,7 @@
                 <w:sz w:val="20"/>
                 <w:highlight w:val="yellow"/>
               </w:rPr>
-              <w:t>[Espaço para inserir o gráfico]</w:t>
+              <w:t>[AQUI IREI INSERIR O GRÁFICO COM OS RESULTADOS DA PESQUISA]</w:t>
             </w:r>
           </w:p>
         </w:tc>
@@ -3529,7 +3529,7 @@
           <w:i w:val="0"/>
           <w:highlight w:val="yellow"/>
         </w:rPr>
-        <w:t>Comentar o Gráfico 1, as afirmações com maior e menor concordância, a avaliação dos fornecedores sobre o portal e os principais temas das perguntas abertas.</w:t>
+        <w:t>AQUI IREI COLOCAR OS RESULTADOS DA PESQUISA: COMENTAR O GRÁFICO 1, AS AFIRMAÇÕES COM MAIOR E MENOR CONCORDÂNCIA, A OPINIÃO DOS FORNECEDORES SOBRE O PORTAL E AS RESPOSTAS DAS PERGUNTAS ABERTAS.</w:t>
       </w:r>
     </w:p>
     <w:p>
@@ -3577,7 +3577,7 @@
           <w:i w:val="0"/>
           <w:highlight w:val="yellow"/>
         </w:rPr>
-        <w:t>Discutir os resultados do TAM em relação a Davis (1989) e ao alfa mínimo de 0,70.</w:t>
+        <w:t>AQUI IREI DISCUTIR OS RESULTADOS DO QUESTIONÁRIO, COMPARANDO COM DAVIS (1989) E COM O ALFA MÍNIMO DE 0,70.</w:t>
       </w:r>
     </w:p>
     <w:p>
@@ -3639,7 +3639,7 @@
           <w:i w:val="0"/>
           <w:highlight w:val="yellow"/>
         </w:rPr>
-        <w:t>Acrescentar uma frase com a conclusão do questionário TAM.</w:t>
+        <w:t>AQUI IREI COLOCAR UMA FRASE COM A CONCLUSÃO DO QUESTIONÁRIO.</w:t>
       </w:r>
       <w:r>
         <w:rPr>

</xml_diff>

<commit_message>
Artigo: fonte e tabelas explícitas para abrir no Google Docs
Co-Authored-By: Claude Opus 5.5 (1M context) <noreply@anthropic.com>
Claude-Session: https://claude.ai/code/session_013Ez8WdXVGnAz1jp93VScRd
</commit_message>
<xml_diff>
--- a/docs/artigo/artigo-TCC-provisa.docx
+++ b/docs/artigo/artigo-TCC-provisa.docx
@@ -9,6 +9,7 @@
       </w:pPr>
       <w:r>
         <w:rPr>
+          <w:rFonts w:ascii="Arial" w:hAnsi="Arial" w:cs="Arial" w:eastAsia="Arial"/>
           <w:b/>
           <w:i w:val="0"/>
           <w:sz w:val="28"/>
@@ -29,14 +30,18 @@
       </w:pPr>
       <w:r>
         <w:rPr>
+          <w:rFonts w:ascii="Arial" w:hAnsi="Arial" w:cs="Arial" w:eastAsia="Arial"/>
           <w:b w:val="0"/>
           <w:i w:val="0"/>
+          <w:sz w:val="24"/>
         </w:rPr>
         <w:t>Matheus Marciano Negrelli</w:t>
       </w:r>
       <w:r>
         <w:rPr>
+          <w:rFonts w:ascii="Arial" w:hAnsi="Arial" w:cs="Arial" w:eastAsia="Arial"/>
           <w:vertAlign w:val="superscript"/>
+          <w:sz w:val="24"/>
         </w:rPr>
         <w:footnoteReference w:id="1"/>
       </w:r>
@@ -48,14 +53,18 @@
       </w:pPr>
       <w:r>
         <w:rPr>
+          <w:rFonts w:ascii="Arial" w:hAnsi="Arial" w:cs="Arial" w:eastAsia="Arial"/>
           <w:b w:val="0"/>
           <w:i w:val="0"/>
+          <w:sz w:val="24"/>
         </w:rPr>
         <w:t>Allan Stieg Candeia</w:t>
       </w:r>
       <w:r>
         <w:rPr>
+          <w:rFonts w:ascii="Arial" w:hAnsi="Arial" w:cs="Arial" w:eastAsia="Arial"/>
           <w:vertAlign w:val="superscript"/>
+          <w:sz w:val="24"/>
         </w:rPr>
         <w:footnoteReference w:id="2"/>
       </w:r>
@@ -80,7 +89,9 @@
       </w:pPr>
       <w:r>
         <w:rPr>
+          <w:rFonts w:ascii="Arial" w:hAnsi="Arial" w:cs="Arial" w:eastAsia="Arial"/>
           <w:b/>
+          <w:sz w:val="24"/>
         </w:rPr>
         <w:t>RESUMO</w:t>
       </w:r>
@@ -99,23 +110,29 @@
       </w:pPr>
       <w:r>
         <w:rPr>
+          <w:rFonts w:ascii="Arial" w:hAnsi="Arial" w:cs="Arial" w:eastAsia="Arial"/>
           <w:b w:val="0"/>
           <w:i w:val="0"/>
+          <w:sz w:val="24"/>
         </w:rPr>
         <w:t xml:space="preserve">A gestão de compras hospitalar precisa garantir que medicamentos, materiais e insumos estejam disponíveis no momento certo, porém em muitas instituições a identificação de itens abaixo do estoque mínimo, a solicitação de cotações e a comparação de propostas ainda dependem de planilhas, e-mails e telefonemas. Este trabalho teve como objetivo desenvolver e avaliar o Provisa, um sistema web de apoio à decisão que consulta o estoque por meio de uma Interface de Programação de Aplicações (API), envia automaticamente os pedidos de cotação aos fornecedores e classifica as propostas por pontuação ponderada de preço, prazo, disponibilidade e histórico do fornecedor, mantendo a decisão final com o comprador. A pesquisa é aplicada, exploratória e descritiva, com abordagem qualitativa e quantitativa, e consistiu no desenvolvimento de um protótipo funcional, testado em um cenário simulado de hospital, e na avaliação da aceitação com um questionário baseado no Modelo de Aceitação de Tecnologia (TAM). Nos testes, as 13 etapas do processo manual foram reduzidas a quatro ações do comprador, as propostas passaram a ser registradas pelo próprio fornecedor e todas as decisões ficaram rastreáveis. </w:t>
       </w:r>
       <w:r>
         <w:rPr>
+          <w:rFonts w:ascii="Arial" w:hAnsi="Arial" w:cs="Arial" w:eastAsia="Arial"/>
           <w:b w:val="0"/>
           <w:i w:val="0"/>
           <w:highlight w:val="yellow"/>
+          <w:sz w:val="24"/>
         </w:rPr>
         <w:t>AQUI IREI COLOCAR AS MÉDIAS DE UTILIDADE E DE FACILIDADE DE USO DO QUESTIONÁRIO.</w:t>
       </w:r>
       <w:r>
         <w:rPr>
+          <w:rFonts w:ascii="Arial" w:hAnsi="Arial" w:cs="Arial" w:eastAsia="Arial"/>
           <w:b w:val="0"/>
           <w:i w:val="0"/>
+          <w:sz w:val="24"/>
         </w:rPr>
         <w:t xml:space="preserve"> Os resultados indicam que a integração com o estoque, a automação das cotações e a comparação por múltiplos critérios tornam o processo de compras mais ágil, padronizado e transparente, sem substituir o julgamento do comprador.</w:t>
       </w:r>
@@ -133,14 +150,18 @@
       </w:pPr>
       <w:r>
         <w:rPr>
+          <w:rFonts w:ascii="Arial" w:hAnsi="Arial" w:cs="Arial" w:eastAsia="Arial"/>
           <w:b/>
+          <w:sz w:val="24"/>
         </w:rPr>
         <w:t xml:space="preserve">Palavras-Chave: </w:t>
       </w:r>
       <w:r>
         <w:rPr>
+          <w:rFonts w:ascii="Arial" w:hAnsi="Arial" w:cs="Arial" w:eastAsia="Arial"/>
           <w:b w:val="0"/>
           <w:i w:val="0"/>
+          <w:sz w:val="24"/>
         </w:rPr>
         <w:t>Sistemas de apoio à decisão; Gestão de compras; Compras hospitalares; Integração via API; Modelo de Aceitação de Tecnologia.</w:t>
       </w:r>
@@ -159,7 +180,9 @@
       </w:pPr>
       <w:r>
         <w:rPr>
+          <w:rFonts w:ascii="Arial" w:hAnsi="Arial" w:cs="Arial" w:eastAsia="Arial"/>
           <w:b/>
+          <w:sz w:val="24"/>
         </w:rPr>
         <w:t>ABSTRACT</w:t>
       </w:r>
@@ -178,23 +201,29 @@
       </w:pPr>
       <w:r>
         <w:rPr>
+          <w:rFonts w:ascii="Arial" w:hAnsi="Arial" w:cs="Arial" w:eastAsia="Arial"/>
           <w:b w:val="0"/>
           <w:i w:val="0"/>
+          <w:sz w:val="24"/>
         </w:rPr>
         <w:t xml:space="preserve">Hospital purchasing must ensure that drugs, medical supplies and other materials are available at the right time, yet in many institutions the detection of items below minimum stock, the request for quotations and the comparison of bids still rely on spreadsheets, e-mails and phone calls. This work aimed to develop and evaluate Provisa, a web-based decision support system that reads stock levels through an Application Programming Interface (API), automatically sends requests for quotation to suppliers and ranks the bids by a weighted score of price, delivery time, availability and supplier history, while the final decision remains with the buyer. The research is applied, exploratory and descriptive, with a qualitative and quantitative approach. It consisted of building a functional prototype, tested in a simulated hospital scenario, and of assessing user acceptance with a questionnaire based on the Technology Acceptance Model (TAM). In the tests, the 13 steps of the manual process were reduced to four actions by the buyer, bids were entered by the suppliers themselves and every decision became traceable. </w:t>
       </w:r>
       <w:r>
         <w:rPr>
+          <w:rFonts w:ascii="Arial" w:hAnsi="Arial" w:cs="Arial" w:eastAsia="Arial"/>
           <w:b w:val="0"/>
           <w:i w:val="0"/>
           <w:highlight w:val="yellow"/>
+          <w:sz w:val="24"/>
         </w:rPr>
         <w:t>AQUI IREI COLOCAR, EM INGLÊS, AS MÉDIAS DE UTILIDADE E DE FACILIDADE DE USO.</w:t>
       </w:r>
       <w:r>
         <w:rPr>
+          <w:rFonts w:ascii="Arial" w:hAnsi="Arial" w:cs="Arial" w:eastAsia="Arial"/>
           <w:b w:val="0"/>
           <w:i w:val="0"/>
+          <w:sz w:val="24"/>
         </w:rPr>
         <w:t xml:space="preserve"> The results suggest that stock integration, quotation automation and multi-criteria comparison make the purchasing process faster, more standardized and more transparent, without replacing the buyer's judgment.</w:t>
       </w:r>
@@ -212,14 +241,18 @@
       </w:pPr>
       <w:r>
         <w:rPr>
+          <w:rFonts w:ascii="Arial" w:hAnsi="Arial" w:cs="Arial" w:eastAsia="Arial"/>
           <w:b/>
+          <w:sz w:val="24"/>
         </w:rPr>
         <w:t xml:space="preserve">Keywords: </w:t>
       </w:r>
       <w:r>
         <w:rPr>
+          <w:rFonts w:ascii="Arial" w:hAnsi="Arial" w:cs="Arial" w:eastAsia="Arial"/>
           <w:b w:val="0"/>
           <w:i w:val="0"/>
+          <w:sz w:val="24"/>
         </w:rPr>
         <w:t>Decision support systems; Purchasing management; Hospital procurement; API integration; Technology Acceptance Model.</w:t>
       </w:r>
@@ -238,7 +271,9 @@
       </w:pPr>
       <w:r>
         <w:rPr>
+          <w:rFonts w:ascii="Arial" w:hAnsi="Arial" w:cs="Arial" w:eastAsia="Arial"/>
           <w:b/>
+          <w:sz w:val="24"/>
         </w:rPr>
         <w:t>1 INTRODUÇÃO</w:t>
       </w:r>
@@ -258,8 +293,10 @@
       </w:pPr>
       <w:r>
         <w:rPr>
+          <w:rFonts w:ascii="Arial" w:hAnsi="Arial" w:cs="Arial" w:eastAsia="Arial"/>
           <w:b w:val="0"/>
           <w:i w:val="0"/>
+          <w:sz w:val="24"/>
         </w:rPr>
         <w:t>A gestão de compras e o controle de estoque determinam a disponibilidade dos materiais de que dependem os processos de uma organização. Segundo Chopra e Meindl (2016), as decisões sobre estoque, fornecedores e compras influenciam diretamente o custo e o nível de serviço da cadeia de suprimentos. No hospital, a falta de um medicamento ou de um material médico-hospitalar pode comprometer a assistência ao paciente (BARBIERI; MACHLINE, 2009), e o setor de compras precisa perceber rapidamente quando um item chega ao estoque mínimo, consultar vários fornecedores e escolher a proposta mais vantajosa considerando preço, prazo, disponibilidade e confiabilidade (INFANTE; SANTOS, 2007). Quando essas tarefas dependem de planilhas, e-mails e telefonemas, surgem atrasos, erros de digitação e dificuldade para comparar propostas.</w:t>
       </w:r>
@@ -272,8 +309,10 @@
       </w:pPr>
       <w:r>
         <w:rPr>
+          <w:rFonts w:ascii="Arial" w:hAnsi="Arial" w:cs="Arial" w:eastAsia="Arial"/>
           <w:b w:val="0"/>
           <w:i w:val="0"/>
+          <w:sz w:val="24"/>
         </w:rPr>
         <w:t>Diante disso, o problema de pesquisa é: como uma plataforma web integrada ao sistema de estoque por meio de API pode reduzir o tempo entre a identificação de itens abaixo do estoque mínimo e a realização de cotações, apoiando a escolha da melhor proposta? Foram formuladas quatro hipóteses: (H1) a plataforma reduz o tempo gasto na busca, organização e comparação de propostas; (H2) a integração via API reduz erros de digitação, de conferência e de comunicação entre setores; (H3) a comparação por múltiplos critérios melhora a qualidade das informações para a decisão; e (H4) a centralização das informações aumenta a transparência e a rastreabilidade do processo.</w:t>
       </w:r>
@@ -286,8 +325,10 @@
       </w:pPr>
       <w:r>
         <w:rPr>
+          <w:rFonts w:ascii="Arial" w:hAnsi="Arial" w:cs="Arial" w:eastAsia="Arial"/>
           <w:b w:val="0"/>
           <w:i w:val="0"/>
+          <w:sz w:val="24"/>
         </w:rPr>
         <w:t>O objetivo geral é desenvolver e avaliar o Provisa, uma plataforma web de apoio à decisão que identifica automaticamente os itens abaixo do estoque mínimo, envia pedidos de cotação aos fornecedores e classifica as propostas por preço, prazo de entrega, disponibilidade e histórico do fornecedor. Os objetivos específicos são: integrar o sistema de compras a uma API de estoque; automatizar o envio e o acompanhamento das cotações; implementar um algoritmo de pontuação ponderada; e avaliar a solução pela comparação com o processo manual e pela aceitação dos usuários. O trabalho se justifica por reduzir tarefas repetitivas do comprador e o risco de ruptura de estoque e por registrar a justificativa de cada compra, além de mostrar como um algoritmo de pontuação pode apoiar, sem substituir, a decisão humana. O artigo apresenta a revisão de literatura (seção 2), os materiais e métodos (seção 3), os resultados e a discussão (seção 4) e a conclusão.</w:t>
       </w:r>
@@ -306,7 +347,9 @@
       </w:pPr>
       <w:r>
         <w:rPr>
+          <w:rFonts w:ascii="Arial" w:hAnsi="Arial" w:cs="Arial" w:eastAsia="Arial"/>
           <w:b/>
+          <w:sz w:val="24"/>
         </w:rPr>
         <w:t>2 REVISÃO DE LITERATURA</w:t>
       </w:r>
@@ -326,7 +369,9 @@
       </w:pPr>
       <w:r>
         <w:rPr>
+          <w:rFonts w:ascii="Arial" w:hAnsi="Arial" w:cs="Arial" w:eastAsia="Arial"/>
           <w:b w:val="0"/>
+          <w:sz w:val="24"/>
         </w:rPr>
         <w:t>2.1 COMPRAS HOSPITALARES E SISTEMAS DE APOIO À DECISÃO</w:t>
       </w:r>
@@ -346,8 +391,10 @@
       </w:pPr>
       <w:r>
         <w:rPr>
+          <w:rFonts w:ascii="Arial" w:hAnsi="Arial" w:cs="Arial" w:eastAsia="Arial"/>
           <w:b w:val="0"/>
           <w:i w:val="0"/>
+          <w:sz w:val="24"/>
         </w:rPr>
         <w:t>Barbieri e Machline (2009) apontam que a logística hospitalar deve conciliar o controle de custos com a garantia de abastecimento, o que exige definir estoques mínimos, acompanhar o consumo de cada setor e manter um cadastro confiável de fornecedores. O estoque mínimo, ou ponto de reposição, é o nível a partir do qual uma nova compra deve ser iniciada para que o item não falte durante o tempo de reposição. Infante e Santos (2007) observam que as falhas de abastecimento costumam resultar de problemas de informação e de coordenação entre os setores, e não apenas da falta de recursos.</w:t>
       </w:r>
@@ -360,8 +407,10 @@
       </w:pPr>
       <w:r>
         <w:rPr>
+          <w:rFonts w:ascii="Arial" w:hAnsi="Arial" w:cs="Arial" w:eastAsia="Arial"/>
           <w:b w:val="0"/>
           <w:i w:val="0"/>
+          <w:sz w:val="24"/>
         </w:rPr>
         <w:t>Os sistemas de informação coletam, processam e distribuem informações para apoiar o controle e a decisão nas organizações (LAUDON; LAUDON, 2016). Entre eles, os sistemas de apoio à decisão (SAD) organizam dados, aplicam modelos de análise e apresentam os resultados de forma que o decisor compreenda as consequências de cada opção, sem tomar a decisão por ele (POWER, 2002). Esse princípio orientou o Provisa: o sistema recomenda uma proposta, mas a aprovação é sempre do comprador.</w:t>
       </w:r>
@@ -380,7 +429,9 @@
       </w:pPr>
       <w:r>
         <w:rPr>
+          <w:rFonts w:ascii="Arial" w:hAnsi="Arial" w:cs="Arial" w:eastAsia="Arial"/>
           <w:b w:val="0"/>
+          <w:sz w:val="24"/>
         </w:rPr>
         <w:t>2.2 SELEÇÃO DE FORNECEDORES POR MÚLTIPLOS CRITÉRIOS</w:t>
       </w:r>
@@ -400,8 +451,10 @@
       </w:pPr>
       <w:r>
         <w:rPr>
+          <w:rFonts w:ascii="Arial" w:hAnsi="Arial" w:cs="Arial" w:eastAsia="Arial"/>
           <w:b w:val="0"/>
           <w:i w:val="0"/>
+          <w:sz w:val="24"/>
         </w:rPr>
         <w:t>A escolha de fornecedores é um problema de decisão com múltiplos critérios. Dickson (1966) identificou 23 critérios usados por compradores, com destaque para qualidade, entrega no prazo, histórico de desempenho e preço. Weber, Current e Benton (1991), ao revisarem 74 artigos, confirmaram que preço, entrega e qualidade são os critérios mais citados e que a ponderação linear está entre os métodos mais usados, por ser simples de calcular e de explicar. Na soma ponderada, cada critério recebe uma nota normalizada e um peso, e a pontuação final é a soma das notas multiplicadas pelos pesos. A vantagem é a transparência; a limitação é a sensibilidade aos pesos, o que justifica permitir ao usuário testar como a recomendação muda com as prioridades.</w:t>
       </w:r>
@@ -420,7 +473,9 @@
       </w:pPr>
       <w:r>
         <w:rPr>
+          <w:rFonts w:ascii="Arial" w:hAnsi="Arial" w:cs="Arial" w:eastAsia="Arial"/>
           <w:b w:val="0"/>
+          <w:sz w:val="24"/>
         </w:rPr>
         <w:t>2.3 INTEGRAÇÃO POR API E AUTOMAÇÃO DE PROCESSOS</w:t>
       </w:r>
@@ -440,22 +495,28 @@
       </w:pPr>
       <w:r>
         <w:rPr>
+          <w:rFonts w:ascii="Arial" w:hAnsi="Arial" w:cs="Arial" w:eastAsia="Arial"/>
           <w:b w:val="0"/>
           <w:i w:val="0"/>
+          <w:sz w:val="24"/>
         </w:rPr>
         <w:t xml:space="preserve">Uma Interface de Programação de Aplicações (API) define como um sistema solicita dados ou serviços de outro de forma padronizada. O estilo </w:t>
       </w:r>
       <w:r>
         <w:rPr>
+          <w:rFonts w:ascii="Arial" w:hAnsi="Arial" w:cs="Arial" w:eastAsia="Arial"/>
           <w:b w:val="0"/>
           <w:i/>
+          <w:sz w:val="24"/>
         </w:rPr>
         <w:t>Representational State Transfer</w:t>
       </w:r>
       <w:r>
         <w:rPr>
+          <w:rFonts w:ascii="Arial" w:hAnsi="Arial" w:cs="Arial" w:eastAsia="Arial"/>
           <w:b w:val="0"/>
           <w:i w:val="0"/>
+          <w:sz w:val="24"/>
         </w:rPr>
         <w:t xml:space="preserve"> (REST), descrito por Fielding (2000), organiza essa comunicação em recursos acessados pelo protocolo HTTP, o que facilita integrar aplicações feitas em tecnologias diferentes. Neste trabalho, a API representa o sistema de estoque do hospital: em vez de o comprador conferir e digitar as quantidades, o sistema de compras recebe os saldos já estruturados. Davenport (1993) argumenta que a tecnologia gera mais valor quando redesenha o processo, e não quando apenas informatiza as etapas existentes; no setor de compras, a verificação do estoque, o envio e a cobrança das cotações e o cálculo do comparativo são candidatos naturais à automação.</w:t>
       </w:r>
@@ -474,7 +535,9 @@
       </w:pPr>
       <w:r>
         <w:rPr>
+          <w:rFonts w:ascii="Arial" w:hAnsi="Arial" w:cs="Arial" w:eastAsia="Arial"/>
           <w:b w:val="0"/>
+          <w:sz w:val="24"/>
         </w:rPr>
         <w:t>2.4 MODELO DE ACEITAÇÃO DE TECNOLOGIA (TAM)</w:t>
       </w:r>
@@ -494,8 +557,10 @@
       </w:pPr>
       <w:r>
         <w:rPr>
+          <w:rFonts w:ascii="Arial" w:hAnsi="Arial" w:cs="Arial" w:eastAsia="Arial"/>
           <w:b w:val="0"/>
           <w:i w:val="0"/>
+          <w:sz w:val="24"/>
         </w:rPr>
         <w:t>O Modelo de Aceitação de Tecnologia, proposto por Davis (1989), explica a adoção de um sistema por duas percepções: a utilidade percebida, grau em que a pessoa acredita que o sistema melhora o seu desempenho, e a facilidade de uso percebida, grau em que acredita que usá-lo exige pouco esforço. Davis, Bagozzi e Warshaw (1989) acrescentaram a atitude e a intenção de uso, que é a melhor preditora do uso real. Por ser simples e amplamente validado, o TAM é adequado para avaliar protótipos com grupos pequenos, e a confiabilidade das escalas é verificada pelo alfa de Cronbach (CRONBACH, 1951), considerando-se aceitáveis valores a partir de 0,70.</w:t>
       </w:r>
@@ -514,7 +579,9 @@
       </w:pPr>
       <w:r>
         <w:rPr>
+          <w:rFonts w:ascii="Arial" w:hAnsi="Arial" w:cs="Arial" w:eastAsia="Arial"/>
           <w:b w:val="0"/>
+          <w:sz w:val="24"/>
         </w:rPr>
         <w:t>2.5 TRABALHOS CORRELATOS</w:t>
       </w:r>
@@ -534,22 +601,28 @@
       </w:pPr>
       <w:r>
         <w:rPr>
+          <w:rFonts w:ascii="Arial" w:hAnsi="Arial" w:cs="Arial" w:eastAsia="Arial"/>
           <w:b w:val="0"/>
           <w:i w:val="0"/>
+          <w:sz w:val="24"/>
         </w:rPr>
         <w:t xml:space="preserve">Belli (2019) desenvolveu uma página web em que fornecedores informam disponibilidade, preço e prazo de uma solicitação de compra, com os dados enviados ao módulo de compras de um sistema de gestão empresarial (ERP), mas a comparação e a escolha continuam a cargo do comprador. Bernardi </w:t>
       </w:r>
       <w:r>
         <w:rPr>
+          <w:rFonts w:ascii="Arial" w:hAnsi="Arial" w:cs="Arial" w:eastAsia="Arial"/>
           <w:b w:val="0"/>
           <w:i/>
+          <w:sz w:val="24"/>
         </w:rPr>
         <w:t>et al.</w:t>
       </w:r>
       <w:r>
         <w:rPr>
+          <w:rFonts w:ascii="Arial" w:hAnsi="Arial" w:cs="Arial" w:eastAsia="Arial"/>
           <w:b w:val="0"/>
           <w:i w:val="0"/>
+          <w:sz w:val="24"/>
         </w:rPr>
         <w:t xml:space="preserve"> (2019) aplicaram os métodos AHP e PROMETHEE para classificar distribuidores de produtos de limpeza de um hospital, e Paraguassu e Macedo (2013) usaram o AHP para ponderar critérios de seleção de fornecedores em Bio-Manguinhos/Fiocruz. Esses estudos aplicam a decisão multicritério fora de um sistema que acompanhe a compra do início ao fim. O Quadro 1 resume a comparação: a contribuição do Provisa está em reunir a detecção automática pela API, o envio e o acompanhamento das cotações, a classificação multicritério e a avaliação pelo TAM.</w:t>
       </w:r>
@@ -562,7 +635,7 @@
     </w:p>
     <w:tbl>
       <w:tblPr>
-        <w:tblW w:type="auto" w:w="0"/>
+        <w:tblW w:type="dxa" w:w="9071"/>
         <w:jc w:val="center"/>
         <w:tblLayout w:type="fixed"/>
         <w:tblLook w:firstColumn="1" w:firstRow="1" w:lastColumn="0" w:lastRow="0" w:noHBand="0" w:noVBand="1" w:val="04A0"/>
@@ -597,6 +670,7 @@
             </w:pPr>
             <w:r>
               <w:rPr>
+                <w:rFonts w:ascii="Arial" w:hAnsi="Arial" w:cs="Arial" w:eastAsia="Arial"/>
                 <w:b/>
                 <w:i w:val="0"/>
                 <w:sz w:val="20"/>
@@ -623,6 +697,7 @@
             </w:pPr>
             <w:r>
               <w:rPr>
+                <w:rFonts w:ascii="Arial" w:hAnsi="Arial" w:cs="Arial" w:eastAsia="Arial"/>
                 <w:b/>
                 <w:i w:val="0"/>
                 <w:sz w:val="20"/>
@@ -649,6 +724,7 @@
             </w:pPr>
             <w:r>
               <w:rPr>
+                <w:rFonts w:ascii="Arial" w:hAnsi="Arial" w:cs="Arial" w:eastAsia="Arial"/>
                 <w:b/>
                 <w:i w:val="0"/>
                 <w:sz w:val="20"/>
@@ -675,6 +751,7 @@
             </w:pPr>
             <w:r>
               <w:rPr>
+                <w:rFonts w:ascii="Arial" w:hAnsi="Arial" w:cs="Arial" w:eastAsia="Arial"/>
                 <w:b/>
                 <w:i w:val="0"/>
                 <w:sz w:val="20"/>
@@ -701,6 +778,7 @@
             </w:pPr>
             <w:r>
               <w:rPr>
+                <w:rFonts w:ascii="Arial" w:hAnsi="Arial" w:cs="Arial" w:eastAsia="Arial"/>
                 <w:b/>
                 <w:i w:val="0"/>
                 <w:sz w:val="20"/>
@@ -732,6 +810,7 @@
             </w:pPr>
             <w:r>
               <w:rPr>
+                <w:rFonts w:ascii="Arial" w:hAnsi="Arial" w:cs="Arial" w:eastAsia="Arial"/>
                 <w:b w:val="0"/>
                 <w:i w:val="0"/>
                 <w:sz w:val="20"/>
@@ -758,6 +837,7 @@
             </w:pPr>
             <w:r>
               <w:rPr>
+                <w:rFonts w:ascii="Arial" w:hAnsi="Arial" w:cs="Arial" w:eastAsia="Arial"/>
                 <w:b w:val="0"/>
                 <w:i w:val="0"/>
                 <w:sz w:val="20"/>
@@ -784,6 +864,7 @@
             </w:pPr>
             <w:r>
               <w:rPr>
+                <w:rFonts w:ascii="Arial" w:hAnsi="Arial" w:cs="Arial" w:eastAsia="Arial"/>
                 <w:b w:val="0"/>
                 <w:i w:val="0"/>
                 <w:sz w:val="20"/>
@@ -810,6 +891,7 @@
             </w:pPr>
             <w:r>
               <w:rPr>
+                <w:rFonts w:ascii="Arial" w:hAnsi="Arial" w:cs="Arial" w:eastAsia="Arial"/>
                 <w:b w:val="0"/>
                 <w:i w:val="0"/>
                 <w:sz w:val="20"/>
@@ -836,6 +918,7 @@
             </w:pPr>
             <w:r>
               <w:rPr>
+                <w:rFonts w:ascii="Arial" w:hAnsi="Arial" w:cs="Arial" w:eastAsia="Arial"/>
                 <w:b w:val="0"/>
                 <w:i w:val="0"/>
                 <w:sz w:val="20"/>
@@ -867,6 +950,7 @@
             </w:pPr>
             <w:r>
               <w:rPr>
+                <w:rFonts w:ascii="Arial" w:hAnsi="Arial" w:cs="Arial" w:eastAsia="Arial"/>
                 <w:b w:val="0"/>
                 <w:i w:val="0"/>
                 <w:sz w:val="20"/>
@@ -893,6 +977,7 @@
             </w:pPr>
             <w:r>
               <w:rPr>
+                <w:rFonts w:ascii="Arial" w:hAnsi="Arial" w:cs="Arial" w:eastAsia="Arial"/>
                 <w:b w:val="0"/>
                 <w:i w:val="0"/>
                 <w:sz w:val="20"/>
@@ -919,6 +1004,7 @@
             </w:pPr>
             <w:r>
               <w:rPr>
+                <w:rFonts w:ascii="Arial" w:hAnsi="Arial" w:cs="Arial" w:eastAsia="Arial"/>
                 <w:b w:val="0"/>
                 <w:i w:val="0"/>
                 <w:sz w:val="20"/>
@@ -945,6 +1031,7 @@
             </w:pPr>
             <w:r>
               <w:rPr>
+                <w:rFonts w:ascii="Arial" w:hAnsi="Arial" w:cs="Arial" w:eastAsia="Arial"/>
                 <w:b w:val="0"/>
                 <w:i w:val="0"/>
                 <w:sz w:val="20"/>
@@ -971,6 +1058,7 @@
             </w:pPr>
             <w:r>
               <w:rPr>
+                <w:rFonts w:ascii="Arial" w:hAnsi="Arial" w:cs="Arial" w:eastAsia="Arial"/>
                 <w:b w:val="0"/>
                 <w:i w:val="0"/>
                 <w:sz w:val="20"/>
@@ -1002,6 +1090,7 @@
             </w:pPr>
             <w:r>
               <w:rPr>
+                <w:rFonts w:ascii="Arial" w:hAnsi="Arial" w:cs="Arial" w:eastAsia="Arial"/>
                 <w:b w:val="0"/>
                 <w:i w:val="0"/>
                 <w:sz w:val="20"/>
@@ -1028,6 +1117,7 @@
             </w:pPr>
             <w:r>
               <w:rPr>
+                <w:rFonts w:ascii="Arial" w:hAnsi="Arial" w:cs="Arial" w:eastAsia="Arial"/>
                 <w:b w:val="0"/>
                 <w:i w:val="0"/>
                 <w:sz w:val="20"/>
@@ -1054,6 +1144,7 @@
             </w:pPr>
             <w:r>
               <w:rPr>
+                <w:rFonts w:ascii="Arial" w:hAnsi="Arial" w:cs="Arial" w:eastAsia="Arial"/>
                 <w:b w:val="0"/>
                 <w:i w:val="0"/>
                 <w:sz w:val="20"/>
@@ -1080,6 +1171,7 @@
             </w:pPr>
             <w:r>
               <w:rPr>
+                <w:rFonts w:ascii="Arial" w:hAnsi="Arial" w:cs="Arial" w:eastAsia="Arial"/>
                 <w:b w:val="0"/>
                 <w:i w:val="0"/>
                 <w:sz w:val="20"/>
@@ -1106,6 +1198,7 @@
             </w:pPr>
             <w:r>
               <w:rPr>
+                <w:rFonts w:ascii="Arial" w:hAnsi="Arial" w:cs="Arial" w:eastAsia="Arial"/>
                 <w:b w:val="0"/>
                 <w:i w:val="0"/>
                 <w:sz w:val="20"/>
@@ -1137,6 +1230,7 @@
             </w:pPr>
             <w:r>
               <w:rPr>
+                <w:rFonts w:ascii="Arial" w:hAnsi="Arial" w:cs="Arial" w:eastAsia="Arial"/>
                 <w:b w:val="0"/>
                 <w:i w:val="0"/>
                 <w:sz w:val="20"/>
@@ -1163,6 +1257,7 @@
             </w:pPr>
             <w:r>
               <w:rPr>
+                <w:rFonts w:ascii="Arial" w:hAnsi="Arial" w:cs="Arial" w:eastAsia="Arial"/>
                 <w:b w:val="0"/>
                 <w:i w:val="0"/>
                 <w:sz w:val="20"/>
@@ -1189,6 +1284,7 @@
             </w:pPr>
             <w:r>
               <w:rPr>
+                <w:rFonts w:ascii="Arial" w:hAnsi="Arial" w:cs="Arial" w:eastAsia="Arial"/>
                 <w:b w:val="0"/>
                 <w:i w:val="0"/>
                 <w:sz w:val="20"/>
@@ -1215,6 +1311,7 @@
             </w:pPr>
             <w:r>
               <w:rPr>
+                <w:rFonts w:ascii="Arial" w:hAnsi="Arial" w:cs="Arial" w:eastAsia="Arial"/>
                 <w:b w:val="0"/>
                 <w:i w:val="0"/>
                 <w:sz w:val="20"/>
@@ -1241,6 +1338,7 @@
             </w:pPr>
             <w:r>
               <w:rPr>
+                <w:rFonts w:ascii="Arial" w:hAnsi="Arial" w:cs="Arial" w:eastAsia="Arial"/>
                 <w:b w:val="0"/>
                 <w:i w:val="0"/>
                 <w:sz w:val="20"/>
@@ -1272,6 +1370,7 @@
             </w:pPr>
             <w:r>
               <w:rPr>
+                <w:rFonts w:ascii="Arial" w:hAnsi="Arial" w:cs="Arial" w:eastAsia="Arial"/>
                 <w:b w:val="0"/>
                 <w:i w:val="0"/>
                 <w:sz w:val="20"/>
@@ -1298,6 +1397,7 @@
             </w:pPr>
             <w:r>
               <w:rPr>
+                <w:rFonts w:ascii="Arial" w:hAnsi="Arial" w:cs="Arial" w:eastAsia="Arial"/>
                 <w:b w:val="0"/>
                 <w:i w:val="0"/>
                 <w:sz w:val="20"/>
@@ -1324,6 +1424,7 @@
             </w:pPr>
             <w:r>
               <w:rPr>
+                <w:rFonts w:ascii="Arial" w:hAnsi="Arial" w:cs="Arial" w:eastAsia="Arial"/>
                 <w:b w:val="0"/>
                 <w:i w:val="0"/>
                 <w:sz w:val="20"/>
@@ -1350,6 +1451,7 @@
             </w:pPr>
             <w:r>
               <w:rPr>
+                <w:rFonts w:ascii="Arial" w:hAnsi="Arial" w:cs="Arial" w:eastAsia="Arial"/>
                 <w:b w:val="0"/>
                 <w:i w:val="0"/>
                 <w:sz w:val="20"/>
@@ -1376,6 +1478,7 @@
             </w:pPr>
             <w:r>
               <w:rPr>
+                <w:rFonts w:ascii="Arial" w:hAnsi="Arial" w:cs="Arial" w:eastAsia="Arial"/>
                 <w:b w:val="0"/>
                 <w:i w:val="0"/>
                 <w:sz w:val="20"/>
@@ -1394,6 +1497,7 @@
       </w:pPr>
       <w:r>
         <w:rPr>
+          <w:rFonts w:ascii="Arial" w:hAnsi="Arial" w:cs="Arial" w:eastAsia="Arial"/>
           <w:b/>
           <w:i w:val="0"/>
           <w:sz w:val="20"/>
@@ -1408,6 +1512,7 @@
       </w:pPr>
       <w:r>
         <w:rPr>
+          <w:rFonts w:ascii="Arial" w:hAnsi="Arial" w:cs="Arial" w:eastAsia="Arial"/>
           <w:b w:val="0"/>
           <w:i w:val="0"/>
           <w:sz w:val="20"/>
@@ -1429,7 +1534,9 @@
       </w:pPr>
       <w:r>
         <w:rPr>
+          <w:rFonts w:ascii="Arial" w:hAnsi="Arial" w:cs="Arial" w:eastAsia="Arial"/>
           <w:b/>
+          <w:sz w:val="24"/>
         </w:rPr>
         <w:t>3 MATERIAIS E MÉTODOS</w:t>
       </w:r>
@@ -1449,8 +1556,10 @@
       </w:pPr>
       <w:r>
         <w:rPr>
+          <w:rFonts w:ascii="Arial" w:hAnsi="Arial" w:cs="Arial" w:eastAsia="Arial"/>
           <w:b w:val="0"/>
           <w:i w:val="0"/>
+          <w:sz w:val="24"/>
         </w:rPr>
         <w:t>A pesquisa é aplicada, exploratória e descritiva (GIL, 2002), com abordagem qualitativa e quantitativa, e o procedimento técnico é o desenvolvimento de um protótipo funcional, avaliado em um cenário hospitalar simulado. Os requisitos foram definidos a partir do fluxo típico de compras de um hospital, resultando em 12 requisitos funcionais e 7 não funcionais.</w:t>
       </w:r>
@@ -1463,8 +1572,10 @@
       </w:pPr>
       <w:r>
         <w:rPr>
+          <w:rFonts w:ascii="Arial" w:hAnsi="Arial" w:cs="Arial" w:eastAsia="Arial"/>
           <w:b w:val="0"/>
           <w:i w:val="0"/>
+          <w:sz w:val="24"/>
         </w:rPr>
         <w:t>O sistema foi desenvolvido com Next.js, React e TypeScript na interface e nas regras de negócio, PostgreSQL com Prisma no banco de dados, Express na API de estoque, Resend no envio de e-mails e PDFKit na geração do pedido de compra, todos gratuitos e de código aberto, e foi publicado na nuvem Render. A aplicação e a API são serviços independentes: a aplicação consulta a API por HTTP, com chave de acesso, a cada cinco minutos ou quando o comprador solicita, de modo que, em um hospital real, basta trocar a API simulada pela do sistema de estoque existente (Figura 1).</w:t>
       </w:r>
@@ -1476,6 +1587,10 @@
         <w:jc w:val="center"/>
       </w:pPr>
       <w:r>
+        <w:rPr>
+          <w:rFonts w:ascii="Arial" w:hAnsi="Arial" w:cs="Arial" w:eastAsia="Arial"/>
+          <w:sz w:val="24"/>
+        </w:rPr>
         <w:drawing>
           <wp:inline xmlns:a="http://schemas.openxmlformats.org/drawingml/2006/main" xmlns:pic="http://schemas.openxmlformats.org/drawingml/2006/picture">
             <wp:extent cx="4860000" cy="2292453"/>
@@ -1518,6 +1633,7 @@
       </w:pPr>
       <w:r>
         <w:rPr>
+          <w:rFonts w:ascii="Arial" w:hAnsi="Arial" w:cs="Arial" w:eastAsia="Arial"/>
           <w:b/>
           <w:i w:val="0"/>
           <w:sz w:val="20"/>
@@ -1532,6 +1648,7 @@
       </w:pPr>
       <w:r>
         <w:rPr>
+          <w:rFonts w:ascii="Arial" w:hAnsi="Arial" w:cs="Arial" w:eastAsia="Arial"/>
           <w:b w:val="0"/>
           <w:i w:val="0"/>
           <w:sz w:val="20"/>
@@ -1547,8 +1664,10 @@
       </w:pPr>
       <w:r>
         <w:rPr>
+          <w:rFonts w:ascii="Arial" w:hAnsi="Arial" w:cs="Arial" w:eastAsia="Arial"/>
           <w:b w:val="0"/>
           <w:i w:val="0"/>
+          <w:sz w:val="24"/>
         </w:rPr>
         <w:t>Para os testes, foi criado um hospital fictício com nove setores, 12 produtos em oito categorias e seis fornecedores com notas de histórico diferentes, e a API simula o consumo dos setores. As propostas são classificadas por soma ponderada, com cada critério recebendo uma nota de 0 a 1:</w:t>
       </w:r>
@@ -1561,8 +1680,10 @@
       </w:pPr>
       <w:r>
         <w:rPr>
+          <w:rFonts w:ascii="Arial" w:hAnsi="Arial" w:cs="Arial" w:eastAsia="Arial"/>
           <w:b w:val="0"/>
           <w:i w:val="0"/>
+          <w:sz w:val="24"/>
         </w:rPr>
         <w:t>A) preço: custo dos itens pelo menor preço encontrado para cada item, dividido pelo custo da proposta;</w:t>
       </w:r>
@@ -1575,8 +1696,10 @@
       </w:pPr>
       <w:r>
         <w:rPr>
+          <w:rFonts w:ascii="Arial" w:hAnsi="Arial" w:cs="Arial" w:eastAsia="Arial"/>
           <w:b w:val="0"/>
           <w:i w:val="0"/>
+          <w:sz w:val="24"/>
         </w:rPr>
         <w:t>B) prazo: menor prazo da cotação dividido pelo prazo da proposta;</w:t>
       </w:r>
@@ -1589,8 +1712,10 @@
       </w:pPr>
       <w:r>
         <w:rPr>
+          <w:rFonts w:ascii="Arial" w:hAnsi="Arial" w:cs="Arial" w:eastAsia="Arial"/>
           <w:b w:val="0"/>
           <w:i w:val="0"/>
+          <w:sz w:val="24"/>
         </w:rPr>
         <w:t>C) disponibilidade: média, por item, da quantidade disponível dividida pela necessária, limitada a 1; e</w:t>
       </w:r>
@@ -1603,8 +1728,10 @@
       </w:pPr>
       <w:r>
         <w:rPr>
+          <w:rFonts w:ascii="Arial" w:hAnsi="Arial" w:cs="Arial" w:eastAsia="Arial"/>
           <w:b w:val="0"/>
           <w:i w:val="0"/>
+          <w:sz w:val="24"/>
         </w:rPr>
         <w:t>D) histórico: nota do fornecedor, de 0 a 5, dividida por 5.</w:t>
       </w:r>
@@ -1617,8 +1744,10 @@
       </w:pPr>
       <w:r>
         <w:rPr>
+          <w:rFonts w:ascii="Arial" w:hAnsi="Arial" w:cs="Arial" w:eastAsia="Arial"/>
           <w:b w:val="0"/>
           <w:i w:val="0"/>
+          <w:sz w:val="24"/>
         </w:rPr>
         <w:t>Os pesos padrão são 40% para preço, 30% para prazo, 20% para disponibilidade e 10% para histórico, alteráveis pelo gestor, e a pontuação final vai de 0 a 100. Uma simulação de pesos permite verificar se a recomendação se mantém quando a prioridade muda.</w:t>
       </w:r>
@@ -1631,31 +1760,39 @@
       </w:pPr>
       <w:r>
         <w:rPr>
+          <w:rFonts w:ascii="Arial" w:hAnsi="Arial" w:cs="Arial" w:eastAsia="Arial"/>
           <w:b w:val="0"/>
           <w:i w:val="0"/>
+          <w:sz w:val="24"/>
         </w:rPr>
         <w:t xml:space="preserve">A avaliação foi feita de duas formas. Na primeira, compararam-se o processo manual e o automatizado pelas hipóteses H1 a H4, com os indicadores do sistema medidos nos seus registros e os tempos manuais estimados para um ciclo típico de compra. </w:t>
       </w:r>
       <w:r>
         <w:rPr>
+          <w:rFonts w:ascii="Arial" w:hAnsi="Arial" w:cs="Arial" w:eastAsia="Arial"/>
           <w:b w:val="0"/>
           <w:i w:val="0"/>
           <w:highlight w:val="yellow"/>
+          <w:sz w:val="24"/>
         </w:rPr>
         <w:t>AQUI IREI COLOCAR OS TEMPOS REAIS DO PROCESSO MANUAL, SE CONSEGUIR COM O SETOR DE COMPRAS DE UM HOSPITAL.</w:t>
       </w:r>
       <w:r>
         <w:rPr>
+          <w:rFonts w:ascii="Arial" w:hAnsi="Arial" w:cs="Arial" w:eastAsia="Arial"/>
           <w:b w:val="0"/>
           <w:i w:val="0"/>
+          <w:sz w:val="24"/>
         </w:rPr>
         <w:t xml:space="preserve"> Na segunda, os participantes executaram um roteiro de sete tarefas no sistema e responderam, pelo Google Forms, a 20 afirmações em escala Likert de cinco pontos, adaptadas de Davis (1989) e de Davis, Bagozzi e Warshaw (1989): oito de utilidade percebida (UP), seis de facilidade de uso percebida (FUP), três de atitude (AT) e três de intenção de uso (IU). O questionário teve termo de consentimento e garantia de anonimato, conforme a Lei Geral de Proteção de Dados (BRASIL, 2018). Os dados foram analisados por média, desvio padrão, percentual de concordância (respostas 4 e 5) e alfa de Cronbach. </w:t>
       </w:r>
       <w:r>
         <w:rPr>
+          <w:rFonts w:ascii="Arial" w:hAnsi="Arial" w:cs="Arial" w:eastAsia="Arial"/>
           <w:b w:val="0"/>
           <w:i w:val="0"/>
           <w:highlight w:val="yellow"/>
+          <w:sz w:val="24"/>
         </w:rPr>
         <w:t>AQUI IREI INFORMAR O PERÍODO DA COLETA E QUANTAS PESSOAS RESPONDERAM AO QUESTIONÁRIO.</w:t>
       </w:r>
@@ -1674,7 +1811,9 @@
       </w:pPr>
       <w:r>
         <w:rPr>
+          <w:rFonts w:ascii="Arial" w:hAnsi="Arial" w:cs="Arial" w:eastAsia="Arial"/>
           <w:b/>
+          <w:sz w:val="24"/>
         </w:rPr>
         <w:t>4 RESULTADOS E DISCUSSÃO</w:t>
       </w:r>
@@ -1694,7 +1833,9 @@
       </w:pPr>
       <w:r>
         <w:rPr>
+          <w:rFonts w:ascii="Arial" w:hAnsi="Arial" w:cs="Arial" w:eastAsia="Arial"/>
           <w:b w:val="0"/>
+          <w:sz w:val="24"/>
         </w:rPr>
         <w:t>4.1 O SISTEMA DESENVOLVIDO</w:t>
       </w:r>
@@ -1714,8 +1855,10 @@
       </w:pPr>
       <w:r>
         <w:rPr>
+          <w:rFonts w:ascii="Arial" w:hAnsi="Arial" w:cs="Arial" w:eastAsia="Arial"/>
           <w:b w:val="0"/>
           <w:i w:val="0"/>
+          <w:sz w:val="24"/>
         </w:rPr>
         <w:t>O Provisa foi publicado na internet e funciona no computador e no celular. Quando a leitura automática do estoque encontra um item abaixo do mínimo, o sistema cria uma necessidade de compra, sugere a quantidade e agrupa as necessidades por categoria. Com um clique, o comprador gera a cotação, e cada fornecedor da categoria recebe por e-mail um link exclusivo para um portal em que informa, sem login, preço, quantidade, prazo e forma de pagamento. Doze horas antes do prazo, quem não respondeu recebe um lembrete. A Figura 2 mostra o fluxo completo.</w:t>
       </w:r>
@@ -1727,6 +1870,10 @@
         <w:jc w:val="center"/>
       </w:pPr>
       <w:r>
+        <w:rPr>
+          <w:rFonts w:ascii="Arial" w:hAnsi="Arial" w:cs="Arial" w:eastAsia="Arial"/>
+          <w:sz w:val="24"/>
+        </w:rPr>
         <w:drawing>
           <wp:inline xmlns:a="http://schemas.openxmlformats.org/drawingml/2006/main" xmlns:pic="http://schemas.openxmlformats.org/drawingml/2006/picture">
             <wp:extent cx="5580000" cy="3800172"/>
@@ -1769,6 +1916,7 @@
       </w:pPr>
       <w:r>
         <w:rPr>
+          <w:rFonts w:ascii="Arial" w:hAnsi="Arial" w:cs="Arial" w:eastAsia="Arial"/>
           <w:b/>
           <w:i w:val="0"/>
           <w:sz w:val="20"/>
@@ -1783,6 +1931,7 @@
       </w:pPr>
       <w:r>
         <w:rPr>
+          <w:rFonts w:ascii="Arial" w:hAnsi="Arial" w:cs="Arial" w:eastAsia="Arial"/>
           <w:b w:val="0"/>
           <w:i w:val="0"/>
           <w:sz w:val="20"/>
@@ -1798,8 +1947,10 @@
       </w:pPr>
       <w:r>
         <w:rPr>
+          <w:rFonts w:ascii="Arial" w:hAnsi="Arial" w:cs="Arial" w:eastAsia="Arial"/>
           <w:b w:val="0"/>
           <w:i w:val="0"/>
+          <w:sz w:val="24"/>
         </w:rPr>
         <w:t>Com as respostas, o sistema apresenta o ranking, a composição da pontuação, os alertas e os preços por item (Figura 3). Na cotação da figura, a proposta mais barata (R$ 493,80) ficou em quarto lugar por ter prazo de 15 dias e histórico baixo, enquanto a primeira colocada, de R$ 600,00, entregava em 2 dias e tinha nota 4,6, somando 92,1 pontos contra 68,6. Se o comprador escolher outra proposta, precisa registrar a justificativa. Após a aprovação, o sistema emite o pedido em PDF, avisa os fornecedores e, com os registros de pagamento e de recebimento, dá entrada no estoque e atualiza a nota do fornecedor. Os 12 requisitos funcionais foram atendidos, e os 27 testes automatizados do algoritmo e das regras de negócio foram aprovados.</w:t>
       </w:r>
@@ -1811,6 +1962,10 @@
         <w:jc w:val="center"/>
       </w:pPr>
       <w:r>
+        <w:rPr>
+          <w:rFonts w:ascii="Arial" w:hAnsi="Arial" w:cs="Arial" w:eastAsia="Arial"/>
+          <w:sz w:val="24"/>
+        </w:rPr>
         <w:drawing>
           <wp:inline xmlns:a="http://schemas.openxmlformats.org/drawingml/2006/main" xmlns:pic="http://schemas.openxmlformats.org/drawingml/2006/picture">
             <wp:extent cx="4680000" cy="3892443"/>
@@ -1853,6 +2008,7 @@
       </w:pPr>
       <w:r>
         <w:rPr>
+          <w:rFonts w:ascii="Arial" w:hAnsi="Arial" w:cs="Arial" w:eastAsia="Arial"/>
           <w:b/>
           <w:i w:val="0"/>
           <w:sz w:val="20"/>
@@ -1867,6 +2023,7 @@
       </w:pPr>
       <w:r>
         <w:rPr>
+          <w:rFonts w:ascii="Arial" w:hAnsi="Arial" w:cs="Arial" w:eastAsia="Arial"/>
           <w:b w:val="0"/>
           <w:i w:val="0"/>
           <w:sz w:val="20"/>
@@ -1888,7 +2045,9 @@
       </w:pPr>
       <w:r>
         <w:rPr>
+          <w:rFonts w:ascii="Arial" w:hAnsi="Arial" w:cs="Arial" w:eastAsia="Arial"/>
           <w:b w:val="0"/>
+          <w:sz w:val="24"/>
         </w:rPr>
         <w:t>4.2 COMPARAÇÃO ENTRE O PROCESSO MANUAL E O AUTOMATIZADO</w:t>
       </w:r>
@@ -1908,8 +2067,10 @@
       </w:pPr>
       <w:r>
         <w:rPr>
+          <w:rFonts w:ascii="Arial" w:hAnsi="Arial" w:cs="Arial" w:eastAsia="Arial"/>
           <w:b w:val="0"/>
           <w:i w:val="0"/>
+          <w:sz w:val="24"/>
         </w:rPr>
         <w:t>No processo manual, o comprador executa 13 etapas, agrupadas na Tabela 1 em cinco atividades; com o sistema, restam quatro ações: revisar a quantidade, aprovar a proposta, registrar o pagamento e registrar o recebimento. No cenário de demonstração, as 26 propostas foram registradas pelos próprios fornecedores, sem digitação do comprador, as leituras do estoque pela API não tiveram falhas e as seis decisões guardaram ranking, pesos e responsável. Como as propostas desse cenário foram simuladas, os números mostram que o sistema registra cada etapa, e não o comportamento de usuários reais.</w:t>
       </w:r>
@@ -1922,6 +2083,7 @@
       </w:pPr>
       <w:r>
         <w:rPr>
+          <w:rFonts w:ascii="Arial" w:hAnsi="Arial" w:cs="Arial" w:eastAsia="Arial"/>
           <w:b/>
           <w:i w:val="0"/>
           <w:sz w:val="20"/>
@@ -1931,7 +2093,7 @@
     </w:p>
     <w:tbl>
       <w:tblPr>
-        <w:tblW w:type="auto" w:w="0"/>
+        <w:tblW w:type="dxa" w:w="9071"/>
         <w:jc w:val="center"/>
         <w:tblLayout w:type="fixed"/>
         <w:tblLook w:firstColumn="1" w:firstRow="1" w:lastColumn="0" w:lastRow="0" w:noHBand="0" w:noVBand="1" w:val="04A0"/>
@@ -1964,6 +2126,7 @@
             </w:pPr>
             <w:r>
               <w:rPr>
+                <w:rFonts w:ascii="Arial" w:hAnsi="Arial" w:cs="Arial" w:eastAsia="Arial"/>
                 <w:b/>
                 <w:i w:val="0"/>
                 <w:sz w:val="20"/>
@@ -1990,6 +2153,7 @@
             </w:pPr>
             <w:r>
               <w:rPr>
+                <w:rFonts w:ascii="Arial" w:hAnsi="Arial" w:cs="Arial" w:eastAsia="Arial"/>
                 <w:b/>
                 <w:i w:val="0"/>
                 <w:sz w:val="20"/>
@@ -2016,6 +2180,7 @@
             </w:pPr>
             <w:r>
               <w:rPr>
+                <w:rFonts w:ascii="Arial" w:hAnsi="Arial" w:cs="Arial" w:eastAsia="Arial"/>
                 <w:b/>
                 <w:i w:val="0"/>
                 <w:sz w:val="20"/>
@@ -2047,6 +2212,7 @@
             </w:pPr>
             <w:r>
               <w:rPr>
+                <w:rFonts w:ascii="Arial" w:hAnsi="Arial" w:cs="Arial" w:eastAsia="Arial"/>
                 <w:b w:val="0"/>
                 <w:i w:val="0"/>
                 <w:sz w:val="20"/>
@@ -2073,6 +2239,7 @@
             </w:pPr>
             <w:r>
               <w:rPr>
+                <w:rFonts w:ascii="Arial" w:hAnsi="Arial" w:cs="Arial" w:eastAsia="Arial"/>
                 <w:b w:val="0"/>
                 <w:i w:val="0"/>
                 <w:sz w:val="20"/>
@@ -2099,6 +2266,7 @@
             </w:pPr>
             <w:r>
               <w:rPr>
+                <w:rFonts w:ascii="Arial" w:hAnsi="Arial" w:cs="Arial" w:eastAsia="Arial"/>
                 <w:b w:val="0"/>
                 <w:i w:val="0"/>
                 <w:sz w:val="20"/>
@@ -2130,6 +2298,7 @@
             </w:pPr>
             <w:r>
               <w:rPr>
+                <w:rFonts w:ascii="Arial" w:hAnsi="Arial" w:cs="Arial" w:eastAsia="Arial"/>
                 <w:b w:val="0"/>
                 <w:i w:val="0"/>
                 <w:sz w:val="20"/>
@@ -2156,6 +2325,7 @@
             </w:pPr>
             <w:r>
               <w:rPr>
+                <w:rFonts w:ascii="Arial" w:hAnsi="Arial" w:cs="Arial" w:eastAsia="Arial"/>
                 <w:b w:val="0"/>
                 <w:i w:val="0"/>
                 <w:sz w:val="20"/>
@@ -2182,6 +2352,7 @@
             </w:pPr>
             <w:r>
               <w:rPr>
+                <w:rFonts w:ascii="Arial" w:hAnsi="Arial" w:cs="Arial" w:eastAsia="Arial"/>
                 <w:b w:val="0"/>
                 <w:i w:val="0"/>
                 <w:sz w:val="20"/>
@@ -2213,6 +2384,7 @@
             </w:pPr>
             <w:r>
               <w:rPr>
+                <w:rFonts w:ascii="Arial" w:hAnsi="Arial" w:cs="Arial" w:eastAsia="Arial"/>
                 <w:b w:val="0"/>
                 <w:i w:val="0"/>
                 <w:sz w:val="20"/>
@@ -2239,6 +2411,7 @@
             </w:pPr>
             <w:r>
               <w:rPr>
+                <w:rFonts w:ascii="Arial" w:hAnsi="Arial" w:cs="Arial" w:eastAsia="Arial"/>
                 <w:b w:val="0"/>
                 <w:i w:val="0"/>
                 <w:sz w:val="20"/>
@@ -2265,6 +2438,7 @@
             </w:pPr>
             <w:r>
               <w:rPr>
+                <w:rFonts w:ascii="Arial" w:hAnsi="Arial" w:cs="Arial" w:eastAsia="Arial"/>
                 <w:b w:val="0"/>
                 <w:i w:val="0"/>
                 <w:sz w:val="20"/>
@@ -2296,6 +2470,7 @@
             </w:pPr>
             <w:r>
               <w:rPr>
+                <w:rFonts w:ascii="Arial" w:hAnsi="Arial" w:cs="Arial" w:eastAsia="Arial"/>
                 <w:b w:val="0"/>
                 <w:i w:val="0"/>
                 <w:sz w:val="20"/>
@@ -2322,6 +2497,7 @@
             </w:pPr>
             <w:r>
               <w:rPr>
+                <w:rFonts w:ascii="Arial" w:hAnsi="Arial" w:cs="Arial" w:eastAsia="Arial"/>
                 <w:b w:val="0"/>
                 <w:i w:val="0"/>
                 <w:sz w:val="20"/>
@@ -2348,6 +2524,7 @@
             </w:pPr>
             <w:r>
               <w:rPr>
+                <w:rFonts w:ascii="Arial" w:hAnsi="Arial" w:cs="Arial" w:eastAsia="Arial"/>
                 <w:b w:val="0"/>
                 <w:i w:val="0"/>
                 <w:sz w:val="20"/>
@@ -2379,6 +2556,7 @@
             </w:pPr>
             <w:r>
               <w:rPr>
+                <w:rFonts w:ascii="Arial" w:hAnsi="Arial" w:cs="Arial" w:eastAsia="Arial"/>
                 <w:b w:val="0"/>
                 <w:i w:val="0"/>
                 <w:sz w:val="20"/>
@@ -2405,6 +2583,7 @@
             </w:pPr>
             <w:r>
               <w:rPr>
+                <w:rFonts w:ascii="Arial" w:hAnsi="Arial" w:cs="Arial" w:eastAsia="Arial"/>
                 <w:b w:val="0"/>
                 <w:i w:val="0"/>
                 <w:sz w:val="20"/>
@@ -2431,6 +2610,7 @@
             </w:pPr>
             <w:r>
               <w:rPr>
+                <w:rFonts w:ascii="Arial" w:hAnsi="Arial" w:cs="Arial" w:eastAsia="Arial"/>
                 <w:b w:val="0"/>
                 <w:i w:val="0"/>
                 <w:sz w:val="20"/>
@@ -2461,6 +2641,7 @@
             </w:pPr>
             <w:r>
               <w:rPr>
+                <w:rFonts w:ascii="Arial" w:hAnsi="Arial" w:cs="Arial" w:eastAsia="Arial"/>
                 <w:b/>
                 <w:i w:val="0"/>
                 <w:sz w:val="20"/>
@@ -2486,6 +2667,7 @@
             </w:pPr>
             <w:r>
               <w:rPr>
+                <w:rFonts w:ascii="Arial" w:hAnsi="Arial" w:cs="Arial" w:eastAsia="Arial"/>
                 <w:b/>
                 <w:i w:val="0"/>
                 <w:sz w:val="20"/>
@@ -2511,6 +2693,7 @@
             </w:pPr>
             <w:r>
               <w:rPr>
+                <w:rFonts w:ascii="Arial" w:hAnsi="Arial" w:cs="Arial" w:eastAsia="Arial"/>
                 <w:b/>
                 <w:i w:val="0"/>
                 <w:sz w:val="20"/>
@@ -2528,6 +2711,7 @@
       </w:pPr>
       <w:r>
         <w:rPr>
+          <w:rFonts w:ascii="Arial" w:hAnsi="Arial" w:cs="Arial" w:eastAsia="Arial"/>
           <w:b w:val="0"/>
           <w:i w:val="0"/>
           <w:sz w:val="20"/>
@@ -2549,7 +2733,9 @@
       </w:pPr>
       <w:r>
         <w:rPr>
+          <w:rFonts w:ascii="Arial" w:hAnsi="Arial" w:cs="Arial" w:eastAsia="Arial"/>
           <w:b w:val="0"/>
+          <w:sz w:val="24"/>
         </w:rPr>
         <w:t>4.3 ACEITAÇÃO DO SISTEMA PELOS USUÁRIOS</w:t>
       </w:r>
@@ -2569,16 +2755,20 @@
       </w:pPr>
       <w:r>
         <w:rPr>
+          <w:rFonts w:ascii="Arial" w:hAnsi="Arial" w:cs="Arial" w:eastAsia="Arial"/>
           <w:b w:val="0"/>
           <w:i w:val="0"/>
           <w:highlight w:val="yellow"/>
+          <w:sz w:val="24"/>
         </w:rPr>
         <w:t>AQUI IREI DESCREVER OS PARTICIPANTES: QUANTOS RESPONDERAM, FUNÇÕES E TEMPO DE EXPERIÊNCIA. TAMBÉM IREI PREENCHER A TABELA 2 E INSERIR O GRÁFICO 1 COM OS RESULTADOS DA PESQUISA.</w:t>
       </w:r>
       <w:r>
         <w:rPr>
+          <w:rFonts w:ascii="Arial" w:hAnsi="Arial" w:cs="Arial" w:eastAsia="Arial"/>
           <w:b w:val="0"/>
           <w:i w:val="0"/>
+          <w:sz w:val="24"/>
         </w:rPr>
         <w:t xml:space="preserve"> A Tabela 2 apresenta os resultados por construto, e o Gráfico 1 compara as médias.</w:t>
       </w:r>
@@ -2591,6 +2781,7 @@
       </w:pPr>
       <w:r>
         <w:rPr>
+          <w:rFonts w:ascii="Arial" w:hAnsi="Arial" w:cs="Arial" w:eastAsia="Arial"/>
           <w:b/>
           <w:i w:val="0"/>
           <w:sz w:val="20"/>
@@ -2600,7 +2791,7 @@
     </w:p>
     <w:tbl>
       <w:tblPr>
-        <w:tblW w:type="auto" w:w="0"/>
+        <w:tblW w:type="dxa" w:w="9071"/>
         <w:jc w:val="center"/>
         <w:tblLayout w:type="fixed"/>
         <w:tblLook w:firstColumn="1" w:firstRow="1" w:lastColumn="0" w:lastRow="0" w:noHBand="0" w:noVBand="1" w:val="04A0"/>
@@ -2636,6 +2827,7 @@
             </w:pPr>
             <w:r>
               <w:rPr>
+                <w:rFonts w:ascii="Arial" w:hAnsi="Arial" w:cs="Arial" w:eastAsia="Arial"/>
                 <w:b/>
                 <w:i w:val="0"/>
                 <w:sz w:val="20"/>
@@ -2662,6 +2854,7 @@
             </w:pPr>
             <w:r>
               <w:rPr>
+                <w:rFonts w:ascii="Arial" w:hAnsi="Arial" w:cs="Arial" w:eastAsia="Arial"/>
                 <w:b/>
                 <w:i w:val="0"/>
                 <w:sz w:val="20"/>
@@ -2688,6 +2881,7 @@
             </w:pPr>
             <w:r>
               <w:rPr>
+                <w:rFonts w:ascii="Arial" w:hAnsi="Arial" w:cs="Arial" w:eastAsia="Arial"/>
                 <w:b/>
                 <w:i w:val="0"/>
                 <w:sz w:val="20"/>
@@ -2714,6 +2908,7 @@
             </w:pPr>
             <w:r>
               <w:rPr>
+                <w:rFonts w:ascii="Arial" w:hAnsi="Arial" w:cs="Arial" w:eastAsia="Arial"/>
                 <w:b/>
                 <w:i w:val="0"/>
                 <w:sz w:val="20"/>
@@ -2740,6 +2935,7 @@
             </w:pPr>
             <w:r>
               <w:rPr>
+                <w:rFonts w:ascii="Arial" w:hAnsi="Arial" w:cs="Arial" w:eastAsia="Arial"/>
                 <w:b/>
                 <w:i w:val="0"/>
                 <w:sz w:val="20"/>
@@ -2766,6 +2962,7 @@
             </w:pPr>
             <w:r>
               <w:rPr>
+                <w:rFonts w:ascii="Arial" w:hAnsi="Arial" w:cs="Arial" w:eastAsia="Arial"/>
                 <w:b/>
                 <w:i w:val="0"/>
                 <w:sz w:val="20"/>
@@ -2797,6 +2994,7 @@
             </w:pPr>
             <w:r>
               <w:rPr>
+                <w:rFonts w:ascii="Arial" w:hAnsi="Arial" w:cs="Arial" w:eastAsia="Arial"/>
                 <w:b w:val="0"/>
                 <w:i w:val="0"/>
                 <w:sz w:val="20"/>
@@ -2823,6 +3021,7 @@
             </w:pPr>
             <w:r>
               <w:rPr>
+                <w:rFonts w:ascii="Arial" w:hAnsi="Arial" w:cs="Arial" w:eastAsia="Arial"/>
                 <w:b w:val="0"/>
                 <w:i w:val="0"/>
                 <w:sz w:val="20"/>
@@ -2849,6 +3048,7 @@
             </w:pPr>
             <w:r>
               <w:rPr>
+                <w:rFonts w:ascii="Arial" w:hAnsi="Arial" w:cs="Arial" w:eastAsia="Arial"/>
                 <w:b w:val="0"/>
                 <w:i w:val="0"/>
                 <w:sz w:val="20"/>
@@ -2876,6 +3076,7 @@
             </w:pPr>
             <w:r>
               <w:rPr>
+                <w:rFonts w:ascii="Arial" w:hAnsi="Arial" w:cs="Arial" w:eastAsia="Arial"/>
                 <w:b w:val="0"/>
                 <w:i w:val="0"/>
                 <w:sz w:val="20"/>
@@ -2903,6 +3104,7 @@
             </w:pPr>
             <w:r>
               <w:rPr>
+                <w:rFonts w:ascii="Arial" w:hAnsi="Arial" w:cs="Arial" w:eastAsia="Arial"/>
                 <w:b w:val="0"/>
                 <w:i w:val="0"/>
                 <w:sz w:val="20"/>
@@ -2930,6 +3132,7 @@
             </w:pPr>
             <w:r>
               <w:rPr>
+                <w:rFonts w:ascii="Arial" w:hAnsi="Arial" w:cs="Arial" w:eastAsia="Arial"/>
                 <w:b w:val="0"/>
                 <w:i w:val="0"/>
                 <w:sz w:val="20"/>
@@ -2962,6 +3165,7 @@
             </w:pPr>
             <w:r>
               <w:rPr>
+                <w:rFonts w:ascii="Arial" w:hAnsi="Arial" w:cs="Arial" w:eastAsia="Arial"/>
                 <w:b w:val="0"/>
                 <w:i w:val="0"/>
                 <w:sz w:val="20"/>
@@ -2988,6 +3192,7 @@
             </w:pPr>
             <w:r>
               <w:rPr>
+                <w:rFonts w:ascii="Arial" w:hAnsi="Arial" w:cs="Arial" w:eastAsia="Arial"/>
                 <w:b w:val="0"/>
                 <w:i w:val="0"/>
                 <w:sz w:val="20"/>
@@ -3014,6 +3219,7 @@
             </w:pPr>
             <w:r>
               <w:rPr>
+                <w:rFonts w:ascii="Arial" w:hAnsi="Arial" w:cs="Arial" w:eastAsia="Arial"/>
                 <w:b w:val="0"/>
                 <w:i w:val="0"/>
                 <w:sz w:val="20"/>
@@ -3041,6 +3247,7 @@
             </w:pPr>
             <w:r>
               <w:rPr>
+                <w:rFonts w:ascii="Arial" w:hAnsi="Arial" w:cs="Arial" w:eastAsia="Arial"/>
                 <w:b w:val="0"/>
                 <w:i w:val="0"/>
                 <w:sz w:val="20"/>
@@ -3068,6 +3275,7 @@
             </w:pPr>
             <w:r>
               <w:rPr>
+                <w:rFonts w:ascii="Arial" w:hAnsi="Arial" w:cs="Arial" w:eastAsia="Arial"/>
                 <w:b w:val="0"/>
                 <w:i w:val="0"/>
                 <w:sz w:val="20"/>
@@ -3095,6 +3303,7 @@
             </w:pPr>
             <w:r>
               <w:rPr>
+                <w:rFonts w:ascii="Arial" w:hAnsi="Arial" w:cs="Arial" w:eastAsia="Arial"/>
                 <w:b w:val="0"/>
                 <w:i w:val="0"/>
                 <w:sz w:val="20"/>
@@ -3127,6 +3336,7 @@
             </w:pPr>
             <w:r>
               <w:rPr>
+                <w:rFonts w:ascii="Arial" w:hAnsi="Arial" w:cs="Arial" w:eastAsia="Arial"/>
                 <w:b w:val="0"/>
                 <w:i w:val="0"/>
                 <w:sz w:val="20"/>
@@ -3153,6 +3363,7 @@
             </w:pPr>
             <w:r>
               <w:rPr>
+                <w:rFonts w:ascii="Arial" w:hAnsi="Arial" w:cs="Arial" w:eastAsia="Arial"/>
                 <w:b w:val="0"/>
                 <w:i w:val="0"/>
                 <w:sz w:val="20"/>
@@ -3179,6 +3390,7 @@
             </w:pPr>
             <w:r>
               <w:rPr>
+                <w:rFonts w:ascii="Arial" w:hAnsi="Arial" w:cs="Arial" w:eastAsia="Arial"/>
                 <w:b w:val="0"/>
                 <w:i w:val="0"/>
                 <w:sz w:val="20"/>
@@ -3206,6 +3418,7 @@
             </w:pPr>
             <w:r>
               <w:rPr>
+                <w:rFonts w:ascii="Arial" w:hAnsi="Arial" w:cs="Arial" w:eastAsia="Arial"/>
                 <w:b w:val="0"/>
                 <w:i w:val="0"/>
                 <w:sz w:val="20"/>
@@ -3233,6 +3446,7 @@
             </w:pPr>
             <w:r>
               <w:rPr>
+                <w:rFonts w:ascii="Arial" w:hAnsi="Arial" w:cs="Arial" w:eastAsia="Arial"/>
                 <w:b w:val="0"/>
                 <w:i w:val="0"/>
                 <w:sz w:val="20"/>
@@ -3260,6 +3474,7 @@
             </w:pPr>
             <w:r>
               <w:rPr>
+                <w:rFonts w:ascii="Arial" w:hAnsi="Arial" w:cs="Arial" w:eastAsia="Arial"/>
                 <w:b w:val="0"/>
                 <w:i w:val="0"/>
                 <w:sz w:val="20"/>
@@ -3291,6 +3506,7 @@
             </w:pPr>
             <w:r>
               <w:rPr>
+                <w:rFonts w:ascii="Arial" w:hAnsi="Arial" w:cs="Arial" w:eastAsia="Arial"/>
                 <w:b w:val="0"/>
                 <w:i w:val="0"/>
                 <w:sz w:val="20"/>
@@ -3316,6 +3532,7 @@
             </w:pPr>
             <w:r>
               <w:rPr>
+                <w:rFonts w:ascii="Arial" w:hAnsi="Arial" w:cs="Arial" w:eastAsia="Arial"/>
                 <w:b w:val="0"/>
                 <w:i w:val="0"/>
                 <w:sz w:val="20"/>
@@ -3341,6 +3558,7 @@
             </w:pPr>
             <w:r>
               <w:rPr>
+                <w:rFonts w:ascii="Arial" w:hAnsi="Arial" w:cs="Arial" w:eastAsia="Arial"/>
                 <w:b w:val="0"/>
                 <w:i w:val="0"/>
                 <w:sz w:val="20"/>
@@ -3367,6 +3585,7 @@
             </w:pPr>
             <w:r>
               <w:rPr>
+                <w:rFonts w:ascii="Arial" w:hAnsi="Arial" w:cs="Arial" w:eastAsia="Arial"/>
                 <w:b w:val="0"/>
                 <w:i w:val="0"/>
                 <w:sz w:val="20"/>
@@ -3393,6 +3612,7 @@
             </w:pPr>
             <w:r>
               <w:rPr>
+                <w:rFonts w:ascii="Arial" w:hAnsi="Arial" w:cs="Arial" w:eastAsia="Arial"/>
                 <w:b w:val="0"/>
                 <w:i w:val="0"/>
                 <w:sz w:val="20"/>
@@ -3419,6 +3639,7 @@
             </w:pPr>
             <w:r>
               <w:rPr>
+                <w:rFonts w:ascii="Arial" w:hAnsi="Arial" w:cs="Arial" w:eastAsia="Arial"/>
                 <w:b w:val="0"/>
                 <w:i w:val="0"/>
                 <w:sz w:val="20"/>
@@ -3437,6 +3658,7 @@
       </w:pPr>
       <w:r>
         <w:rPr>
+          <w:rFonts w:ascii="Arial" w:hAnsi="Arial" w:cs="Arial" w:eastAsia="Arial"/>
           <w:b w:val="0"/>
           <w:i w:val="0"/>
           <w:sz w:val="20"/>
@@ -3446,7 +3668,7 @@
     </w:p>
     <w:tbl>
       <w:tblPr>
-        <w:tblW w:type="auto" w:w="0"/>
+        <w:tblW w:type="dxa" w:w="8505"/>
         <w:jc w:val="center"/>
         <w:tblLayout w:type="fixed"/>
         <w:tblLook w:firstColumn="1" w:firstRow="1" w:lastColumn="0" w:lastRow="0" w:noHBand="0" w:noVBand="1" w:val="04A0"/>
@@ -3478,6 +3700,7 @@
             </w:pPr>
             <w:r>
               <w:rPr>
+                <w:rFonts w:ascii="Arial" w:hAnsi="Arial" w:cs="Arial" w:eastAsia="Arial"/>
                 <w:color w:val="888888"/>
                 <w:sz w:val="20"/>
                 <w:highlight w:val="yellow"/>
@@ -3496,6 +3719,7 @@
       </w:pPr>
       <w:r>
         <w:rPr>
+          <w:rFonts w:ascii="Arial" w:hAnsi="Arial" w:cs="Arial" w:eastAsia="Arial"/>
           <w:b/>
           <w:i w:val="0"/>
           <w:sz w:val="20"/>
@@ -3510,6 +3734,7 @@
       </w:pPr>
       <w:r>
         <w:rPr>
+          <w:rFonts w:ascii="Arial" w:hAnsi="Arial" w:cs="Arial" w:eastAsia="Arial"/>
           <w:b w:val="0"/>
           <w:i w:val="0"/>
           <w:sz w:val="20"/>
@@ -3525,9 +3750,11 @@
       </w:pPr>
       <w:r>
         <w:rPr>
+          <w:rFonts w:ascii="Arial" w:hAnsi="Arial" w:cs="Arial" w:eastAsia="Arial"/>
           <w:b w:val="0"/>
           <w:i w:val="0"/>
           <w:highlight w:val="yellow"/>
+          <w:sz w:val="24"/>
         </w:rPr>
         <w:t>AQUI IREI COLOCAR OS RESULTADOS DA PESQUISA: COMENTAR O GRÁFICO 1, AS AFIRMAÇÕES COM MAIOR E MENOR CONCORDÂNCIA, A OPINIÃO DOS FORNECEDORES SOBRE O PORTAL E AS RESPOSTAS DAS PERGUNTAS ABERTAS.</w:t>
       </w:r>
@@ -3546,7 +3773,9 @@
       </w:pPr>
       <w:r>
         <w:rPr>
+          <w:rFonts w:ascii="Arial" w:hAnsi="Arial" w:cs="Arial" w:eastAsia="Arial"/>
           <w:b w:val="0"/>
+          <w:sz w:val="24"/>
         </w:rPr>
         <w:t>4.4 DISCUSSÃO</w:t>
       </w:r>
@@ -3566,16 +3795,20 @@
       </w:pPr>
       <w:r>
         <w:rPr>
+          <w:rFonts w:ascii="Arial" w:hAnsi="Arial" w:cs="Arial" w:eastAsia="Arial"/>
           <w:b w:val="0"/>
           <w:i w:val="0"/>
+          <w:sz w:val="24"/>
         </w:rPr>
         <w:t xml:space="preserve">A hipótese H1 é sustentada no que depende do comprador, pois a identificação dos itens, o envio e a cobrança das cotações e a comparação das propostas deixam de ser manuais, de acordo com Davenport (1993); o tempo de resposta dos fornecedores, porém, continua fora do controle do sistema. A H2 é sustentada porque a leitura pela API e o registro das propostas pelo fornecedor eliminam a redigitação, que Infante e Santos (2007) associam às falhas de abastecimento. A H3 também se sustenta: cada decisão considera quatro critérios ponderados, em linha com Dickson (1966) e Weber, Current e Benton (1991), e a Figura 3 mostra que o menor preço nem sempre é a melhor escolha. A H4 é sustentada porque cada decisão guarda ranking, pesos, responsável e justificativa. </w:t>
       </w:r>
       <w:r>
         <w:rPr>
+          <w:rFonts w:ascii="Arial" w:hAnsi="Arial" w:cs="Arial" w:eastAsia="Arial"/>
           <w:b w:val="0"/>
           <w:i w:val="0"/>
           <w:highlight w:val="yellow"/>
+          <w:sz w:val="24"/>
         </w:rPr>
         <w:t>AQUI IREI DISCUTIR OS RESULTADOS DO QUESTIONÁRIO, COMPARANDO COM DAVIS (1989) E COM O ALFA MÍNIMO DE 0,70.</w:t>
       </w:r>
@@ -3588,8 +3821,10 @@
       </w:pPr>
       <w:r>
         <w:rPr>
+          <w:rFonts w:ascii="Arial" w:hAnsi="Arial" w:cs="Arial" w:eastAsia="Arial"/>
           <w:b w:val="0"/>
           <w:i w:val="0"/>
+          <w:sz w:val="24"/>
         </w:rPr>
         <w:t>Entre as limitações, estão o uso de dados fictícios e de uma API simulada, a estimativa dos tempos manuais e o número reduzido de participantes, que impede generalizar os resultados, além da sensibilidade da pontuação aos pesos escolhidos, mitigada pela simulação de pesos.</w:t>
       </w:r>
@@ -3608,7 +3843,9 @@
       </w:pPr>
       <w:r>
         <w:rPr>
+          <w:rFonts w:ascii="Arial" w:hAnsi="Arial" w:cs="Arial" w:eastAsia="Arial"/>
           <w:b/>
+          <w:sz w:val="24"/>
         </w:rPr>
         <w:t>CONCLUSÃO</w:t>
       </w:r>
@@ -3628,23 +3865,29 @@
       </w:pPr>
       <w:r>
         <w:rPr>
+          <w:rFonts w:ascii="Arial" w:hAnsi="Arial" w:cs="Arial" w:eastAsia="Arial"/>
           <w:b w:val="0"/>
           <w:i w:val="0"/>
+          <w:sz w:val="24"/>
         </w:rPr>
         <w:t xml:space="preserve">O objetivo de desenvolver e avaliar um sistema web de apoio à decisão para compras hospitalares foi atingido e o problema de pesquisa foi respondido: o Provisa identifica os itens abaixo do estoque mínimo por meio de uma API, envia os pedidos de cotação, recebe as propostas por um portal e as classifica por preço, prazo, disponibilidade e histórico, deixando a decisão com o comprador. Nos testes, 13 etapas manuais foram reduzidas a quatro ações e todas as decisões ficaram rastreáveis. </w:t>
       </w:r>
       <w:r>
         <w:rPr>
+          <w:rFonts w:ascii="Arial" w:hAnsi="Arial" w:cs="Arial" w:eastAsia="Arial"/>
           <w:b w:val="0"/>
           <w:i w:val="0"/>
           <w:highlight w:val="yellow"/>
+          <w:sz w:val="24"/>
         </w:rPr>
         <w:t>AQUI IREI COLOCAR UMA FRASE COM A CONCLUSÃO DO QUESTIONÁRIO.</w:t>
       </w:r>
       <w:r>
         <w:rPr>
+          <w:rFonts w:ascii="Arial" w:hAnsi="Arial" w:cs="Arial" w:eastAsia="Arial"/>
           <w:b w:val="0"/>
           <w:i w:val="0"/>
+          <w:sz w:val="24"/>
         </w:rPr>
         <w:t xml:space="preserve"> Conclui-se que a integração com o estoque, a automação das cotações e a comparação por múltiplos critérios tornam o processo de compras mais ágil, padronizado e transparente. Como trabalhos futuros, sugerem-se a integração com o estoque e o ERP de um hospital real, a medição dos tempos do processo manual, uma amostra maior de participantes e a previsão de demanda pelo histórico de consumo.</w:t>
       </w:r>
@@ -3663,7 +3906,9 @@
       </w:pPr>
       <w:r>
         <w:rPr>
+          <w:rFonts w:ascii="Arial" w:hAnsi="Arial" w:cs="Arial" w:eastAsia="Arial"/>
           <w:b/>
+          <w:sz w:val="24"/>
         </w:rPr>
         <w:t>AGRADECIMENTOS</w:t>
       </w:r>
@@ -3683,8 +3928,10 @@
       </w:pPr>
       <w:r>
         <w:rPr>
+          <w:rFonts w:ascii="Arial" w:hAnsi="Arial" w:cs="Arial" w:eastAsia="Arial"/>
           <w:b w:val="0"/>
           <w:i w:val="0"/>
+          <w:sz w:val="24"/>
         </w:rPr>
         <w:t>Ao professor orientador Allan Stieg Candeia, pela orientação e pelas contribuições ao longo do trabalho; aos profissionais que participaram da avaliação do sistema; e à família, pelo apoio durante o curso.</w:t>
       </w:r>
@@ -3703,7 +3950,9 @@
       </w:pPr>
       <w:r>
         <w:rPr>
+          <w:rFonts w:ascii="Arial" w:hAnsi="Arial" w:cs="Arial" w:eastAsia="Arial"/>
           <w:b/>
+          <w:sz w:val="24"/>
         </w:rPr>
         <w:t>REFERÊNCIAS</w:t>
       </w:r>
@@ -3721,15 +3970,25 @@
         <w:jc w:val="left"/>
       </w:pPr>
       <w:r>
+        <w:rPr>
+          <w:rFonts w:ascii="Arial" w:hAnsi="Arial" w:cs="Arial" w:eastAsia="Arial"/>
+          <w:sz w:val="24"/>
+        </w:rPr>
         <w:t xml:space="preserve">BARBIERI, José Carlos; MACHLINE, Claude. </w:t>
       </w:r>
       <w:r>
         <w:rPr>
+          <w:rFonts w:ascii="Arial" w:hAnsi="Arial" w:cs="Arial" w:eastAsia="Arial"/>
           <w:b/>
+          <w:sz w:val="24"/>
         </w:rPr>
         <w:t>Logística hospitalar</w:t>
       </w:r>
       <w:r>
+        <w:rPr>
+          <w:rFonts w:ascii="Arial" w:hAnsi="Arial" w:cs="Arial" w:eastAsia="Arial"/>
+          <w:sz w:val="24"/>
+        </w:rPr>
         <w:t>: teoria e prática. 2. ed. São Paulo: Saraiva, 2009.</w:t>
       </w:r>
     </w:p>
@@ -3739,15 +3998,25 @@
         <w:jc w:val="left"/>
       </w:pPr>
       <w:r>
+        <w:rPr>
+          <w:rFonts w:ascii="Arial" w:hAnsi="Arial" w:cs="Arial" w:eastAsia="Arial"/>
+          <w:sz w:val="24"/>
+        </w:rPr>
         <w:t xml:space="preserve">BELLI, Cesar Augusto. </w:t>
       </w:r>
       <w:r>
         <w:rPr>
+          <w:rFonts w:ascii="Arial" w:hAnsi="Arial" w:cs="Arial" w:eastAsia="Arial"/>
           <w:b/>
+          <w:sz w:val="24"/>
         </w:rPr>
         <w:t>Integração web de solicitação e cotação de preços</w:t>
       </w:r>
       <w:r>
+        <w:rPr>
+          <w:rFonts w:ascii="Arial" w:hAnsi="Arial" w:cs="Arial" w:eastAsia="Arial"/>
+          <w:sz w:val="24"/>
+        </w:rPr>
         <w:t>. 2019. Trabalho de Conclusão de Curso (Bacharelado em Sistemas de Informação) – Centro de Ciências Exatas e Naturais, Universidade Regional de Blumenau, Blumenau, 2019. Disponível em: &lt;https://furb.br/dsc/arquivos/tccs/monografias/2019_2_cesar-augusto-belli_monografia.pdf&gt;. Acesso em: 19 out. 2026.</w:t>
       </w:r>
     </w:p>
@@ -3757,15 +4026,25 @@
         <w:jc w:val="left"/>
       </w:pPr>
       <w:r>
+        <w:rPr>
+          <w:rFonts w:ascii="Arial" w:hAnsi="Arial" w:cs="Arial" w:eastAsia="Arial"/>
+          <w:sz w:val="24"/>
+        </w:rPr>
         <w:t xml:space="preserve">BERNARDI, Ana Julia Goulardins et al. </w:t>
       </w:r>
       <w:r>
         <w:rPr>
+          <w:rFonts w:ascii="Arial" w:hAnsi="Arial" w:cs="Arial" w:eastAsia="Arial"/>
           <w:b/>
+          <w:sz w:val="24"/>
         </w:rPr>
         <w:t>Aplicação de AHP-PROMETHEE como apoio à seleção de fornecedores de produtos de limpeza para uma empresa hospitalar</w:t>
       </w:r>
       <w:r>
+        <w:rPr>
+          <w:rFonts w:ascii="Arial" w:hAnsi="Arial" w:cs="Arial" w:eastAsia="Arial"/>
+          <w:sz w:val="24"/>
+        </w:rPr>
         <w:t>. 2019. Trabalho de Conclusão de Curso (Graduação) – Universidade Presbiteriana Mackenzie, São Paulo, 2019. Disponível em: &lt;https://dspace.mackenzie.br/handle/10899/29310&gt;. Acesso em: 19 out. 2026.</w:t>
       </w:r>
     </w:p>
@@ -3775,15 +4054,25 @@
         <w:jc w:val="left"/>
       </w:pPr>
       <w:r>
+        <w:rPr>
+          <w:rFonts w:ascii="Arial" w:hAnsi="Arial" w:cs="Arial" w:eastAsia="Arial"/>
+          <w:sz w:val="24"/>
+        </w:rPr>
         <w:t xml:space="preserve">BRASIL. Lei nº 13.709, de 14 de agosto de 2018. Lei Geral de Proteção de Dados Pessoais (LGPD). </w:t>
       </w:r>
       <w:r>
         <w:rPr>
+          <w:rFonts w:ascii="Arial" w:hAnsi="Arial" w:cs="Arial" w:eastAsia="Arial"/>
           <w:b/>
+          <w:sz w:val="24"/>
         </w:rPr>
         <w:t>Diário Oficial da União</w:t>
       </w:r>
       <w:r>
+        <w:rPr>
+          <w:rFonts w:ascii="Arial" w:hAnsi="Arial" w:cs="Arial" w:eastAsia="Arial"/>
+          <w:sz w:val="24"/>
+        </w:rPr>
         <w:t>, Brasília, DF, 15 ago. 2018.</w:t>
       </w:r>
     </w:p>
@@ -3793,15 +4082,25 @@
         <w:jc w:val="left"/>
       </w:pPr>
       <w:r>
+        <w:rPr>
+          <w:rFonts w:ascii="Arial" w:hAnsi="Arial" w:cs="Arial" w:eastAsia="Arial"/>
+          <w:sz w:val="24"/>
+        </w:rPr>
         <w:t xml:space="preserve">CHOPRA, Sunil; MEINDL, Peter. </w:t>
       </w:r>
       <w:r>
         <w:rPr>
+          <w:rFonts w:ascii="Arial" w:hAnsi="Arial" w:cs="Arial" w:eastAsia="Arial"/>
           <w:b/>
+          <w:sz w:val="24"/>
         </w:rPr>
         <w:t>Gestão da cadeia de suprimentos</w:t>
       </w:r>
       <w:r>
+        <w:rPr>
+          <w:rFonts w:ascii="Arial" w:hAnsi="Arial" w:cs="Arial" w:eastAsia="Arial"/>
+          <w:sz w:val="24"/>
+        </w:rPr>
         <w:t>: estratégia, planejamento e operações. 6. ed. São Paulo: Pearson, 2016.</w:t>
       </w:r>
     </w:p>
@@ -3811,15 +4110,25 @@
         <w:jc w:val="left"/>
       </w:pPr>
       <w:r>
+        <w:rPr>
+          <w:rFonts w:ascii="Arial" w:hAnsi="Arial" w:cs="Arial" w:eastAsia="Arial"/>
+          <w:sz w:val="24"/>
+        </w:rPr>
         <w:t xml:space="preserve">CRONBACH, Lee J. Coefficient alpha and the internal structure of tests. </w:t>
       </w:r>
       <w:r>
         <w:rPr>
+          <w:rFonts w:ascii="Arial" w:hAnsi="Arial" w:cs="Arial" w:eastAsia="Arial"/>
           <w:b/>
+          <w:sz w:val="24"/>
         </w:rPr>
         <w:t>Psychometrika</w:t>
       </w:r>
       <w:r>
+        <w:rPr>
+          <w:rFonts w:ascii="Arial" w:hAnsi="Arial" w:cs="Arial" w:eastAsia="Arial"/>
+          <w:sz w:val="24"/>
+        </w:rPr>
         <w:t>, v. 16, n. 3, p. 297-334, 1951.</w:t>
       </w:r>
     </w:p>
@@ -3829,15 +4138,25 @@
         <w:jc w:val="left"/>
       </w:pPr>
       <w:r>
+        <w:rPr>
+          <w:rFonts w:ascii="Arial" w:hAnsi="Arial" w:cs="Arial" w:eastAsia="Arial"/>
+          <w:sz w:val="24"/>
+        </w:rPr>
         <w:t xml:space="preserve">DAVENPORT, Thomas H. </w:t>
       </w:r>
       <w:r>
         <w:rPr>
+          <w:rFonts w:ascii="Arial" w:hAnsi="Arial" w:cs="Arial" w:eastAsia="Arial"/>
           <w:b/>
+          <w:sz w:val="24"/>
         </w:rPr>
         <w:t>Process innovation</w:t>
       </w:r>
       <w:r>
+        <w:rPr>
+          <w:rFonts w:ascii="Arial" w:hAnsi="Arial" w:cs="Arial" w:eastAsia="Arial"/>
+          <w:sz w:val="24"/>
+        </w:rPr>
         <w:t>: reengineering work through information technology. Boston: Harvard Business School Press, 1993.</w:t>
       </w:r>
     </w:p>
@@ -3847,15 +4166,25 @@
         <w:jc w:val="left"/>
       </w:pPr>
       <w:r>
+        <w:rPr>
+          <w:rFonts w:ascii="Arial" w:hAnsi="Arial" w:cs="Arial" w:eastAsia="Arial"/>
+          <w:sz w:val="24"/>
+        </w:rPr>
         <w:t xml:space="preserve">DAVIS, Fred D. Perceived usefulness, perceived ease of use, and user acceptance of information technology. </w:t>
       </w:r>
       <w:r>
         <w:rPr>
+          <w:rFonts w:ascii="Arial" w:hAnsi="Arial" w:cs="Arial" w:eastAsia="Arial"/>
           <w:b/>
+          <w:sz w:val="24"/>
         </w:rPr>
         <w:t>MIS Quarterly</w:t>
       </w:r>
       <w:r>
+        <w:rPr>
+          <w:rFonts w:ascii="Arial" w:hAnsi="Arial" w:cs="Arial" w:eastAsia="Arial"/>
+          <w:sz w:val="24"/>
+        </w:rPr>
         <w:t>, v. 13, n. 3, p. 319-340, 1989.</w:t>
       </w:r>
     </w:p>
@@ -3865,15 +4194,25 @@
         <w:jc w:val="left"/>
       </w:pPr>
       <w:r>
+        <w:rPr>
+          <w:rFonts w:ascii="Arial" w:hAnsi="Arial" w:cs="Arial" w:eastAsia="Arial"/>
+          <w:sz w:val="24"/>
+        </w:rPr>
         <w:t xml:space="preserve">DAVIS, Fred D.; BAGOZZI, Richard P.; WARSHAW, Paul R. User acceptance of computer technology: a comparison of two theoretical models. </w:t>
       </w:r>
       <w:r>
         <w:rPr>
+          <w:rFonts w:ascii="Arial" w:hAnsi="Arial" w:cs="Arial" w:eastAsia="Arial"/>
           <w:b/>
+          <w:sz w:val="24"/>
         </w:rPr>
         <w:t>Management Science</w:t>
       </w:r>
       <w:r>
+        <w:rPr>
+          <w:rFonts w:ascii="Arial" w:hAnsi="Arial" w:cs="Arial" w:eastAsia="Arial"/>
+          <w:sz w:val="24"/>
+        </w:rPr>
         <w:t>, v. 35, n. 8, p. 982-1003, 1989.</w:t>
       </w:r>
     </w:p>
@@ -3883,15 +4222,25 @@
         <w:jc w:val="left"/>
       </w:pPr>
       <w:r>
+        <w:rPr>
+          <w:rFonts w:ascii="Arial" w:hAnsi="Arial" w:cs="Arial" w:eastAsia="Arial"/>
+          <w:sz w:val="24"/>
+        </w:rPr>
         <w:t xml:space="preserve">DICKSON, Gary W. An analysis of vendor selection systems and decisions. </w:t>
       </w:r>
       <w:r>
         <w:rPr>
+          <w:rFonts w:ascii="Arial" w:hAnsi="Arial" w:cs="Arial" w:eastAsia="Arial"/>
           <w:b/>
+          <w:sz w:val="24"/>
         </w:rPr>
         <w:t>Journal of Purchasing</w:t>
       </w:r>
       <w:r>
+        <w:rPr>
+          <w:rFonts w:ascii="Arial" w:hAnsi="Arial" w:cs="Arial" w:eastAsia="Arial"/>
+          <w:sz w:val="24"/>
+        </w:rPr>
         <w:t>, v. 2, n. 1, p. 5-17, 1966.</w:t>
       </w:r>
     </w:p>
@@ -3901,15 +4250,25 @@
         <w:jc w:val="left"/>
       </w:pPr>
       <w:r>
+        <w:rPr>
+          <w:rFonts w:ascii="Arial" w:hAnsi="Arial" w:cs="Arial" w:eastAsia="Arial"/>
+          <w:sz w:val="24"/>
+        </w:rPr>
         <w:t xml:space="preserve">FIELDING, Roy T. </w:t>
       </w:r>
       <w:r>
         <w:rPr>
+          <w:rFonts w:ascii="Arial" w:hAnsi="Arial" w:cs="Arial" w:eastAsia="Arial"/>
           <w:b/>
+          <w:sz w:val="24"/>
         </w:rPr>
         <w:t>Architectural styles and the design of network-based software architectures</w:t>
       </w:r>
       <w:r>
+        <w:rPr>
+          <w:rFonts w:ascii="Arial" w:hAnsi="Arial" w:cs="Arial" w:eastAsia="Arial"/>
+          <w:sz w:val="24"/>
+        </w:rPr>
         <w:t>. 2000. Tese (Doutorado em Ciência da Informação e Computação) – University of California, Irvine, 2000.</w:t>
       </w:r>
     </w:p>
@@ -3919,15 +4278,25 @@
         <w:jc w:val="left"/>
       </w:pPr>
       <w:r>
+        <w:rPr>
+          <w:rFonts w:ascii="Arial" w:hAnsi="Arial" w:cs="Arial" w:eastAsia="Arial"/>
+          <w:sz w:val="24"/>
+        </w:rPr>
         <w:t xml:space="preserve">GIL, Antonio Carlos. </w:t>
       </w:r>
       <w:r>
         <w:rPr>
+          <w:rFonts w:ascii="Arial" w:hAnsi="Arial" w:cs="Arial" w:eastAsia="Arial"/>
           <w:b/>
+          <w:sz w:val="24"/>
         </w:rPr>
         <w:t>Como elaborar projetos de pesquisa</w:t>
       </w:r>
       <w:r>
+        <w:rPr>
+          <w:rFonts w:ascii="Arial" w:hAnsi="Arial" w:cs="Arial" w:eastAsia="Arial"/>
+          <w:sz w:val="24"/>
+        </w:rPr>
         <w:t>. 4. ed. São Paulo: Atlas, 2002.</w:t>
       </w:r>
     </w:p>
@@ -3937,15 +4306,25 @@
         <w:jc w:val="left"/>
       </w:pPr>
       <w:r>
+        <w:rPr>
+          <w:rFonts w:ascii="Arial" w:hAnsi="Arial" w:cs="Arial" w:eastAsia="Arial"/>
+          <w:sz w:val="24"/>
+        </w:rPr>
         <w:t xml:space="preserve">INFANTE, Maria; SANTOS, Maria Angélica Borges dos. A organização do abastecimento do hospital público a partir da cadeia produtiva: uma abordagem logística para a área de saúde. </w:t>
       </w:r>
       <w:r>
         <w:rPr>
+          <w:rFonts w:ascii="Arial" w:hAnsi="Arial" w:cs="Arial" w:eastAsia="Arial"/>
           <w:b/>
+          <w:sz w:val="24"/>
         </w:rPr>
         <w:t>Ciência &amp; Saúde Coletiva</w:t>
       </w:r>
       <w:r>
+        <w:rPr>
+          <w:rFonts w:ascii="Arial" w:hAnsi="Arial" w:cs="Arial" w:eastAsia="Arial"/>
+          <w:sz w:val="24"/>
+        </w:rPr>
         <w:t>, Rio de Janeiro, v. 12, n. 4, p. 945-954, 2007.</w:t>
       </w:r>
     </w:p>
@@ -3955,15 +4334,25 @@
         <w:jc w:val="left"/>
       </w:pPr>
       <w:r>
+        <w:rPr>
+          <w:rFonts w:ascii="Arial" w:hAnsi="Arial" w:cs="Arial" w:eastAsia="Arial"/>
+          <w:sz w:val="24"/>
+        </w:rPr>
         <w:t xml:space="preserve">LAUDON, Kenneth C.; LAUDON, Jane P. </w:t>
       </w:r>
       <w:r>
         <w:rPr>
+          <w:rFonts w:ascii="Arial" w:hAnsi="Arial" w:cs="Arial" w:eastAsia="Arial"/>
           <w:b/>
+          <w:sz w:val="24"/>
         </w:rPr>
         <w:t>Sistemas de informação gerenciais</w:t>
       </w:r>
       <w:r>
+        <w:rPr>
+          <w:rFonts w:ascii="Arial" w:hAnsi="Arial" w:cs="Arial" w:eastAsia="Arial"/>
+          <w:sz w:val="24"/>
+        </w:rPr>
         <w:t>. São Paulo: Pearson, 2016.</w:t>
       </w:r>
     </w:p>
@@ -3973,15 +4362,25 @@
         <w:jc w:val="left"/>
       </w:pPr>
       <w:r>
+        <w:rPr>
+          <w:rFonts w:ascii="Arial" w:hAnsi="Arial" w:cs="Arial" w:eastAsia="Arial"/>
+          <w:sz w:val="24"/>
+        </w:rPr>
         <w:t xml:space="preserve">PARAGUASSU, Deyves Mendes; MACEDO, Marcelo Alvaro da Silva. Seleção de fornecedores no setor público: um estudo de caso em Bio-Manguinhos/Fiocruz. </w:t>
       </w:r>
       <w:r>
         <w:rPr>
+          <w:rFonts w:ascii="Arial" w:hAnsi="Arial" w:cs="Arial" w:eastAsia="Arial"/>
           <w:b/>
+          <w:sz w:val="24"/>
         </w:rPr>
         <w:t>Revista Ciências Administrativas</w:t>
       </w:r>
       <w:r>
+        <w:rPr>
+          <w:rFonts w:ascii="Arial" w:hAnsi="Arial" w:cs="Arial" w:eastAsia="Arial"/>
+          <w:sz w:val="24"/>
+        </w:rPr>
         <w:t>, Fortaleza, v. 19, n. 2, p. 666-697, 2013.</w:t>
       </w:r>
     </w:p>
@@ -3991,15 +4390,25 @@
         <w:jc w:val="left"/>
       </w:pPr>
       <w:r>
+        <w:rPr>
+          <w:rFonts w:ascii="Arial" w:hAnsi="Arial" w:cs="Arial" w:eastAsia="Arial"/>
+          <w:sz w:val="24"/>
+        </w:rPr>
         <w:t xml:space="preserve">POWER, Daniel J. </w:t>
       </w:r>
       <w:r>
         <w:rPr>
+          <w:rFonts w:ascii="Arial" w:hAnsi="Arial" w:cs="Arial" w:eastAsia="Arial"/>
           <w:b/>
+          <w:sz w:val="24"/>
         </w:rPr>
         <w:t>Decision support systems</w:t>
       </w:r>
       <w:r>
+        <w:rPr>
+          <w:rFonts w:ascii="Arial" w:hAnsi="Arial" w:cs="Arial" w:eastAsia="Arial"/>
+          <w:sz w:val="24"/>
+        </w:rPr>
         <w:t>: concepts and resources for managers. Westport: Quorum Books, 2002.</w:t>
       </w:r>
     </w:p>
@@ -4009,15 +4418,25 @@
         <w:jc w:val="left"/>
       </w:pPr>
       <w:r>
+        <w:rPr>
+          <w:rFonts w:ascii="Arial" w:hAnsi="Arial" w:cs="Arial" w:eastAsia="Arial"/>
+          <w:sz w:val="24"/>
+        </w:rPr>
         <w:t xml:space="preserve">WEBER, Charles A.; CURRENT, John R.; BENTON, W. C. Vendor selection criteria and methods. </w:t>
       </w:r>
       <w:r>
         <w:rPr>
+          <w:rFonts w:ascii="Arial" w:hAnsi="Arial" w:cs="Arial" w:eastAsia="Arial"/>
           <w:b/>
+          <w:sz w:val="24"/>
         </w:rPr>
         <w:t>European Journal of Operational Research</w:t>
       </w:r>
       <w:r>
+        <w:rPr>
+          <w:rFonts w:ascii="Arial" w:hAnsi="Arial" w:cs="Arial" w:eastAsia="Arial"/>
+          <w:sz w:val="24"/>
+        </w:rPr>
         <w:t>, v. 50, n. 1, p. 2-18, 1991.</w:t>
       </w:r>
     </w:p>
@@ -4335,7 +4754,7 @@
   <w:docDefaults>
     <w:rPrDefault>
       <w:rPr>
-        <w:rFonts w:asciiTheme="minorHAnsi" w:eastAsiaTheme="minorEastAsia" w:hAnsiTheme="minorHAnsi" w:cstheme="minorBidi"/>
+        <w:rFonts w:cstheme="minorBidi" w:ascii="Arial" w:hAnsi="Arial" w:cs="Arial" w:eastAsia="Arial"/>
         <w:sz w:val="22"/>
         <w:szCs w:val="22"/>
         <w:lang w:val="en-US" w:eastAsia="en-US" w:bidi="ar-SA"/>
@@ -4494,11 +4913,14 @@
       <w:spacing w:after="0" w:before="0"/>
     </w:pPr>
     <w:rPr>
-      <w:rFonts w:ascii="Arial" w:hAnsi="Arial" w:eastAsia="Arial"/>
+      <w:rFonts w:ascii="Arial" w:hAnsi="Arial" w:eastAsia="Arial" w:cs="Arial"/>
       <w:sz w:val="24"/>
     </w:rPr>
   </w:style>
   <w:style w:type="paragraph" w:styleId="Header">
+    <w:rPr>
+      <w:rFonts w:ascii="Arial" w:hAnsi="Arial" w:cs="Arial" w:eastAsia="Arial"/>
+    </w:rPr>
     <w:name w:val="header"/>
     <w:basedOn w:val="Normal"/>
     <w:link w:val="HeaderChar"/>
@@ -4514,6 +4936,9 @@
     </w:pPr>
   </w:style>
   <w:style w:type="character" w:customStyle="1" w:styleId="HeaderChar">
+    <w:rPr>
+      <w:rFonts w:ascii="Arial" w:hAnsi="Arial" w:cs="Arial" w:eastAsia="Arial"/>
+    </w:rPr>
     <w:name w:val="Header Char"/>
     <w:basedOn w:val="DefaultParagraphFont"/>
     <w:link w:val="Header"/>
@@ -4521,6 +4946,9 @@
     <w:rsid w:val="00E618BF"/>
   </w:style>
   <w:style w:type="paragraph" w:styleId="Footer">
+    <w:rPr>
+      <w:rFonts w:ascii="Arial" w:hAnsi="Arial" w:cs="Arial" w:eastAsia="Arial"/>
+    </w:rPr>
     <w:name w:val="footer"/>
     <w:basedOn w:val="Normal"/>
     <w:link w:val="FooterChar"/>
@@ -4536,6 +4964,9 @@
     </w:pPr>
   </w:style>
   <w:style w:type="character" w:customStyle="1" w:styleId="FooterChar">
+    <w:rPr>
+      <w:rFonts w:ascii="Arial" w:hAnsi="Arial" w:cs="Arial" w:eastAsia="Arial"/>
+    </w:rPr>
     <w:name w:val="Footer Char"/>
     <w:basedOn w:val="DefaultParagraphFont"/>
     <w:link w:val="Footer"/>
@@ -4557,7 +4988,7 @@
       <w:outlineLvl w:val="0"/>
     </w:pPr>
     <w:rPr>
-      <w:rFonts w:asciiTheme="majorHAnsi" w:eastAsiaTheme="majorEastAsia" w:hAnsiTheme="majorHAnsi" w:cstheme="majorBidi"/>
+      <w:rFonts w:cstheme="majorBidi" w:ascii="Arial" w:hAnsi="Arial" w:cs="Arial" w:eastAsia="Arial"/>
       <w:b/>
       <w:bCs/>
       <w:color w:val="365F91" w:themeColor="accent1" w:themeShade="BF"/>
@@ -4581,7 +5012,7 @@
       <w:outlineLvl w:val="1"/>
     </w:pPr>
     <w:rPr>
-      <w:rFonts w:asciiTheme="majorHAnsi" w:eastAsiaTheme="majorEastAsia" w:hAnsiTheme="majorHAnsi" w:cstheme="majorBidi"/>
+      <w:rFonts w:cstheme="majorBidi" w:ascii="Arial" w:hAnsi="Arial" w:cs="Arial" w:eastAsia="Arial"/>
       <w:b/>
       <w:bCs/>
       <w:color w:val="4F81BD" w:themeColor="accent1"/>
@@ -4605,7 +5036,7 @@
       <w:outlineLvl w:val="2"/>
     </w:pPr>
     <w:rPr>
-      <w:rFonts w:asciiTheme="majorHAnsi" w:eastAsiaTheme="majorEastAsia" w:hAnsiTheme="majorHAnsi" w:cstheme="majorBidi"/>
+      <w:rFonts w:cstheme="majorBidi" w:ascii="Arial" w:hAnsi="Arial" w:cs="Arial" w:eastAsia="Arial"/>
       <w:b/>
       <w:bCs/>
       <w:color w:val="4F81BD" w:themeColor="accent1"/>
@@ -4628,7 +5059,7 @@
       <w:outlineLvl w:val="3"/>
     </w:pPr>
     <w:rPr>
-      <w:rFonts w:asciiTheme="majorHAnsi" w:eastAsiaTheme="majorEastAsia" w:hAnsiTheme="majorHAnsi" w:cstheme="majorBidi"/>
+      <w:rFonts w:cstheme="majorBidi" w:ascii="Arial" w:hAnsi="Arial" w:cs="Arial" w:eastAsia="Arial"/>
       <w:b/>
       <w:bCs/>
       <w:i/>
@@ -4653,7 +5084,7 @@
       <w:outlineLvl w:val="4"/>
     </w:pPr>
     <w:rPr>
-      <w:rFonts w:asciiTheme="majorHAnsi" w:eastAsiaTheme="majorEastAsia" w:hAnsiTheme="majorHAnsi" w:cstheme="majorBidi"/>
+      <w:rFonts w:cstheme="majorBidi" w:ascii="Arial" w:hAnsi="Arial" w:cs="Arial" w:eastAsia="Arial"/>
       <w:color w:val="243F60" w:themeColor="accent1" w:themeShade="7F"/>
     </w:rPr>
   </w:style>
@@ -4674,7 +5105,7 @@
       <w:outlineLvl w:val="5"/>
     </w:pPr>
     <w:rPr>
-      <w:rFonts w:asciiTheme="majorHAnsi" w:eastAsiaTheme="majorEastAsia" w:hAnsiTheme="majorHAnsi" w:cstheme="majorBidi"/>
+      <w:rFonts w:cstheme="majorBidi" w:ascii="Arial" w:hAnsi="Arial" w:cs="Arial" w:eastAsia="Arial"/>
       <w:i/>
       <w:iCs/>
       <w:color w:val="243F60" w:themeColor="accent1" w:themeShade="7F"/>
@@ -4697,7 +5128,7 @@
       <w:outlineLvl w:val="6"/>
     </w:pPr>
     <w:rPr>
-      <w:rFonts w:asciiTheme="majorHAnsi" w:eastAsiaTheme="majorEastAsia" w:hAnsiTheme="majorHAnsi" w:cstheme="majorBidi"/>
+      <w:rFonts w:cstheme="majorBidi" w:ascii="Arial" w:hAnsi="Arial" w:cs="Arial" w:eastAsia="Arial"/>
       <w:i/>
       <w:iCs/>
       <w:color w:val="404040" w:themeColor="text1" w:themeTint="BF"/>
@@ -4720,7 +5151,7 @@
       <w:outlineLvl w:val="7"/>
     </w:pPr>
     <w:rPr>
-      <w:rFonts w:asciiTheme="majorHAnsi" w:eastAsiaTheme="majorEastAsia" w:hAnsiTheme="majorHAnsi" w:cstheme="majorBidi"/>
+      <w:rFonts w:cstheme="majorBidi" w:ascii="Arial" w:hAnsi="Arial" w:cs="Arial" w:eastAsia="Arial"/>
       <w:color w:val="4F81BD" w:themeColor="accent1"/>
       <w:sz w:val="20"/>
       <w:szCs w:val="20"/>
@@ -4743,7 +5174,7 @@
       <w:outlineLvl w:val="8"/>
     </w:pPr>
     <w:rPr>
-      <w:rFonts w:asciiTheme="majorHAnsi" w:eastAsiaTheme="majorEastAsia" w:hAnsiTheme="majorHAnsi" w:cstheme="majorBidi"/>
+      <w:rFonts w:cstheme="majorBidi" w:ascii="Arial" w:hAnsi="Arial" w:cs="Arial" w:eastAsia="Arial"/>
       <w:i/>
       <w:iCs/>
       <w:color w:val="404040" w:themeColor="text1" w:themeTint="BF"/>
@@ -4752,12 +5183,18 @@
     </w:rPr>
   </w:style>
   <w:style w:type="character" w:default="1" w:styleId="DefaultParagraphFont">
+    <w:rPr>
+      <w:rFonts w:ascii="Arial" w:hAnsi="Arial" w:cs="Arial" w:eastAsia="Arial"/>
+    </w:rPr>
     <w:name w:val="Default Paragraph Font"/>
     <w:uiPriority w:val="1"/>
     <w:semiHidden/>
     <w:unhideWhenUsed/>
   </w:style>
   <w:style w:type="table" w:default="1" w:styleId="TableNormal">
+    <w:rPr>
+      <w:rFonts w:ascii="Arial" w:hAnsi="Arial" w:cs="Arial" w:eastAsia="Arial"/>
+    </w:rPr>
     <w:name w:val="Normal Table"/>
     <w:uiPriority w:val="99"/>
     <w:semiHidden/>
@@ -4773,12 +5210,18 @@
     </w:tblPr>
   </w:style>
   <w:style w:type="numbering" w:default="1" w:styleId="NoList">
+    <w:rPr>
+      <w:rFonts w:ascii="Arial" w:hAnsi="Arial" w:cs="Arial" w:eastAsia="Arial"/>
+    </w:rPr>
     <w:name w:val="No List"/>
     <w:uiPriority w:val="99"/>
     <w:semiHidden/>
     <w:unhideWhenUsed/>
   </w:style>
   <w:style w:type="paragraph" w:styleId="NoSpacing">
+    <w:rPr>
+      <w:rFonts w:ascii="Arial" w:hAnsi="Arial" w:cs="Arial" w:eastAsia="Arial"/>
+    </w:rPr>
     <w:name w:val="No Spacing"/>
     <w:uiPriority w:val="1"/>
     <w:qFormat/>
@@ -4794,7 +5237,7 @@
     <w:uiPriority w:val="9"/>
     <w:rsid w:val="00FC693F"/>
     <w:rPr>
-      <w:rFonts w:asciiTheme="majorHAnsi" w:eastAsiaTheme="majorEastAsia" w:hAnsiTheme="majorHAnsi" w:cstheme="majorBidi"/>
+      <w:rFonts w:cstheme="majorBidi" w:ascii="Arial" w:hAnsi="Arial" w:cs="Arial" w:eastAsia="Arial"/>
       <w:b/>
       <w:bCs/>
       <w:color w:val="365F91" w:themeColor="accent1" w:themeShade="BF"/>
@@ -4809,7 +5252,7 @@
     <w:uiPriority w:val="9"/>
     <w:rsid w:val="00FC693F"/>
     <w:rPr>
-      <w:rFonts w:asciiTheme="majorHAnsi" w:eastAsiaTheme="majorEastAsia" w:hAnsiTheme="majorHAnsi" w:cstheme="majorBidi"/>
+      <w:rFonts w:cstheme="majorBidi" w:ascii="Arial" w:hAnsi="Arial" w:cs="Arial" w:eastAsia="Arial"/>
       <w:b/>
       <w:bCs/>
       <w:color w:val="4F81BD" w:themeColor="accent1"/>
@@ -4824,7 +5267,7 @@
     <w:uiPriority w:val="9"/>
     <w:rsid w:val="00FC693F"/>
     <w:rPr>
-      <w:rFonts w:asciiTheme="majorHAnsi" w:eastAsiaTheme="majorEastAsia" w:hAnsiTheme="majorHAnsi" w:cstheme="majorBidi"/>
+      <w:rFonts w:cstheme="majorBidi" w:ascii="Arial" w:hAnsi="Arial" w:cs="Arial" w:eastAsia="Arial"/>
       <w:b/>
       <w:bCs/>
       <w:color w:val="4F81BD" w:themeColor="accent1"/>
@@ -4846,7 +5289,7 @@
       <w:contextualSpacing/>
     </w:pPr>
     <w:rPr>
-      <w:rFonts w:asciiTheme="majorHAnsi" w:eastAsiaTheme="majorEastAsia" w:hAnsiTheme="majorHAnsi" w:cstheme="majorBidi"/>
+      <w:rFonts w:cstheme="majorBidi" w:ascii="Arial" w:hAnsi="Arial" w:cs="Arial" w:eastAsia="Arial"/>
       <w:color w:val="17365D" w:themeColor="text2" w:themeShade="BF"/>
       <w:spacing w:val="5"/>
       <w:kern w:val="28"/>
@@ -4861,7 +5304,7 @@
     <w:uiPriority w:val="10"/>
     <w:rsid w:val="00FC693F"/>
     <w:rPr>
-      <w:rFonts w:asciiTheme="majorHAnsi" w:eastAsiaTheme="majorEastAsia" w:hAnsiTheme="majorHAnsi" w:cstheme="majorBidi"/>
+      <w:rFonts w:cstheme="majorBidi" w:ascii="Arial" w:hAnsi="Arial" w:cs="Arial" w:eastAsia="Arial"/>
       <w:color w:val="17365D" w:themeColor="text2" w:themeShade="BF"/>
       <w:spacing w:val="5"/>
       <w:kern w:val="28"/>
@@ -4883,7 +5326,7 @@
       </w:numPr>
     </w:pPr>
     <w:rPr>
-      <w:rFonts w:asciiTheme="majorHAnsi" w:eastAsiaTheme="majorEastAsia" w:hAnsiTheme="majorHAnsi" w:cstheme="majorBidi"/>
+      <w:rFonts w:cstheme="majorBidi" w:ascii="Arial" w:hAnsi="Arial" w:cs="Arial" w:eastAsia="Arial"/>
       <w:i/>
       <w:iCs/>
       <w:color w:val="4F81BD" w:themeColor="accent1"/>
@@ -4899,7 +5342,7 @@
     <w:uiPriority w:val="11"/>
     <w:rsid w:val="00FC693F"/>
     <w:rPr>
-      <w:rFonts w:asciiTheme="majorHAnsi" w:eastAsiaTheme="majorEastAsia" w:hAnsiTheme="majorHAnsi" w:cstheme="majorBidi"/>
+      <w:rFonts w:cstheme="majorBidi" w:ascii="Arial" w:hAnsi="Arial" w:cs="Arial" w:eastAsia="Arial"/>
       <w:i/>
       <w:iCs/>
       <w:color w:val="4F81BD" w:themeColor="accent1"/>
@@ -4909,6 +5352,9 @@
     </w:rPr>
   </w:style>
   <w:style w:type="paragraph" w:styleId="ListParagraph">
+    <w:rPr>
+      <w:rFonts w:ascii="Arial" w:hAnsi="Arial" w:cs="Arial" w:eastAsia="Arial"/>
+    </w:rPr>
     <w:name w:val="List Paragraph"/>
     <w:basedOn w:val="Normal"/>
     <w:uiPriority w:val="34"/>
@@ -4920,6 +5366,9 @@
     </w:pPr>
   </w:style>
   <w:style w:type="paragraph" w:styleId="BodyText">
+    <w:rPr>
+      <w:rFonts w:ascii="Arial" w:hAnsi="Arial" w:cs="Arial" w:eastAsia="Arial"/>
+    </w:rPr>
     <w:name w:val="Body Text"/>
     <w:basedOn w:val="Normal"/>
     <w:link w:val="BodyTextChar"/>
@@ -4931,6 +5380,9 @@
     </w:pPr>
   </w:style>
   <w:style w:type="character" w:customStyle="1" w:styleId="BodyTextChar">
+    <w:rPr>
+      <w:rFonts w:ascii="Arial" w:hAnsi="Arial" w:cs="Arial" w:eastAsia="Arial"/>
+    </w:rPr>
     <w:name w:val="Body Text Char"/>
     <w:basedOn w:val="DefaultParagraphFont"/>
     <w:link w:val="BodyText"/>
@@ -4938,6 +5390,9 @@
     <w:rsid w:val="00AA1D8D"/>
   </w:style>
   <w:style w:type="paragraph" w:styleId="BodyText2">
+    <w:rPr>
+      <w:rFonts w:ascii="Arial" w:hAnsi="Arial" w:cs="Arial" w:eastAsia="Arial"/>
+    </w:rPr>
     <w:name w:val="Body Text 2"/>
     <w:basedOn w:val="Normal"/>
     <w:link w:val="BodyText2Char"/>
@@ -4949,6 +5404,9 @@
     </w:pPr>
   </w:style>
   <w:style w:type="character" w:customStyle="1" w:styleId="BodyText2Char">
+    <w:rPr>
+      <w:rFonts w:ascii="Arial" w:hAnsi="Arial" w:cs="Arial" w:eastAsia="Arial"/>
+    </w:rPr>
     <w:name w:val="Body Text 2 Char"/>
     <w:basedOn w:val="DefaultParagraphFont"/>
     <w:link w:val="BodyText2"/>
@@ -4966,6 +5424,7 @@
       <w:spacing w:after="120"/>
     </w:pPr>
     <w:rPr>
+      <w:rFonts w:ascii="Arial" w:hAnsi="Arial" w:cs="Arial" w:eastAsia="Arial"/>
       <w:sz w:val="16"/>
       <w:szCs w:val="16"/>
     </w:rPr>
@@ -4977,11 +5436,15 @@
     <w:uiPriority w:val="99"/>
     <w:rsid w:val="00AA1D8D"/>
     <w:rPr>
+      <w:rFonts w:ascii="Arial" w:hAnsi="Arial" w:cs="Arial" w:eastAsia="Arial"/>
       <w:sz w:val="16"/>
       <w:szCs w:val="16"/>
     </w:rPr>
   </w:style>
   <w:style w:type="paragraph" w:styleId="List">
+    <w:rPr>
+      <w:rFonts w:ascii="Arial" w:hAnsi="Arial" w:cs="Arial" w:eastAsia="Arial"/>
+    </w:rPr>
     <w:name w:val="List"/>
     <w:basedOn w:val="Normal"/>
     <w:uiPriority w:val="99"/>
@@ -4993,6 +5456,9 @@
     </w:pPr>
   </w:style>
   <w:style w:type="paragraph" w:styleId="List2">
+    <w:rPr>
+      <w:rFonts w:ascii="Arial" w:hAnsi="Arial" w:cs="Arial" w:eastAsia="Arial"/>
+    </w:rPr>
     <w:name w:val="List 2"/>
     <w:basedOn w:val="Normal"/>
     <w:uiPriority w:val="99"/>
@@ -5004,6 +5470,9 @@
     </w:pPr>
   </w:style>
   <w:style w:type="paragraph" w:styleId="List3">
+    <w:rPr>
+      <w:rFonts w:ascii="Arial" w:hAnsi="Arial" w:cs="Arial" w:eastAsia="Arial"/>
+    </w:rPr>
     <w:name w:val="List 3"/>
     <w:basedOn w:val="Normal"/>
     <w:uiPriority w:val="99"/>
@@ -5015,6 +5484,9 @@
     </w:pPr>
   </w:style>
   <w:style w:type="paragraph" w:styleId="ListBullet">
+    <w:rPr>
+      <w:rFonts w:ascii="Arial" w:hAnsi="Arial" w:cs="Arial" w:eastAsia="Arial"/>
+    </w:rPr>
     <w:name w:val="List Bullet"/>
     <w:basedOn w:val="Normal"/>
     <w:uiPriority w:val="99"/>
@@ -5028,6 +5500,9 @@
     </w:pPr>
   </w:style>
   <w:style w:type="paragraph" w:styleId="ListBullet2">
+    <w:rPr>
+      <w:rFonts w:ascii="Arial" w:hAnsi="Arial" w:cs="Arial" w:eastAsia="Arial"/>
+    </w:rPr>
     <w:name w:val="List Bullet 2"/>
     <w:basedOn w:val="Normal"/>
     <w:uiPriority w:val="99"/>
@@ -5041,6 +5516,9 @@
     </w:pPr>
   </w:style>
   <w:style w:type="paragraph" w:styleId="ListBullet3">
+    <w:rPr>
+      <w:rFonts w:ascii="Arial" w:hAnsi="Arial" w:cs="Arial" w:eastAsia="Arial"/>
+    </w:rPr>
     <w:name w:val="List Bullet 3"/>
     <w:basedOn w:val="Normal"/>
     <w:uiPriority w:val="99"/>
@@ -5054,6 +5532,9 @@
     </w:pPr>
   </w:style>
   <w:style w:type="paragraph" w:styleId="ListNumber">
+    <w:rPr>
+      <w:rFonts w:ascii="Arial" w:hAnsi="Arial" w:cs="Arial" w:eastAsia="Arial"/>
+    </w:rPr>
     <w:name w:val="List Number"/>
     <w:basedOn w:val="Normal"/>
     <w:uiPriority w:val="99"/>
@@ -5067,6 +5548,9 @@
     </w:pPr>
   </w:style>
   <w:style w:type="paragraph" w:styleId="ListNumber2">
+    <w:rPr>
+      <w:rFonts w:ascii="Arial" w:hAnsi="Arial" w:cs="Arial" w:eastAsia="Arial"/>
+    </w:rPr>
     <w:name w:val="List Number 2"/>
     <w:basedOn w:val="Normal"/>
     <w:uiPriority w:val="99"/>
@@ -5080,6 +5564,9 @@
     </w:pPr>
   </w:style>
   <w:style w:type="paragraph" w:styleId="ListNumber3">
+    <w:rPr>
+      <w:rFonts w:ascii="Arial" w:hAnsi="Arial" w:cs="Arial" w:eastAsia="Arial"/>
+    </w:rPr>
     <w:name w:val="List Number 3"/>
     <w:basedOn w:val="Normal"/>
     <w:uiPriority w:val="99"/>
@@ -5093,6 +5580,9 @@
     </w:pPr>
   </w:style>
   <w:style w:type="paragraph" w:styleId="ListContinue">
+    <w:rPr>
+      <w:rFonts w:ascii="Arial" w:hAnsi="Arial" w:cs="Arial" w:eastAsia="Arial"/>
+    </w:rPr>
     <w:name w:val="List Continue"/>
     <w:basedOn w:val="Normal"/>
     <w:uiPriority w:val="99"/>
@@ -5105,6 +5595,9 @@
     </w:pPr>
   </w:style>
   <w:style w:type="paragraph" w:styleId="ListContinue2">
+    <w:rPr>
+      <w:rFonts w:ascii="Arial" w:hAnsi="Arial" w:cs="Arial" w:eastAsia="Arial"/>
+    </w:rPr>
     <w:name w:val="List Continue 2"/>
     <w:basedOn w:val="Normal"/>
     <w:uiPriority w:val="99"/>
@@ -5117,6 +5610,9 @@
     </w:pPr>
   </w:style>
   <w:style w:type="paragraph" w:styleId="ListContinue3">
+    <w:rPr>
+      <w:rFonts w:ascii="Arial" w:hAnsi="Arial" w:cs="Arial" w:eastAsia="Arial"/>
+    </w:rPr>
     <w:name w:val="List Continue 3"/>
     <w:basedOn w:val="Normal"/>
     <w:uiPriority w:val="99"/>
@@ -5146,7 +5642,7 @@
       </w:tabs>
     </w:pPr>
     <w:rPr>
-      <w:rFonts w:ascii="Courier" w:hAnsi="Courier"/>
+      <w:rFonts w:ascii="Arial" w:hAnsi="Arial" w:cs="Arial" w:eastAsia="Arial"/>
       <w:sz w:val="20"/>
       <w:szCs w:val="20"/>
     </w:rPr>
@@ -5158,7 +5654,7 @@
     <w:uiPriority w:val="99"/>
     <w:rsid w:val="0029639D"/>
     <w:rPr>
-      <w:rFonts w:ascii="Courier" w:hAnsi="Courier"/>
+      <w:rFonts w:ascii="Arial" w:hAnsi="Arial" w:cs="Arial" w:eastAsia="Arial"/>
       <w:sz w:val="20"/>
       <w:szCs w:val="20"/>
     </w:rPr>
@@ -5172,6 +5668,7 @@
     <w:qFormat/>
     <w:rsid w:val="00FC693F"/>
     <w:rPr>
+      <w:rFonts w:ascii="Arial" w:hAnsi="Arial" w:cs="Arial" w:eastAsia="Arial"/>
       <w:i/>
       <w:iCs/>
       <w:color w:val="000000" w:themeColor="text1"/>
@@ -5184,6 +5681,7 @@
     <w:uiPriority w:val="29"/>
     <w:rsid w:val="00FC693F"/>
     <w:rPr>
+      <w:rFonts w:ascii="Arial" w:hAnsi="Arial" w:cs="Arial" w:eastAsia="Arial"/>
       <w:i/>
       <w:iCs/>
       <w:color w:val="000000" w:themeColor="text1"/>
@@ -5197,7 +5695,7 @@
     <w:semiHidden/>
     <w:rsid w:val="00FC693F"/>
     <w:rPr>
-      <w:rFonts w:asciiTheme="majorHAnsi" w:eastAsiaTheme="majorEastAsia" w:hAnsiTheme="majorHAnsi" w:cstheme="majorBidi"/>
+      <w:rFonts w:cstheme="majorBidi" w:ascii="Arial" w:hAnsi="Arial" w:cs="Arial" w:eastAsia="Arial"/>
       <w:b/>
       <w:bCs/>
       <w:i/>
@@ -5213,7 +5711,7 @@
     <w:semiHidden/>
     <w:rsid w:val="00FC693F"/>
     <w:rPr>
-      <w:rFonts w:asciiTheme="majorHAnsi" w:eastAsiaTheme="majorEastAsia" w:hAnsiTheme="majorHAnsi" w:cstheme="majorBidi"/>
+      <w:rFonts w:cstheme="majorBidi" w:ascii="Arial" w:hAnsi="Arial" w:cs="Arial" w:eastAsia="Arial"/>
       <w:color w:val="243F60" w:themeColor="accent1" w:themeShade="7F"/>
     </w:rPr>
   </w:style>
@@ -5225,7 +5723,7 @@
     <w:semiHidden/>
     <w:rsid w:val="00FC693F"/>
     <w:rPr>
-      <w:rFonts w:asciiTheme="majorHAnsi" w:eastAsiaTheme="majorEastAsia" w:hAnsiTheme="majorHAnsi" w:cstheme="majorBidi"/>
+      <w:rFonts w:cstheme="majorBidi" w:ascii="Arial" w:hAnsi="Arial" w:cs="Arial" w:eastAsia="Arial"/>
       <w:i/>
       <w:iCs/>
       <w:color w:val="243F60" w:themeColor="accent1" w:themeShade="7F"/>
@@ -5239,7 +5737,7 @@
     <w:semiHidden/>
     <w:rsid w:val="00FC693F"/>
     <w:rPr>
-      <w:rFonts w:asciiTheme="majorHAnsi" w:eastAsiaTheme="majorEastAsia" w:hAnsiTheme="majorHAnsi" w:cstheme="majorBidi"/>
+      <w:rFonts w:cstheme="majorBidi" w:ascii="Arial" w:hAnsi="Arial" w:cs="Arial" w:eastAsia="Arial"/>
       <w:i/>
       <w:iCs/>
       <w:color w:val="404040" w:themeColor="text1" w:themeTint="BF"/>
@@ -5253,7 +5751,7 @@
     <w:semiHidden/>
     <w:rsid w:val="00FC693F"/>
     <w:rPr>
-      <w:rFonts w:asciiTheme="majorHAnsi" w:eastAsiaTheme="majorEastAsia" w:hAnsiTheme="majorHAnsi" w:cstheme="majorBidi"/>
+      <w:rFonts w:cstheme="majorBidi" w:ascii="Arial" w:hAnsi="Arial" w:cs="Arial" w:eastAsia="Arial"/>
       <w:color w:val="4F81BD" w:themeColor="accent1"/>
       <w:sz w:val="20"/>
       <w:szCs w:val="20"/>
@@ -5267,7 +5765,7 @@
     <w:semiHidden/>
     <w:rsid w:val="00FC693F"/>
     <w:rPr>
-      <w:rFonts w:asciiTheme="majorHAnsi" w:eastAsiaTheme="majorEastAsia" w:hAnsiTheme="majorHAnsi" w:cstheme="majorBidi"/>
+      <w:rFonts w:cstheme="majorBidi" w:ascii="Arial" w:hAnsi="Arial" w:cs="Arial" w:eastAsia="Arial"/>
       <w:i/>
       <w:iCs/>
       <w:color w:val="404040" w:themeColor="text1" w:themeTint="BF"/>
@@ -5288,6 +5786,7 @@
       <w:spacing w:line="240" w:lineRule="auto"/>
     </w:pPr>
     <w:rPr>
+      <w:rFonts w:ascii="Arial" w:hAnsi="Arial" w:cs="Arial" w:eastAsia="Arial"/>
       <w:b/>
       <w:bCs/>
       <w:color w:val="4F81BD" w:themeColor="accent1"/>
@@ -5302,6 +5801,7 @@
     <w:qFormat/>
     <w:rsid w:val="00FC693F"/>
     <w:rPr>
+      <w:rFonts w:ascii="Arial" w:hAnsi="Arial" w:cs="Arial" w:eastAsia="Arial"/>
       <w:b/>
       <w:bCs/>
     </w:rPr>
@@ -5313,6 +5813,7 @@
     <w:qFormat/>
     <w:rsid w:val="00FC693F"/>
     <w:rPr>
+      <w:rFonts w:ascii="Arial" w:hAnsi="Arial" w:cs="Arial" w:eastAsia="Arial"/>
       <w:i/>
       <w:iCs/>
     </w:rPr>
@@ -5333,6 +5834,7 @@
       <w:ind w:left="936" w:right="936"/>
     </w:pPr>
     <w:rPr>
+      <w:rFonts w:ascii="Arial" w:hAnsi="Arial" w:cs="Arial" w:eastAsia="Arial"/>
       <w:b/>
       <w:bCs/>
       <w:i/>
@@ -5347,6 +5849,7 @@
     <w:uiPriority w:val="30"/>
     <w:rsid w:val="00FC693F"/>
     <w:rPr>
+      <w:rFonts w:ascii="Arial" w:hAnsi="Arial" w:cs="Arial" w:eastAsia="Arial"/>
       <w:b/>
       <w:bCs/>
       <w:i/>
@@ -5361,6 +5864,7 @@
     <w:qFormat/>
     <w:rsid w:val="00FC693F"/>
     <w:rPr>
+      <w:rFonts w:ascii="Arial" w:hAnsi="Arial" w:cs="Arial" w:eastAsia="Arial"/>
       <w:i/>
       <w:iCs/>
       <w:color w:val="808080" w:themeColor="text1" w:themeTint="7F"/>
@@ -5373,6 +5877,7 @@
     <w:qFormat/>
     <w:rsid w:val="00FC693F"/>
     <w:rPr>
+      <w:rFonts w:ascii="Arial" w:hAnsi="Arial" w:cs="Arial" w:eastAsia="Arial"/>
       <w:b/>
       <w:bCs/>
       <w:i/>
@@ -5387,6 +5892,7 @@
     <w:qFormat/>
     <w:rsid w:val="00FC693F"/>
     <w:rPr>
+      <w:rFonts w:ascii="Arial" w:hAnsi="Arial" w:cs="Arial" w:eastAsia="Arial"/>
       <w:smallCaps/>
       <w:color w:val="C0504D" w:themeColor="accent2"/>
       <w:u w:val="single"/>
@@ -5399,6 +5905,7 @@
     <w:qFormat/>
     <w:rsid w:val="00FC693F"/>
     <w:rPr>
+      <w:rFonts w:ascii="Arial" w:hAnsi="Arial" w:cs="Arial" w:eastAsia="Arial"/>
       <w:b/>
       <w:bCs/>
       <w:smallCaps/>
@@ -5414,6 +5921,7 @@
     <w:qFormat/>
     <w:rsid w:val="00FC693F"/>
     <w:rPr>
+      <w:rFonts w:ascii="Arial" w:hAnsi="Arial" w:cs="Arial" w:eastAsia="Arial"/>
       <w:b/>
       <w:bCs/>
       <w:smallCaps/>
@@ -5421,6 +5929,9 @@
     </w:rPr>
   </w:style>
   <w:style w:type="paragraph" w:styleId="TOCHeading">
+    <w:rPr>
+      <w:rFonts w:ascii="Arial" w:hAnsi="Arial" w:cs="Arial" w:eastAsia="Arial"/>
+    </w:rPr>
     <w:name w:val="TOC Heading"/>
     <w:basedOn w:val="Heading1"/>
     <w:next w:val="Normal"/>
@@ -5434,6 +5945,9 @@
     </w:pPr>
   </w:style>
   <w:style w:type="table" w:styleId="TableGrid">
+    <w:rPr>
+      <w:rFonts w:ascii="Arial" w:hAnsi="Arial" w:cs="Arial" w:eastAsia="Arial"/>
+    </w:rPr>
     <w:name w:val="Table Grid"/>
     <w:basedOn w:val="TableNormal"/>
     <w:uiPriority w:val="59"/>
@@ -5468,6 +5982,7 @@
       <w:spacing w:after="0" w:line="240" w:lineRule="auto"/>
     </w:pPr>
     <w:rPr>
+      <w:rFonts w:ascii="Arial" w:hAnsi="Arial" w:cs="Arial" w:eastAsia="Arial"/>
       <w:color w:val="000000" w:themeColor="text1" w:themeShade="BF"/>
     </w:rPr>
     <w:tblPr>
@@ -5571,6 +6086,7 @@
       <w:spacing w:after="0" w:line="240" w:lineRule="auto"/>
     </w:pPr>
     <w:rPr>
+      <w:rFonts w:ascii="Arial" w:hAnsi="Arial" w:cs="Arial" w:eastAsia="Arial"/>
       <w:color w:val="365F91" w:themeColor="accent1" w:themeShade="BF"/>
     </w:rPr>
     <w:tblPr>
@@ -5674,6 +6190,7 @@
       <w:spacing w:after="0" w:line="240" w:lineRule="auto"/>
     </w:pPr>
     <w:rPr>
+      <w:rFonts w:ascii="Arial" w:hAnsi="Arial" w:cs="Arial" w:eastAsia="Arial"/>
       <w:color w:val="943634" w:themeColor="accent2" w:themeShade="BF"/>
     </w:rPr>
     <w:tblPr>
@@ -5777,6 +6294,7 @@
       <w:spacing w:after="0" w:line="240" w:lineRule="auto"/>
     </w:pPr>
     <w:rPr>
+      <w:rFonts w:ascii="Arial" w:hAnsi="Arial" w:cs="Arial" w:eastAsia="Arial"/>
       <w:color w:val="76923C" w:themeColor="accent3" w:themeShade="BF"/>
     </w:rPr>
     <w:tblPr>
@@ -5880,6 +6398,7 @@
       <w:spacing w:after="0" w:line="240" w:lineRule="auto"/>
     </w:pPr>
     <w:rPr>
+      <w:rFonts w:ascii="Arial" w:hAnsi="Arial" w:cs="Arial" w:eastAsia="Arial"/>
       <w:color w:val="5F497A" w:themeColor="accent4" w:themeShade="BF"/>
     </w:rPr>
     <w:tblPr>
@@ -5983,6 +6502,7 @@
       <w:spacing w:after="0" w:line="240" w:lineRule="auto"/>
     </w:pPr>
     <w:rPr>
+      <w:rFonts w:ascii="Arial" w:hAnsi="Arial" w:cs="Arial" w:eastAsia="Arial"/>
       <w:color w:val="31849B" w:themeColor="accent5" w:themeShade="BF"/>
     </w:rPr>
     <w:tblPr>
@@ -6086,6 +6606,7 @@
       <w:spacing w:after="0" w:line="240" w:lineRule="auto"/>
     </w:pPr>
     <w:rPr>
+      <w:rFonts w:ascii="Arial" w:hAnsi="Arial" w:cs="Arial" w:eastAsia="Arial"/>
       <w:color w:val="E36C0A" w:themeColor="accent6" w:themeShade="BF"/>
     </w:rPr>
     <w:tblPr>
@@ -6181,6 +6702,9 @@
     </w:tblStylePr>
   </w:style>
   <w:style w:type="table" w:styleId="LightList">
+    <w:rPr>
+      <w:rFonts w:ascii="Arial" w:hAnsi="Arial" w:cs="Arial" w:eastAsia="Arial"/>
+    </w:rPr>
     <w:name w:val="Light List"/>
     <w:basedOn w:val="TableNormal"/>
     <w:uiPriority w:val="61"/>
@@ -6273,6 +6797,9 @@
     </w:tblStylePr>
   </w:style>
   <w:style w:type="table" w:styleId="LightList-Accent1">
+    <w:rPr>
+      <w:rFonts w:ascii="Arial" w:hAnsi="Arial" w:cs="Arial" w:eastAsia="Arial"/>
+    </w:rPr>
     <w:name w:val="Light List Accent 1"/>
     <w:basedOn w:val="TableNormal"/>
     <w:uiPriority w:val="61"/>
@@ -6365,6 +6892,9 @@
     </w:tblStylePr>
   </w:style>
   <w:style w:type="table" w:styleId="LightList-Accent2">
+    <w:rPr>
+      <w:rFonts w:ascii="Arial" w:hAnsi="Arial" w:cs="Arial" w:eastAsia="Arial"/>
+    </w:rPr>
     <w:name w:val="Light List Accent 2"/>
     <w:basedOn w:val="TableNormal"/>
     <w:uiPriority w:val="61"/>
@@ -6457,6 +6987,9 @@
     </w:tblStylePr>
   </w:style>
   <w:style w:type="table" w:styleId="LightList-Accent3">
+    <w:rPr>
+      <w:rFonts w:ascii="Arial" w:hAnsi="Arial" w:cs="Arial" w:eastAsia="Arial"/>
+    </w:rPr>
     <w:name w:val="Light List Accent 3"/>
     <w:basedOn w:val="TableNormal"/>
     <w:uiPriority w:val="61"/>
@@ -6549,6 +7082,9 @@
     </w:tblStylePr>
   </w:style>
   <w:style w:type="table" w:styleId="LightList-Accent4">
+    <w:rPr>
+      <w:rFonts w:ascii="Arial" w:hAnsi="Arial" w:cs="Arial" w:eastAsia="Arial"/>
+    </w:rPr>
     <w:name w:val="Light List Accent 4"/>
     <w:basedOn w:val="TableNormal"/>
     <w:uiPriority w:val="61"/>
@@ -6641,6 +7177,9 @@
     </w:tblStylePr>
   </w:style>
   <w:style w:type="table" w:styleId="LightList-Accent5">
+    <w:rPr>
+      <w:rFonts w:ascii="Arial" w:hAnsi="Arial" w:cs="Arial" w:eastAsia="Arial"/>
+    </w:rPr>
     <w:name w:val="Light List Accent 5"/>
     <w:basedOn w:val="TableNormal"/>
     <w:uiPriority w:val="61"/>
@@ -6733,6 +7272,9 @@
     </w:tblStylePr>
   </w:style>
   <w:style w:type="table" w:styleId="LightList-Accent6">
+    <w:rPr>
+      <w:rFonts w:ascii="Arial" w:hAnsi="Arial" w:cs="Arial" w:eastAsia="Arial"/>
+    </w:rPr>
     <w:name w:val="Light List Accent 6"/>
     <w:basedOn w:val="TableNormal"/>
     <w:uiPriority w:val="61"/>
@@ -6825,6 +7367,9 @@
     </w:tblStylePr>
   </w:style>
   <w:style w:type="table" w:styleId="LightGrid">
+    <w:rPr>
+      <w:rFonts w:ascii="Arial" w:hAnsi="Arial" w:cs="Arial" w:eastAsia="Arial"/>
+    </w:rPr>
     <w:name w:val="Light Grid"/>
     <w:basedOn w:val="TableNormal"/>
     <w:uiPriority w:val="62"/>
@@ -6955,6 +7500,9 @@
     </w:tblStylePr>
   </w:style>
   <w:style w:type="table" w:styleId="LightGrid-Accent1">
+    <w:rPr>
+      <w:rFonts w:ascii="Arial" w:hAnsi="Arial" w:cs="Arial" w:eastAsia="Arial"/>
+    </w:rPr>
     <w:name w:val="Light Grid Accent 1"/>
     <w:basedOn w:val="TableNormal"/>
     <w:uiPriority w:val="62"/>
@@ -7085,6 +7633,9 @@
     </w:tblStylePr>
   </w:style>
   <w:style w:type="table" w:styleId="LightGrid-Accent2">
+    <w:rPr>
+      <w:rFonts w:ascii="Arial" w:hAnsi="Arial" w:cs="Arial" w:eastAsia="Arial"/>
+    </w:rPr>
     <w:name w:val="Light Grid Accent 2"/>
     <w:basedOn w:val="TableNormal"/>
     <w:uiPriority w:val="62"/>
@@ -7215,6 +7766,9 @@
     </w:tblStylePr>
   </w:style>
   <w:style w:type="table" w:styleId="LightGrid-Accent3">
+    <w:rPr>
+      <w:rFonts w:ascii="Arial" w:hAnsi="Arial" w:cs="Arial" w:eastAsia="Arial"/>
+    </w:rPr>
     <w:name w:val="Light Grid Accent 3"/>
     <w:basedOn w:val="TableNormal"/>
     <w:uiPriority w:val="62"/>
@@ -7345,6 +7899,9 @@
     </w:tblStylePr>
   </w:style>
   <w:style w:type="table" w:styleId="LightGrid-Accent4">
+    <w:rPr>
+      <w:rFonts w:ascii="Arial" w:hAnsi="Arial" w:cs="Arial" w:eastAsia="Arial"/>
+    </w:rPr>
     <w:name w:val="Light Grid Accent 4"/>
     <w:basedOn w:val="TableNormal"/>
     <w:uiPriority w:val="62"/>
@@ -7475,6 +8032,9 @@
     </w:tblStylePr>
   </w:style>
   <w:style w:type="table" w:styleId="LightGrid-Accent5">
+    <w:rPr>
+      <w:rFonts w:ascii="Arial" w:hAnsi="Arial" w:cs="Arial" w:eastAsia="Arial"/>
+    </w:rPr>
     <w:name w:val="Light Grid Accent 5"/>
     <w:basedOn w:val="TableNormal"/>
     <w:uiPriority w:val="62"/>
@@ -7605,6 +8165,9 @@
     </w:tblStylePr>
   </w:style>
   <w:style w:type="table" w:styleId="LightGrid-Accent6">
+    <w:rPr>
+      <w:rFonts w:ascii="Arial" w:hAnsi="Arial" w:cs="Arial" w:eastAsia="Arial"/>
+    </w:rPr>
     <w:name w:val="Light Grid Accent 6"/>
     <w:basedOn w:val="TableNormal"/>
     <w:uiPriority w:val="62"/>
@@ -7735,6 +8298,9 @@
     </w:tblStylePr>
   </w:style>
   <w:style w:type="table" w:styleId="MediumShading1">
+    <w:rPr>
+      <w:rFonts w:ascii="Arial" w:hAnsi="Arial" w:cs="Arial" w:eastAsia="Arial"/>
+    </w:rPr>
     <w:name w:val="Medium Shading 1"/>
     <w:basedOn w:val="TableNormal"/>
     <w:uiPriority w:val="63"/>
@@ -7841,6 +8407,9 @@
     </w:tblStylePr>
   </w:style>
   <w:style w:type="table" w:styleId="MediumShading1-Accent1">
+    <w:rPr>
+      <w:rFonts w:ascii="Arial" w:hAnsi="Arial" w:cs="Arial" w:eastAsia="Arial"/>
+    </w:rPr>
     <w:name w:val="Medium Shading 1 Accent 1"/>
     <w:basedOn w:val="TableNormal"/>
     <w:uiPriority w:val="63"/>
@@ -7947,6 +8516,9 @@
     </w:tblStylePr>
   </w:style>
   <w:style w:type="table" w:styleId="MediumShading1-Accent2">
+    <w:rPr>
+      <w:rFonts w:ascii="Arial" w:hAnsi="Arial" w:cs="Arial" w:eastAsia="Arial"/>
+    </w:rPr>
     <w:name w:val="Medium Shading 1 Accent 2"/>
     <w:basedOn w:val="TableNormal"/>
     <w:uiPriority w:val="63"/>
@@ -8053,6 +8625,9 @@
     </w:tblStylePr>
   </w:style>
   <w:style w:type="table" w:styleId="MediumShading1-Accent3">
+    <w:rPr>
+      <w:rFonts w:ascii="Arial" w:hAnsi="Arial" w:cs="Arial" w:eastAsia="Arial"/>
+    </w:rPr>
     <w:name w:val="Medium Shading 1 Accent 3"/>
     <w:basedOn w:val="TableNormal"/>
     <w:uiPriority w:val="63"/>
@@ -8159,6 +8734,9 @@
     </w:tblStylePr>
   </w:style>
   <w:style w:type="table" w:styleId="MediumShading1-Accent4">
+    <w:rPr>
+      <w:rFonts w:ascii="Arial" w:hAnsi="Arial" w:cs="Arial" w:eastAsia="Arial"/>
+    </w:rPr>
     <w:name w:val="Medium Shading 1 Accent 4"/>
     <w:basedOn w:val="TableNormal"/>
     <w:uiPriority w:val="63"/>
@@ -8265,6 +8843,9 @@
     </w:tblStylePr>
   </w:style>
   <w:style w:type="table" w:styleId="MediumShading1-Accent5">
+    <w:rPr>
+      <w:rFonts w:ascii="Arial" w:hAnsi="Arial" w:cs="Arial" w:eastAsia="Arial"/>
+    </w:rPr>
     <w:name w:val="Medium Shading 1 Accent 5"/>
     <w:basedOn w:val="TableNormal"/>
     <w:uiPriority w:val="63"/>
@@ -8371,6 +8952,9 @@
     </w:tblStylePr>
   </w:style>
   <w:style w:type="table" w:styleId="MediumShading1-Accent6">
+    <w:rPr>
+      <w:rFonts w:ascii="Arial" w:hAnsi="Arial" w:cs="Arial" w:eastAsia="Arial"/>
+    </w:rPr>
     <w:name w:val="Medium Shading 1 Accent 6"/>
     <w:basedOn w:val="TableNormal"/>
     <w:uiPriority w:val="63"/>
@@ -8477,6 +9061,9 @@
     </w:tblStylePr>
   </w:style>
   <w:style w:type="table" w:styleId="MediumShading2">
+    <w:rPr>
+      <w:rFonts w:ascii="Arial" w:hAnsi="Arial" w:cs="Arial" w:eastAsia="Arial"/>
+    </w:rPr>
     <w:name w:val="Medium Shading 2"/>
     <w:basedOn w:val="TableNormal"/>
     <w:uiPriority w:val="64"/>
@@ -8626,6 +9213,9 @@
     </w:tblStylePr>
   </w:style>
   <w:style w:type="table" w:styleId="MediumShading2-Accent1">
+    <w:rPr>
+      <w:rFonts w:ascii="Arial" w:hAnsi="Arial" w:cs="Arial" w:eastAsia="Arial"/>
+    </w:rPr>
     <w:name w:val="Medium Shading 2 Accent 1"/>
     <w:basedOn w:val="TableNormal"/>
     <w:uiPriority w:val="64"/>
@@ -8775,6 +9365,9 @@
     </w:tblStylePr>
   </w:style>
   <w:style w:type="table" w:styleId="MediumShading2-Accent2">
+    <w:rPr>
+      <w:rFonts w:ascii="Arial" w:hAnsi="Arial" w:cs="Arial" w:eastAsia="Arial"/>
+    </w:rPr>
     <w:name w:val="Medium Shading 2 Accent 2"/>
     <w:basedOn w:val="TableNormal"/>
     <w:uiPriority w:val="64"/>
@@ -8924,6 +9517,9 @@
     </w:tblStylePr>
   </w:style>
   <w:style w:type="table" w:styleId="MediumShading2-Accent3">
+    <w:rPr>
+      <w:rFonts w:ascii="Arial" w:hAnsi="Arial" w:cs="Arial" w:eastAsia="Arial"/>
+    </w:rPr>
     <w:name w:val="Medium Shading 2 Accent 3"/>
     <w:basedOn w:val="TableNormal"/>
     <w:uiPriority w:val="64"/>
@@ -9073,6 +9669,9 @@
     </w:tblStylePr>
   </w:style>
   <w:style w:type="table" w:styleId="MediumShading2-Accent4">
+    <w:rPr>
+      <w:rFonts w:ascii="Arial" w:hAnsi="Arial" w:cs="Arial" w:eastAsia="Arial"/>
+    </w:rPr>
     <w:name w:val="Medium Shading 2 Accent 4"/>
     <w:basedOn w:val="TableNormal"/>
     <w:uiPriority w:val="64"/>
@@ -9222,6 +9821,9 @@
     </w:tblStylePr>
   </w:style>
   <w:style w:type="table" w:styleId="MediumShading2-Accent5">
+    <w:rPr>
+      <w:rFonts w:ascii="Arial" w:hAnsi="Arial" w:cs="Arial" w:eastAsia="Arial"/>
+    </w:rPr>
     <w:name w:val="Medium Shading 2 Accent 5"/>
     <w:basedOn w:val="TableNormal"/>
     <w:uiPriority w:val="64"/>
@@ -9371,6 +9973,9 @@
     </w:tblStylePr>
   </w:style>
   <w:style w:type="table" w:styleId="MediumShading2-Accent6">
+    <w:rPr>
+      <w:rFonts w:ascii="Arial" w:hAnsi="Arial" w:cs="Arial" w:eastAsia="Arial"/>
+    </w:rPr>
     <w:name w:val="Medium Shading 2 Accent 6"/>
     <w:basedOn w:val="TableNormal"/>
     <w:uiPriority w:val="64"/>
@@ -9528,6 +10133,7 @@
       <w:spacing w:after="0" w:line="240" w:lineRule="auto"/>
     </w:pPr>
     <w:rPr>
+      <w:rFonts w:ascii="Arial" w:hAnsi="Arial" w:cs="Arial" w:eastAsia="Arial"/>
       <w:color w:val="000000" w:themeColor="text1"/>
     </w:rPr>
     <w:tblPr>
@@ -9612,6 +10218,7 @@
       <w:spacing w:after="0" w:line="240" w:lineRule="auto"/>
     </w:pPr>
     <w:rPr>
+      <w:rFonts w:ascii="Arial" w:hAnsi="Arial" w:cs="Arial" w:eastAsia="Arial"/>
       <w:color w:val="000000" w:themeColor="text1"/>
     </w:rPr>
     <w:tblPr>
@@ -9696,6 +10303,7 @@
       <w:spacing w:after="0" w:line="240" w:lineRule="auto"/>
     </w:pPr>
     <w:rPr>
+      <w:rFonts w:ascii="Arial" w:hAnsi="Arial" w:cs="Arial" w:eastAsia="Arial"/>
       <w:color w:val="000000" w:themeColor="text1"/>
     </w:rPr>
     <w:tblPr>
@@ -9780,6 +10388,7 @@
       <w:spacing w:after="0" w:line="240" w:lineRule="auto"/>
     </w:pPr>
     <w:rPr>
+      <w:rFonts w:ascii="Arial" w:hAnsi="Arial" w:cs="Arial" w:eastAsia="Arial"/>
       <w:color w:val="000000" w:themeColor="text1"/>
     </w:rPr>
     <w:tblPr>
@@ -9864,6 +10473,7 @@
       <w:spacing w:after="0" w:line="240" w:lineRule="auto"/>
     </w:pPr>
     <w:rPr>
+      <w:rFonts w:ascii="Arial" w:hAnsi="Arial" w:cs="Arial" w:eastAsia="Arial"/>
       <w:color w:val="000000" w:themeColor="text1"/>
     </w:rPr>
     <w:tblPr>
@@ -9948,6 +10558,7 @@
       <w:spacing w:after="0" w:line="240" w:lineRule="auto"/>
     </w:pPr>
     <w:rPr>
+      <w:rFonts w:ascii="Arial" w:hAnsi="Arial" w:cs="Arial" w:eastAsia="Arial"/>
       <w:color w:val="000000" w:themeColor="text1"/>
     </w:rPr>
     <w:tblPr>
@@ -10032,6 +10643,7 @@
       <w:spacing w:after="0" w:line="240" w:lineRule="auto"/>
     </w:pPr>
     <w:rPr>
+      <w:rFonts w:ascii="Arial" w:hAnsi="Arial" w:cs="Arial" w:eastAsia="Arial"/>
       <w:color w:val="000000" w:themeColor="text1"/>
     </w:rPr>
     <w:tblPr>
@@ -10116,7 +10728,7 @@
       <w:spacing w:after="0" w:line="240" w:lineRule="auto"/>
     </w:pPr>
     <w:rPr>
-      <w:rFonts w:asciiTheme="majorHAnsi" w:eastAsiaTheme="majorEastAsia" w:hAnsiTheme="majorHAnsi" w:cstheme="majorBidi"/>
+      <w:rFonts w:cstheme="majorBidi" w:ascii="Arial" w:hAnsi="Arial" w:cs="Arial" w:eastAsia="Arial"/>
       <w:color w:val="000000" w:themeColor="text1"/>
     </w:rPr>
     <w:tblPr>
@@ -10244,7 +10856,7 @@
       <w:spacing w:after="0" w:line="240" w:lineRule="auto"/>
     </w:pPr>
     <w:rPr>
-      <w:rFonts w:asciiTheme="majorHAnsi" w:eastAsiaTheme="majorEastAsia" w:hAnsiTheme="majorHAnsi" w:cstheme="majorBidi"/>
+      <w:rFonts w:cstheme="majorBidi" w:ascii="Arial" w:hAnsi="Arial" w:cs="Arial" w:eastAsia="Arial"/>
       <w:color w:val="000000" w:themeColor="text1"/>
     </w:rPr>
     <w:tblPr>
@@ -10372,7 +10984,7 @@
       <w:spacing w:after="0" w:line="240" w:lineRule="auto"/>
     </w:pPr>
     <w:rPr>
-      <w:rFonts w:asciiTheme="majorHAnsi" w:eastAsiaTheme="majorEastAsia" w:hAnsiTheme="majorHAnsi" w:cstheme="majorBidi"/>
+      <w:rFonts w:cstheme="majorBidi" w:ascii="Arial" w:hAnsi="Arial" w:cs="Arial" w:eastAsia="Arial"/>
       <w:color w:val="000000" w:themeColor="text1"/>
     </w:rPr>
     <w:tblPr>
@@ -10500,7 +11112,7 @@
       <w:spacing w:after="0" w:line="240" w:lineRule="auto"/>
     </w:pPr>
     <w:rPr>
-      <w:rFonts w:asciiTheme="majorHAnsi" w:eastAsiaTheme="majorEastAsia" w:hAnsiTheme="majorHAnsi" w:cstheme="majorBidi"/>
+      <w:rFonts w:cstheme="majorBidi" w:ascii="Arial" w:hAnsi="Arial" w:cs="Arial" w:eastAsia="Arial"/>
       <w:color w:val="000000" w:themeColor="text1"/>
     </w:rPr>
     <w:tblPr>
@@ -10628,7 +11240,7 @@
       <w:spacing w:after="0" w:line="240" w:lineRule="auto"/>
     </w:pPr>
     <w:rPr>
-      <w:rFonts w:asciiTheme="majorHAnsi" w:eastAsiaTheme="majorEastAsia" w:hAnsiTheme="majorHAnsi" w:cstheme="majorBidi"/>
+      <w:rFonts w:cstheme="majorBidi" w:ascii="Arial" w:hAnsi="Arial" w:cs="Arial" w:eastAsia="Arial"/>
       <w:color w:val="000000" w:themeColor="text1"/>
     </w:rPr>
     <w:tblPr>
@@ -10756,7 +11368,7 @@
       <w:spacing w:after="0" w:line="240" w:lineRule="auto"/>
     </w:pPr>
     <w:rPr>
-      <w:rFonts w:asciiTheme="majorHAnsi" w:eastAsiaTheme="majorEastAsia" w:hAnsiTheme="majorHAnsi" w:cstheme="majorBidi"/>
+      <w:rFonts w:cstheme="majorBidi" w:ascii="Arial" w:hAnsi="Arial" w:cs="Arial" w:eastAsia="Arial"/>
       <w:color w:val="000000" w:themeColor="text1"/>
     </w:rPr>
     <w:tblPr>
@@ -10884,7 +11496,7 @@
       <w:spacing w:after="0" w:line="240" w:lineRule="auto"/>
     </w:pPr>
     <w:rPr>
-      <w:rFonts w:asciiTheme="majorHAnsi" w:eastAsiaTheme="majorEastAsia" w:hAnsiTheme="majorHAnsi" w:cstheme="majorBidi"/>
+      <w:rFonts w:cstheme="majorBidi" w:ascii="Arial" w:hAnsi="Arial" w:cs="Arial" w:eastAsia="Arial"/>
       <w:color w:val="000000" w:themeColor="text1"/>
     </w:rPr>
     <w:tblPr>
@@ -11004,6 +11616,9 @@
     </w:tblStylePr>
   </w:style>
   <w:style w:type="table" w:styleId="MediumGrid1">
+    <w:rPr>
+      <w:rFonts w:ascii="Arial" w:hAnsi="Arial" w:cs="Arial" w:eastAsia="Arial"/>
+    </w:rPr>
     <w:name w:val="Medium Grid 1"/>
     <w:basedOn w:val="TableNormal"/>
     <w:uiPriority w:val="67"/>
@@ -11077,6 +11692,9 @@
     </w:tblStylePr>
   </w:style>
   <w:style w:type="table" w:styleId="MediumGrid1-Accent1">
+    <w:rPr>
+      <w:rFonts w:ascii="Arial" w:hAnsi="Arial" w:cs="Arial" w:eastAsia="Arial"/>
+    </w:rPr>
     <w:name w:val="Medium Grid 1 Accent 1"/>
     <w:basedOn w:val="TableNormal"/>
     <w:uiPriority w:val="67"/>
@@ -11150,6 +11768,9 @@
     </w:tblStylePr>
   </w:style>
   <w:style w:type="table" w:styleId="MediumGrid1-Accent2">
+    <w:rPr>
+      <w:rFonts w:ascii="Arial" w:hAnsi="Arial" w:cs="Arial" w:eastAsia="Arial"/>
+    </w:rPr>
     <w:name w:val="Medium Grid 1 Accent 2"/>
     <w:basedOn w:val="TableNormal"/>
     <w:uiPriority w:val="67"/>
@@ -11223,6 +11844,9 @@
     </w:tblStylePr>
   </w:style>
   <w:style w:type="table" w:styleId="MediumGrid1-Accent3">
+    <w:rPr>
+      <w:rFonts w:ascii="Arial" w:hAnsi="Arial" w:cs="Arial" w:eastAsia="Arial"/>
+    </w:rPr>
     <w:name w:val="Medium Grid 1 Accent 3"/>
     <w:basedOn w:val="TableNormal"/>
     <w:uiPriority w:val="67"/>
@@ -11296,6 +11920,9 @@
     </w:tblStylePr>
   </w:style>
   <w:style w:type="table" w:styleId="MediumGrid1-Accent4">
+    <w:rPr>
+      <w:rFonts w:ascii="Arial" w:hAnsi="Arial" w:cs="Arial" w:eastAsia="Arial"/>
+    </w:rPr>
     <w:name w:val="Medium Grid 1 Accent 4"/>
     <w:basedOn w:val="TableNormal"/>
     <w:uiPriority w:val="67"/>
@@ -11369,6 +11996,9 @@
     </w:tblStylePr>
   </w:style>
   <w:style w:type="table" w:styleId="MediumGrid1-Accent5">
+    <w:rPr>
+      <w:rFonts w:ascii="Arial" w:hAnsi="Arial" w:cs="Arial" w:eastAsia="Arial"/>
+    </w:rPr>
     <w:name w:val="Medium Grid 1 Accent 5"/>
     <w:basedOn w:val="TableNormal"/>
     <w:uiPriority w:val="67"/>
@@ -11442,6 +12072,9 @@
     </w:tblStylePr>
   </w:style>
   <w:style w:type="table" w:styleId="MediumGrid1-Accent6">
+    <w:rPr>
+      <w:rFonts w:ascii="Arial" w:hAnsi="Arial" w:cs="Arial" w:eastAsia="Arial"/>
+    </w:rPr>
     <w:name w:val="Medium Grid 1 Accent 6"/>
     <w:basedOn w:val="TableNormal"/>
     <w:uiPriority w:val="67"/>
@@ -11523,7 +12156,7 @@
       <w:spacing w:after="0" w:line="240" w:lineRule="auto"/>
     </w:pPr>
     <w:rPr>
-      <w:rFonts w:asciiTheme="majorHAnsi" w:eastAsiaTheme="majorEastAsia" w:hAnsiTheme="majorHAnsi" w:cstheme="majorBidi"/>
+      <w:rFonts w:cstheme="majorBidi" w:ascii="Arial" w:hAnsi="Arial" w:cs="Arial" w:eastAsia="Arial"/>
       <w:color w:val="000000" w:themeColor="text1"/>
     </w:rPr>
     <w:tblPr>
@@ -11648,7 +12281,7 @@
       <w:spacing w:after="0" w:line="240" w:lineRule="auto"/>
     </w:pPr>
     <w:rPr>
-      <w:rFonts w:asciiTheme="majorHAnsi" w:eastAsiaTheme="majorEastAsia" w:hAnsiTheme="majorHAnsi" w:cstheme="majorBidi"/>
+      <w:rFonts w:cstheme="majorBidi" w:ascii="Arial" w:hAnsi="Arial" w:cs="Arial" w:eastAsia="Arial"/>
       <w:color w:val="000000" w:themeColor="text1"/>
     </w:rPr>
     <w:tblPr>
@@ -11773,7 +12406,7 @@
       <w:spacing w:after="0" w:line="240" w:lineRule="auto"/>
     </w:pPr>
     <w:rPr>
-      <w:rFonts w:asciiTheme="majorHAnsi" w:eastAsiaTheme="majorEastAsia" w:hAnsiTheme="majorHAnsi" w:cstheme="majorBidi"/>
+      <w:rFonts w:cstheme="majorBidi" w:ascii="Arial" w:hAnsi="Arial" w:cs="Arial" w:eastAsia="Arial"/>
       <w:color w:val="000000" w:themeColor="text1"/>
     </w:rPr>
     <w:tblPr>
@@ -11898,7 +12531,7 @@
       <w:spacing w:after="0" w:line="240" w:lineRule="auto"/>
     </w:pPr>
     <w:rPr>
-      <w:rFonts w:asciiTheme="majorHAnsi" w:eastAsiaTheme="majorEastAsia" w:hAnsiTheme="majorHAnsi" w:cstheme="majorBidi"/>
+      <w:rFonts w:cstheme="majorBidi" w:ascii="Arial" w:hAnsi="Arial" w:cs="Arial" w:eastAsia="Arial"/>
       <w:color w:val="000000" w:themeColor="text1"/>
     </w:rPr>
     <w:tblPr>
@@ -12023,7 +12656,7 @@
       <w:spacing w:after="0" w:line="240" w:lineRule="auto"/>
     </w:pPr>
     <w:rPr>
-      <w:rFonts w:asciiTheme="majorHAnsi" w:eastAsiaTheme="majorEastAsia" w:hAnsiTheme="majorHAnsi" w:cstheme="majorBidi"/>
+      <w:rFonts w:cstheme="majorBidi" w:ascii="Arial" w:hAnsi="Arial" w:cs="Arial" w:eastAsia="Arial"/>
       <w:color w:val="000000" w:themeColor="text1"/>
     </w:rPr>
     <w:tblPr>
@@ -12148,7 +12781,7 @@
       <w:spacing w:after="0" w:line="240" w:lineRule="auto"/>
     </w:pPr>
     <w:rPr>
-      <w:rFonts w:asciiTheme="majorHAnsi" w:eastAsiaTheme="majorEastAsia" w:hAnsiTheme="majorHAnsi" w:cstheme="majorBidi"/>
+      <w:rFonts w:cstheme="majorBidi" w:ascii="Arial" w:hAnsi="Arial" w:cs="Arial" w:eastAsia="Arial"/>
       <w:color w:val="000000" w:themeColor="text1"/>
     </w:rPr>
     <w:tblPr>
@@ -12273,7 +12906,7 @@
       <w:spacing w:after="0" w:line="240" w:lineRule="auto"/>
     </w:pPr>
     <w:rPr>
-      <w:rFonts w:asciiTheme="majorHAnsi" w:eastAsiaTheme="majorEastAsia" w:hAnsiTheme="majorHAnsi" w:cstheme="majorBidi"/>
+      <w:rFonts w:cstheme="majorBidi" w:ascii="Arial" w:hAnsi="Arial" w:cs="Arial" w:eastAsia="Arial"/>
       <w:color w:val="000000" w:themeColor="text1"/>
     </w:rPr>
     <w:tblPr>
@@ -12390,6 +13023,9 @@
     </w:tblStylePr>
   </w:style>
   <w:style w:type="table" w:styleId="MediumGrid3">
+    <w:rPr>
+      <w:rFonts w:ascii="Arial" w:hAnsi="Arial" w:cs="Arial" w:eastAsia="Arial"/>
+    </w:rPr>
     <w:name w:val="Medium Grid 3"/>
     <w:basedOn w:val="TableNormal"/>
     <w:uiPriority w:val="69"/>
@@ -12531,6 +13167,9 @@
     </w:tblStylePr>
   </w:style>
   <w:style w:type="table" w:styleId="MediumGrid3-Accent1">
+    <w:rPr>
+      <w:rFonts w:ascii="Arial" w:hAnsi="Arial" w:cs="Arial" w:eastAsia="Arial"/>
+    </w:rPr>
     <w:name w:val="Medium Grid 3 Accent 1"/>
     <w:basedOn w:val="TableNormal"/>
     <w:uiPriority w:val="69"/>
@@ -12672,6 +13311,9 @@
     </w:tblStylePr>
   </w:style>
   <w:style w:type="table" w:styleId="MediumGrid3-Accent2">
+    <w:rPr>
+      <w:rFonts w:ascii="Arial" w:hAnsi="Arial" w:cs="Arial" w:eastAsia="Arial"/>
+    </w:rPr>
     <w:name w:val="Medium Grid 3 Accent 2"/>
     <w:basedOn w:val="TableNormal"/>
     <w:uiPriority w:val="69"/>
@@ -12813,6 +13455,9 @@
     </w:tblStylePr>
   </w:style>
   <w:style w:type="table" w:styleId="MediumGrid3-Accent3">
+    <w:rPr>
+      <w:rFonts w:ascii="Arial" w:hAnsi="Arial" w:cs="Arial" w:eastAsia="Arial"/>
+    </w:rPr>
     <w:name w:val="Medium Grid 3 Accent 3"/>
     <w:basedOn w:val="TableNormal"/>
     <w:uiPriority w:val="69"/>
@@ -12954,6 +13599,9 @@
     </w:tblStylePr>
   </w:style>
   <w:style w:type="table" w:styleId="MediumGrid3-Accent4">
+    <w:rPr>
+      <w:rFonts w:ascii="Arial" w:hAnsi="Arial" w:cs="Arial" w:eastAsia="Arial"/>
+    </w:rPr>
     <w:name w:val="Medium Grid 3 Accent 4"/>
     <w:basedOn w:val="TableNormal"/>
     <w:uiPriority w:val="69"/>
@@ -13095,6 +13743,9 @@
     </w:tblStylePr>
   </w:style>
   <w:style w:type="table" w:styleId="MediumGrid3-Accent5">
+    <w:rPr>
+      <w:rFonts w:ascii="Arial" w:hAnsi="Arial" w:cs="Arial" w:eastAsia="Arial"/>
+    </w:rPr>
     <w:name w:val="Medium Grid 3 Accent 5"/>
     <w:basedOn w:val="TableNormal"/>
     <w:uiPriority w:val="69"/>
@@ -13236,6 +13887,9 @@
     </w:tblStylePr>
   </w:style>
   <w:style w:type="table" w:styleId="MediumGrid3-Accent6">
+    <w:rPr>
+      <w:rFonts w:ascii="Arial" w:hAnsi="Arial" w:cs="Arial" w:eastAsia="Arial"/>
+    </w:rPr>
     <w:name w:val="Medium Grid 3 Accent 6"/>
     <w:basedOn w:val="TableNormal"/>
     <w:uiPriority w:val="69"/>
@@ -13385,6 +14039,7 @@
       <w:spacing w:after="0" w:line="240" w:lineRule="auto"/>
     </w:pPr>
     <w:rPr>
+      <w:rFonts w:ascii="Arial" w:hAnsi="Arial" w:cs="Arial" w:eastAsia="Arial"/>
       <w:color w:val="FFFFFF" w:themeColor="background1"/>
     </w:rPr>
     <w:tblPr>
@@ -13499,6 +14154,7 @@
       <w:spacing w:after="0" w:line="240" w:lineRule="auto"/>
     </w:pPr>
     <w:rPr>
+      <w:rFonts w:ascii="Arial" w:hAnsi="Arial" w:cs="Arial" w:eastAsia="Arial"/>
       <w:color w:val="FFFFFF" w:themeColor="background1"/>
     </w:rPr>
     <w:tblPr>
@@ -13613,6 +14269,7 @@
       <w:spacing w:after="0" w:line="240" w:lineRule="auto"/>
     </w:pPr>
     <w:rPr>
+      <w:rFonts w:ascii="Arial" w:hAnsi="Arial" w:cs="Arial" w:eastAsia="Arial"/>
       <w:color w:val="FFFFFF" w:themeColor="background1"/>
     </w:rPr>
     <w:tblPr>
@@ -13727,6 +14384,7 @@
       <w:spacing w:after="0" w:line="240" w:lineRule="auto"/>
     </w:pPr>
     <w:rPr>
+      <w:rFonts w:ascii="Arial" w:hAnsi="Arial" w:cs="Arial" w:eastAsia="Arial"/>
       <w:color w:val="FFFFFF" w:themeColor="background1"/>
     </w:rPr>
     <w:tblPr>
@@ -13841,6 +14499,7 @@
       <w:spacing w:after="0" w:line="240" w:lineRule="auto"/>
     </w:pPr>
     <w:rPr>
+      <w:rFonts w:ascii="Arial" w:hAnsi="Arial" w:cs="Arial" w:eastAsia="Arial"/>
       <w:color w:val="FFFFFF" w:themeColor="background1"/>
     </w:rPr>
     <w:tblPr>
@@ -13955,6 +14614,7 @@
       <w:spacing w:after="0" w:line="240" w:lineRule="auto"/>
     </w:pPr>
     <w:rPr>
+      <w:rFonts w:ascii="Arial" w:hAnsi="Arial" w:cs="Arial" w:eastAsia="Arial"/>
       <w:color w:val="FFFFFF" w:themeColor="background1"/>
     </w:rPr>
     <w:tblPr>
@@ -14069,6 +14729,7 @@
       <w:spacing w:after="0" w:line="240" w:lineRule="auto"/>
     </w:pPr>
     <w:rPr>
+      <w:rFonts w:ascii="Arial" w:hAnsi="Arial" w:cs="Arial" w:eastAsia="Arial"/>
       <w:color w:val="FFFFFF" w:themeColor="background1"/>
     </w:rPr>
     <w:tblPr>
@@ -14183,6 +14844,7 @@
       <w:spacing w:after="0" w:line="240" w:lineRule="auto"/>
     </w:pPr>
     <w:rPr>
+      <w:rFonts w:ascii="Arial" w:hAnsi="Arial" w:cs="Arial" w:eastAsia="Arial"/>
       <w:color w:val="000000" w:themeColor="text1"/>
     </w:rPr>
     <w:tblPr>
@@ -14305,6 +14967,7 @@
       <w:spacing w:after="0" w:line="240" w:lineRule="auto"/>
     </w:pPr>
     <w:rPr>
+      <w:rFonts w:ascii="Arial" w:hAnsi="Arial" w:cs="Arial" w:eastAsia="Arial"/>
       <w:color w:val="000000" w:themeColor="text1"/>
     </w:rPr>
     <w:tblPr>
@@ -14427,6 +15090,7 @@
       <w:spacing w:after="0" w:line="240" w:lineRule="auto"/>
     </w:pPr>
     <w:rPr>
+      <w:rFonts w:ascii="Arial" w:hAnsi="Arial" w:cs="Arial" w:eastAsia="Arial"/>
       <w:color w:val="000000" w:themeColor="text1"/>
     </w:rPr>
     <w:tblPr>
@@ -14549,6 +15213,7 @@
       <w:spacing w:after="0" w:line="240" w:lineRule="auto"/>
     </w:pPr>
     <w:rPr>
+      <w:rFonts w:ascii="Arial" w:hAnsi="Arial" w:cs="Arial" w:eastAsia="Arial"/>
       <w:color w:val="000000" w:themeColor="text1"/>
     </w:rPr>
     <w:tblPr>
@@ -14661,6 +15326,7 @@
       <w:spacing w:after="0" w:line="240" w:lineRule="auto"/>
     </w:pPr>
     <w:rPr>
+      <w:rFonts w:ascii="Arial" w:hAnsi="Arial" w:cs="Arial" w:eastAsia="Arial"/>
       <w:color w:val="000000" w:themeColor="text1"/>
     </w:rPr>
     <w:tblPr>
@@ -14783,6 +15449,7 @@
       <w:spacing w:after="0" w:line="240" w:lineRule="auto"/>
     </w:pPr>
     <w:rPr>
+      <w:rFonts w:ascii="Arial" w:hAnsi="Arial" w:cs="Arial" w:eastAsia="Arial"/>
       <w:color w:val="000000" w:themeColor="text1"/>
     </w:rPr>
     <w:tblPr>
@@ -14905,6 +15572,7 @@
       <w:spacing w:after="0" w:line="240" w:lineRule="auto"/>
     </w:pPr>
     <w:rPr>
+      <w:rFonts w:ascii="Arial" w:hAnsi="Arial" w:cs="Arial" w:eastAsia="Arial"/>
       <w:color w:val="000000" w:themeColor="text1"/>
     </w:rPr>
     <w:tblPr>
@@ -15027,6 +15695,7 @@
       <w:spacing w:after="0" w:line="240" w:lineRule="auto"/>
     </w:pPr>
     <w:rPr>
+      <w:rFonts w:ascii="Arial" w:hAnsi="Arial" w:cs="Arial" w:eastAsia="Arial"/>
       <w:color w:val="000000" w:themeColor="text1"/>
     </w:rPr>
     <w:tblPr>
@@ -15113,6 +15782,7 @@
       <w:spacing w:after="0" w:line="240" w:lineRule="auto"/>
     </w:pPr>
     <w:rPr>
+      <w:rFonts w:ascii="Arial" w:hAnsi="Arial" w:cs="Arial" w:eastAsia="Arial"/>
       <w:color w:val="000000" w:themeColor="text1"/>
     </w:rPr>
     <w:tblPr>
@@ -15199,6 +15869,7 @@
       <w:spacing w:after="0" w:line="240" w:lineRule="auto"/>
     </w:pPr>
     <w:rPr>
+      <w:rFonts w:ascii="Arial" w:hAnsi="Arial" w:cs="Arial" w:eastAsia="Arial"/>
       <w:color w:val="000000" w:themeColor="text1"/>
     </w:rPr>
     <w:tblPr>
@@ -15285,6 +15956,7 @@
       <w:spacing w:after="0" w:line="240" w:lineRule="auto"/>
     </w:pPr>
     <w:rPr>
+      <w:rFonts w:ascii="Arial" w:hAnsi="Arial" w:cs="Arial" w:eastAsia="Arial"/>
       <w:color w:val="000000" w:themeColor="text1"/>
     </w:rPr>
     <w:tblPr>
@@ -15371,6 +16043,7 @@
       <w:spacing w:after="0" w:line="240" w:lineRule="auto"/>
     </w:pPr>
     <w:rPr>
+      <w:rFonts w:ascii="Arial" w:hAnsi="Arial" w:cs="Arial" w:eastAsia="Arial"/>
       <w:color w:val="000000" w:themeColor="text1"/>
     </w:rPr>
     <w:tblPr>
@@ -15457,6 +16130,7 @@
       <w:spacing w:after="0" w:line="240" w:lineRule="auto"/>
     </w:pPr>
     <w:rPr>
+      <w:rFonts w:ascii="Arial" w:hAnsi="Arial" w:cs="Arial" w:eastAsia="Arial"/>
       <w:color w:val="000000" w:themeColor="text1"/>
     </w:rPr>
     <w:tblPr>
@@ -15543,6 +16217,7 @@
       <w:spacing w:after="0" w:line="240" w:lineRule="auto"/>
     </w:pPr>
     <w:rPr>
+      <w:rFonts w:ascii="Arial" w:hAnsi="Arial" w:cs="Arial" w:eastAsia="Arial"/>
       <w:color w:val="000000" w:themeColor="text1"/>
     </w:rPr>
     <w:tblPr>
@@ -15629,6 +16304,7 @@
       <w:spacing w:after="0" w:line="240" w:lineRule="auto"/>
     </w:pPr>
     <w:rPr>
+      <w:rFonts w:ascii="Arial" w:hAnsi="Arial" w:cs="Arial" w:eastAsia="Arial"/>
       <w:color w:val="000000" w:themeColor="text1"/>
     </w:rPr>
     <w:tblPr>
@@ -15709,6 +16385,7 @@
       <w:spacing w:after="0" w:line="240" w:lineRule="auto"/>
     </w:pPr>
     <w:rPr>
+      <w:rFonts w:ascii="Arial" w:hAnsi="Arial" w:cs="Arial" w:eastAsia="Arial"/>
       <w:color w:val="000000" w:themeColor="text1"/>
     </w:rPr>
     <w:tblPr>
@@ -15789,6 +16466,7 @@
       <w:spacing w:after="0" w:line="240" w:lineRule="auto"/>
     </w:pPr>
     <w:rPr>
+      <w:rFonts w:ascii="Arial" w:hAnsi="Arial" w:cs="Arial" w:eastAsia="Arial"/>
       <w:color w:val="000000" w:themeColor="text1"/>
     </w:rPr>
     <w:tblPr>
@@ -15869,6 +16547,7 @@
       <w:spacing w:after="0" w:line="240" w:lineRule="auto"/>
     </w:pPr>
     <w:rPr>
+      <w:rFonts w:ascii="Arial" w:hAnsi="Arial" w:cs="Arial" w:eastAsia="Arial"/>
       <w:color w:val="000000" w:themeColor="text1"/>
     </w:rPr>
     <w:tblPr>
@@ -15949,6 +16628,7 @@
       <w:spacing w:after="0" w:line="240" w:lineRule="auto"/>
     </w:pPr>
     <w:rPr>
+      <w:rFonts w:ascii="Arial" w:hAnsi="Arial" w:cs="Arial" w:eastAsia="Arial"/>
       <w:color w:val="000000" w:themeColor="text1"/>
     </w:rPr>
     <w:tblPr>
@@ -16029,6 +16709,7 @@
       <w:spacing w:after="0" w:line="240" w:lineRule="auto"/>
     </w:pPr>
     <w:rPr>
+      <w:rFonts w:ascii="Arial" w:hAnsi="Arial" w:cs="Arial" w:eastAsia="Arial"/>
       <w:color w:val="000000" w:themeColor="text1"/>
     </w:rPr>
     <w:tblPr>
@@ -16109,6 +16790,7 @@
       <w:spacing w:after="0" w:line="240" w:lineRule="auto"/>
     </w:pPr>
     <w:rPr>
+      <w:rFonts w:ascii="Arial" w:hAnsi="Arial" w:cs="Arial" w:eastAsia="Arial"/>
       <w:color w:val="000000" w:themeColor="text1"/>
     </w:rPr>
     <w:tblPr>

</xml_diff>

<commit_message>
Artigo: atualiza notas de rodapé dos autores
Co-Authored-By: Claude Opus 5.5 (1M context) <noreply@anthropic.com>
Claude-Session: https://claude.ai/code/session_013Ez8WdXVGnAz1jp93VScRd
</commit_message>
<xml_diff>
--- a/docs/artigo/artigo-TCC-provisa.docx
+++ b/docs/artigo/artigo-TCC-provisa.docx
@@ -4492,7 +4492,7 @@
           <w:rFonts w:ascii="Arial" w:hAnsi="Arial"/>
           <w:sz w:val="20"/>
         </w:rPr>
-        <w:t xml:space="preserve">Acadêmico do Curso de Sistemas de Informação – UNESC.</w:t>
+        <w:t xml:space="preserve">Acadêmico do Curso de Sistemas de Informação - UNESC</w:t>
       </w:r>
     </w:p>
   </w:footnote>
@@ -4520,7 +4520,7 @@
           <w:rFonts w:ascii="Arial" w:hAnsi="Arial"/>
           <w:sz w:val="20"/>
         </w:rPr>
-        <w:t xml:space="preserve">Mestre, Professor do Curso de Sistemas de Informação – UNESC, orientador do trabalho.</w:t>
+        <w:t xml:space="preserve">Bacharel em Sistema de Informação, MSc. em Tecnologias Emergentes na Educação (MUST) / Professor do UNESC</w:t>
       </w:r>
     </w:p>
   </w:footnote>

</xml_diff>